<commit_message>
DOCX converter: flatten LaTeX headings and inline commands in prose; regenerate DOCX
The SI mixes markdown with LaTeX prose (\section*, \subsection*, \texttt,
\emph, \addcontentsline). The converter flattened figures, tables,
algorithms and display math but left these commands, which printed verbatim
in the editable DOCX (post-commit review of 13e1550). New flatten_prose()
pass converts sectioning commands (starred and unstarred) to markdown
headings and inline formatting to markdown, with all math masked so
commands inside $...$ are untouched; the YAML header is left intact. Both
DOCX files regenerated: no non-math LaTeX commands remain in either.

Co-Authored-By: Claude Fable 5.1 <noreply@anthropic.com>
Claude-Session: https://claude.ai/code/session_01DM2PQPFgP8hwwDvWbvdo4R
</commit_message>
<xml_diff>
--- a/paper/paper.docx
+++ b/paper/paper.docx
@@ -8336,7 +8336,19 @@
         <w:pStyle w:val="BodyText"/>
       </w:pPr>
       <w:r>
-        <w:t xml:space="preserve">The two comparators select features by different mechanisms, and neither matches DeSurv’s. The penalized Cox comparator uses a pure lasso penalty (\texttt{glmnet} with</w:t>
+        <w:t xml:space="preserve">The two comparators select features by different mechanisms, and neither matches DeSurv’s. The penalized Cox comparator uses a pure lasso penalty (</w:t>
+      </w:r>
+      <w:r>
+        <w:rPr>
+          <w:rStyle w:val="VerbatimChar"/>
+        </w:rPr>
+        <w:t xml:space="preserve">glmnet</w:t>
+      </w:r>
+      <w:r>
+        <w:t xml:space="preserve"> </w:t>
+      </w:r>
+      <w:r>
+        <w:t xml:space="preserve">with</w:t>
       </w:r>
       <w:r>
         <w:t xml:space="preserve"> </w:t>
@@ -9342,7 +9354,16 @@
         <w:pStyle w:val="FirstParagraph"/>
       </w:pPr>
       <w:r>
-        <w:t xml:space="preserve">We analyzed publicly available and controlled-access RNA sequencing (RNA-seq) and microarray cohorts of PDAC with corresponding overall survival outcomes. Eligible samples were primary PDAC tumors with a measured bulk expression profile and valid overall-survival annotation, subject to cohort-specific quality-control and exclusion criteria detailed in Supplementary Information, Section 6; accrual and follow-up periods are as defined in each cohort’s original publication. Gene expression matrices were analyzed on a log scale: RNA-seq cohorts as log\textsubscript{2}(TPM + 1); microarray cohorts in platform-normalized log-scale intensities. Within each training cohort, genes were ranked separately by mean expression and variance, and the 3,000 genes with the smallest sum of the mean-expression and variance ranks were retained, selecting genes that are both highly expressed and highly variable. The intersection across training cohorts yielded 1,970 genes used for all analyses. Validation datasets were restricted to this same gene set. Survival times and censoring indicators were taken from the associated clinical annotations. No missing-data imputation was performed: all analyses used complete cases, and analyses adjusted for the PurIST and DeCAF classifiers were restricted to samples with available classifier calls. Of the seven PDAC expression datasets we considered, two were used for training (TCGA and CPTAC) and five for external validation (Dijk, Moffitt, PACA-AU array, PACA-AU RNA-seq, and Puleo); because the two PACA-AU platforms profile one patient cohort, these five validation datasets span four independent patient cohorts. To harmonize differences in scale across cohorts, filtered gene expression data were within-sample rank transformed before model training (ranks are inherently nonnegative, preserving NMF compatibility). Within-sample ranking reduces platform- and library-size differences in expression scale that would otherwise dominate cross-cohort projection. More details about the datasets can be found in Supplementary Information, Section 6.</w:t>
+        <w:t xml:space="preserve">We analyzed publicly available and controlled-access RNA sequencing (RNA-seq) and microarray cohorts of PDAC with corresponding overall survival outcomes. Eligible samples were primary PDAC tumors with a measured bulk expression profile and valid overall-survival annotation, subject to cohort-specific quality-control and exclusion criteria detailed in Supplementary Information, Section 6; accrual and follow-up periods are as defined in each cohort’s original publication. Gene expression matrices were analyzed on a log scale: RNA-seq cohorts as log</w:t>
+      </w:r>
+      <w:r>
+        <w:rPr>
+          <w:vertAlign w:val="subscript"/>
+        </w:rPr>
+        <w:t xml:space="preserve">2</w:t>
+      </w:r>
+      <w:r>
+        <w:t xml:space="preserve">(TPM + 1); microarray cohorts in platform-normalized log-scale intensities. Within each training cohort, genes were ranked separately by mean expression and variance, and the 3,000 genes with the smallest sum of the mean-expression and variance ranks were retained, selecting genes that are both highly expressed and highly variable. The intersection across training cohorts yielded 1,970 genes used for all analyses. Validation datasets were restricted to this same gene set. Survival times and censoring indicators were taken from the associated clinical annotations. No missing-data imputation was performed: all analyses used complete cases, and analyses adjusted for the PurIST and DeCAF classifiers were restricted to samples with available classifier calls. Of the seven PDAC expression datasets we considered, two were used for training (TCGA and CPTAC) and five for external validation (Dijk, Moffitt, PACA-AU array, PACA-AU RNA-seq, and Puleo); because the two PACA-AU platforms profile one patient cohort, these five validation datasets span four independent patient cohorts. To harmonize differences in scale across cohorts, filtered gene expression data were within-sample rank transformed before model training (ranks are inherently nonnegative, preserving NMF compatibility). Within-sample ranking reduces platform- and library-size differences in expression scale that would otherwise dominate cross-cohort projection. More details about the datasets can be found in Supplementary Information, Section 6.</w:t>
       </w:r>
     </w:p>
     <w:p>
@@ -9668,11 +9689,23 @@
         </m:r>
       </m:oMath>
       <w:r>
-        <w:t xml:space="preserve">CCR2-inhibitor series, used for the paired pre- and post-treatment comparison (Fig. [fig:treated]b), and the O’Kane/COMPASS treated metastatic PDAC cohort used both for the D1 prognostic-transportability survival analysis (Fig. [fig:treated]a) and, in the subset of 33 tumors with matched staining, for the GATA6 RNA in situ hybridization comparison (main-text Fig. [fig:pdac]e), are restricted-access clinical-trial datasets that are not publicly deposited; raw data are available from the respective study investigators under a data-use agreement, subject to the governing trial consents and institutional approvals. To preserve reproducibility without redistributing restricted data, the derived per-cohort summary statistics reported in the main text and Supplementary Information are provided in the reproducibility repository (file \texttt{results/treated_cohort_stats.rds}), so that every treated-cohort value can be inspected and verified. Code used to generate the COMPASS D1–GATA6 comparison (main-text Fig. [fig:pdac]e) is also provided in the reproducibility repository; reproduction of the patient-level analysis requires authorized access to the COMPASS data.</w:t>
+        <w:t xml:space="preserve">CCR2-inhibitor series, used for the paired pre- and post-treatment comparison (Fig. [fig:treated]b), and the O’Kane/COMPASS treated metastatic PDAC cohort used both for the D1 prognostic-transportability survival analysis (Fig. [fig:treated]a) and, in the subset of 33 tumors with matched staining, for the GATA6 RNA in situ hybridization comparison (main-text Fig. [fig:pdac]e), are restricted-access clinical-trial datasets that are not publicly deposited; raw data are available from the respective study investigators under a data-use agreement, subject to the governing trial consents and institutional approvals. To preserve reproducibility without redistributing restricted data, the derived per-cohort summary statistics reported in the main text and Supplementary Information are provided in the reproducibility repository (file</w:t>
+      </w:r>
+      <w:r>
+        <w:t xml:space="preserve"> </w:t>
+      </w:r>
+      <w:r>
+        <w:rPr>
+          <w:rStyle w:val="VerbatimChar"/>
+        </w:rPr>
+        <w:t xml:space="preserve">results/treated\_cohort\_stats.rds</w:t>
+      </w:r>
+      <w:r>
+        <w:t xml:space="preserve">), so that every treated-cohort value can be inspected and verified. Code used to generate the COMPASS D1–GATA6 comparison (main-text Fig. [fig:pdac]e) is also provided in the reproducibility repository; reproduction of the patient-level analysis requires authorized access to the COMPASS data.</w:t>
       </w:r>
     </w:p>
     <w:bookmarkEnd w:id="51"/>
-    <w:bookmarkStart w:id="52" w:name="code-availability"/>
+    <w:bookmarkStart w:id="54" w:name="code-availability"/>
     <w:p>
       <w:pPr>
         <w:pStyle w:val="Heading1"/>
@@ -9686,7 +9719,16 @@
         <w:pStyle w:val="FirstParagraph"/>
       </w:pPr>
       <w:r>
-        <w:t xml:space="preserve">All analyses were performed in R (version 4.6.0; R Core Team) using DeSurv (v1.0.1; this work), \texttt{NMF}</w:t>
+        <w:t xml:space="preserve">All analyses were performed in R (version 4.6.0; R Core Team) using DeSurv (v1.0.1; this work),</w:t>
+      </w:r>
+      <w:r>
+        <w:t xml:space="preserve"> </w:t>
+      </w:r>
+      <w:r>
+        <w:rPr>
+          <w:rStyle w:val="VerbatimChar"/>
+        </w:rPr>
+        <w:t xml:space="preserve">NMF</w:t>
       </w:r>
       <w:hyperlink w:anchor="ref-gaujoux2010flexible">
         <w:r>
@@ -9698,7 +9740,16 @@
         </w:r>
       </w:hyperlink>
       <w:r>
-        <w:t xml:space="preserve">, \texttt{glmnet}</w:t>
+        <w:t xml:space="preserve">,</w:t>
+      </w:r>
+      <w:r>
+        <w:t xml:space="preserve"> </w:t>
+      </w:r>
+      <w:r>
+        <w:rPr>
+          <w:rStyle w:val="VerbatimChar"/>
+        </w:rPr>
+        <w:t xml:space="preserve">glmnet</w:t>
       </w:r>
       <w:hyperlink w:anchor="ref-simon2011regularization">
         <w:r>
@@ -9710,11 +9761,117 @@
         </w:r>
       </w:hyperlink>
       <w:r>
-        <w:t xml:space="preserve">, \texttt{survival}, \texttt{ggplot2}, and \texttt{cowplot}; Bayesian optimization for hyperparameter selection was implemented within DeSurv. The DeSurv R package is available at \url{https://github.com/rashidlab/DeSurv} (archived at Zenodo, DOI \texttt{10.5281/zenodo.20150929}). Reproducibility code, processed data, and the exact session-info file are available at \url{https://github.com/rashidlab/DeSurv-paper} (archived at Zenodo, DOI \texttt{10.5281/zenodo.20150946}); this includes \texttt{code/11_treated_cohort_analysis.R}, which generates the treated-cohort summary statistics above.</w:t>
-      </w:r>
-    </w:p>
-    <w:bookmarkEnd w:id="52"/>
-    <w:bookmarkStart w:id="53" w:name="acknowledgements"/>
+        <w:t xml:space="preserve">,</w:t>
+      </w:r>
+      <w:r>
+        <w:t xml:space="preserve"> </w:t>
+      </w:r>
+      <w:r>
+        <w:rPr>
+          <w:rStyle w:val="VerbatimChar"/>
+        </w:rPr>
+        <w:t xml:space="preserve">survival</w:t>
+      </w:r>
+      <w:r>
+        <w:t xml:space="preserve">,</w:t>
+      </w:r>
+      <w:r>
+        <w:t xml:space="preserve"> </w:t>
+      </w:r>
+      <w:r>
+        <w:rPr>
+          <w:rStyle w:val="VerbatimChar"/>
+        </w:rPr>
+        <w:t xml:space="preserve">ggplot2</w:t>
+      </w:r>
+      <w:r>
+        <w:t xml:space="preserve">, and</w:t>
+      </w:r>
+      <w:r>
+        <w:t xml:space="preserve"> </w:t>
+      </w:r>
+      <w:r>
+        <w:rPr>
+          <w:rStyle w:val="VerbatimChar"/>
+        </w:rPr>
+        <w:t xml:space="preserve">cowplot</w:t>
+      </w:r>
+      <w:r>
+        <w:t xml:space="preserve">; Bayesian optimization for hyperparameter selection was implemented within DeSurv. The DeSurv R package is available at</w:t>
+      </w:r>
+      <w:r>
+        <w:t xml:space="preserve"> </w:t>
+      </w:r>
+      <w:hyperlink r:id="rId52">
+        <w:r>
+          <w:rPr>
+            <w:rStyle w:val="Hyperlink"/>
+          </w:rPr>
+          <w:t xml:space="preserve">https://github.com/rashidlab/DeSurv</w:t>
+        </w:r>
+      </w:hyperlink>
+      <w:r>
+        <w:t xml:space="preserve"> </w:t>
+      </w:r>
+      <w:r>
+        <w:t xml:space="preserve">(archived at Zenodo, DOI</w:t>
+      </w:r>
+      <w:r>
+        <w:t xml:space="preserve"> </w:t>
+      </w:r>
+      <w:r>
+        <w:rPr>
+          <w:rStyle w:val="VerbatimChar"/>
+        </w:rPr>
+        <w:t xml:space="preserve">10.5281/zenodo.20150929</w:t>
+      </w:r>
+      <w:r>
+        <w:t xml:space="preserve">). Reproducibility code, processed data, and the exact session-info file are available at</w:t>
+      </w:r>
+      <w:r>
+        <w:t xml:space="preserve"> </w:t>
+      </w:r>
+      <w:hyperlink r:id="rId53">
+        <w:r>
+          <w:rPr>
+            <w:rStyle w:val="Hyperlink"/>
+          </w:rPr>
+          <w:t xml:space="preserve">https://github.com/rashidlab/DeSurv-paper</w:t>
+        </w:r>
+      </w:hyperlink>
+      <w:r>
+        <w:t xml:space="preserve"> </w:t>
+      </w:r>
+      <w:r>
+        <w:t xml:space="preserve">(archived at Zenodo, DOI</w:t>
+      </w:r>
+      <w:r>
+        <w:t xml:space="preserve"> </w:t>
+      </w:r>
+      <w:r>
+        <w:rPr>
+          <w:rStyle w:val="VerbatimChar"/>
+        </w:rPr>
+        <w:t xml:space="preserve">10.5281/zenodo.20150946</w:t>
+      </w:r>
+      <w:r>
+        <w:t xml:space="preserve">); this includes</w:t>
+      </w:r>
+      <w:r>
+        <w:t xml:space="preserve"> </w:t>
+      </w:r>
+      <w:r>
+        <w:rPr>
+          <w:rStyle w:val="VerbatimChar"/>
+        </w:rPr>
+        <w:t xml:space="preserve">code/11\_treated\_cohort\_analysis.R</w:t>
+      </w:r>
+      <w:r>
+        <w:t xml:space="preserve">, which generates the treated-cohort summary statistics above.</w:t>
+      </w:r>
+    </w:p>
+    <w:bookmarkEnd w:id="54"/>
+    <w:bookmarkStart w:id="55" w:name="acknowledgements"/>
     <w:p>
       <w:pPr>
         <w:pStyle w:val="Heading1"/>
@@ -9735,187 +9892,131 @@
       <w:pPr>
         <w:pStyle w:val="BodyText"/>
       </w:pPr>
-      <w:r>
-        <w:t xml:space="preserve">\textbf{Inclusion and Diversity.} The patient cohorts analyzed in this study were curated by the original investigators or consortia (TCGA, CPTAC, ICGC, and the original Moffitt, Dijk, and Puleo studies) and our access was limited to the de-identified expression and survival data they provide. Sex was recorded in every cohort and was included as a covariate in the clinical-adjustment analyses (Supplementary Table [tab:clinical-adjustment]), where the prognostic association of the DeSurv linear predictor was unchanged. We did not conduct sex-stratified analyses, because the study was not powered for subgroup comparisons within individual cohorts, and we did not stratify by race or ethnicity because those annotations were not consistently available across cohorts. Whether the prognostic relevance of these gene programs differs by sex, race, or ethnicity remains an important question for adequately powered, more comprehensively annotated cohorts.</w:t>
-      </w:r>
-    </w:p>
-    <w:bookmarkEnd w:id="53"/>
-    <w:bookmarkStart w:id="54" w:name="author-contributions"/>
-    <w:p>
-      <w:pPr>
-        <w:pStyle w:val="Heading1"/>
-      </w:pPr>
-      <w:r>
-        <w:t xml:space="preserve">Author Contributions</w:t>
-      </w:r>
-    </w:p>
-    <w:p>
-      <w:pPr>
-        <w:pStyle w:val="FirstParagraph"/>
-      </w:pPr>
-      <w:r>
-        <w:t xml:space="preserve">Conceptualization: A.M.Y., N.U.R. Methodology: A.M.Y., A.Y., D.L., N.U.R. Software: A.M.Y. Formal analysis: A.M.Y. Investigation: A.M.Y. Data curation: A.M.Y., X.L.P. Visualization: A.M.Y. Writing – original draft: A.M.Y., N.U.R. Writing – review and editing: A.M.Y., A.Y., X.L.P., J.J.Y., D.L., N.U.R. Resources (PDAC domain expertise and biological interpretation): X.L.P., J.J.Y. Supervision: N.U.R. Funding acquisition: A.M.Y., N.U.R. All authors reviewed and approved the final manuscript.</w:t>
-      </w:r>
-    </w:p>
-    <w:bookmarkEnd w:id="54"/>
-    <w:bookmarkStart w:id="55" w:name="competing-interests"/>
-    <w:p>
-      <w:pPr>
-        <w:pStyle w:val="Heading1"/>
-      </w:pPr>
-      <w:r>
-        <w:t xml:space="preserve">Competing Interests</w:t>
-      </w:r>
-    </w:p>
-    <w:p>
-      <w:pPr>
-        <w:pStyle w:val="FirstParagraph"/>
-      </w:pPr>
-      <w:r>
-        <w:t xml:space="preserve">N.U.R. and J.J.Y. are named as inventors on US patents US20220127676A1 and US20250066856A1, which relate to pancreatic cancer subtype classification. The PurIST and DeCAF classifiers were used only as published, independently derived comparators: their subtype calls were obtained with the released classifiers and included as fixed covariate annotations, and the adjustment analyses using these calls are objective and reproducible from the deposited code. They are not components of DeSurv. The other authors declare no competing interests.</w:t>
-      </w:r>
-    </w:p>
-    <w:bookmarkEnd w:id="55"/>
-    <w:bookmarkStart w:id="148" w:name="references"/>
-    <w:p>
-      <w:pPr>
-        <w:pStyle w:val="Heading1"/>
-      </w:pPr>
-      <w:r>
-        <w:t xml:space="preserve">References</w:t>
-      </w:r>
-    </w:p>
-    <w:bookmarkStart w:id="147" w:name="refs"/>
-    <w:bookmarkStart w:id="57" w:name="ref-siegel2026cancer"/>
-    <w:p>
-      <w:pPr>
-        <w:pStyle w:val="Bibliography"/>
-      </w:pPr>
-      <w:r>
-        <w:t xml:space="preserve">1.</w:t>
-      </w:r>
-      <w:r>
-        <w:t xml:space="preserve"> </w:t>
-      </w:r>
-      <w:r>
-        <w:t xml:space="preserve">	</w:t>
-      </w:r>
-      <w:r>
-        <w:t xml:space="preserve">Siegel, R. L., Kratzer, T. B., Wagle, N. S., Sung, H. &amp; Jemal, A. Cancer statistics, 2026.</w:t>
-      </w:r>
-      <w:r>
-        <w:t xml:space="preserve"> </w:t>
-      </w:r>
-      <w:r>
-        <w:rPr>
-          <w:iCs/>
-          <w:i/>
-        </w:rPr>
-        <w:t xml:space="preserve">CA: A Cancer Journal for Clinicians</w:t>
-      </w:r>
-      <w:r>
-        <w:t xml:space="preserve"> </w:t>
-      </w:r>
-      <w:hyperlink r:id="rId56">
-        <w:r>
-          <w:rPr>
-            <w:rStyle w:val="Hyperlink"/>
-          </w:rPr>
-          <w:t xml:space="preserve">https://doi.org/10.3322/caac.70043</w:t>
-        </w:r>
-      </w:hyperlink>
-      <w:r>
-        <w:t xml:space="preserve"> </w:t>
-      </w:r>
-      <w:r>
-        <w:t xml:space="preserve">(2026) doi:</w:t>
-      </w:r>
-      <w:hyperlink r:id="rId56">
-        <w:r>
-          <w:rPr>
-            <w:rStyle w:val="Hyperlink"/>
-          </w:rPr>
-          <w:t xml:space="preserve">10.3322/caac.70043</w:t>
-        </w:r>
-      </w:hyperlink>
-      <w:r>
-        <w:t xml:space="preserve">.</w:t>
-      </w:r>
-    </w:p>
-    <w:bookmarkEnd w:id="57"/>
-    <w:bookmarkStart w:id="59" w:name="ref-collisson2011subtypes"/>
-    <w:p>
-      <w:pPr>
-        <w:pStyle w:val="Bibliography"/>
-      </w:pPr>
-      <w:r>
-        <w:t xml:space="preserve">2.</w:t>
-      </w:r>
-      <w:r>
-        <w:t xml:space="preserve"> </w:t>
-      </w:r>
-      <w:r>
-        <w:t xml:space="preserve">	</w:t>
-      </w:r>
-      <w:r>
-        <w:t xml:space="preserve">Collisson, E. A.</w:t>
-      </w:r>
-      <w:r>
-        <w:t xml:space="preserve"> </w:t>
-      </w:r>
-      <w:r>
-        <w:rPr>
-          <w:iCs/>
-          <w:i/>
-        </w:rPr>
-        <w:t xml:space="preserve">et al.</w:t>
-      </w:r>
-      <w:r>
-        <w:t xml:space="preserve"> </w:t>
-      </w:r>
-      <w:hyperlink r:id="rId58">
-        <w:r>
-          <w:rPr>
-            <w:rStyle w:val="Hyperlink"/>
-          </w:rPr>
-          <w:t xml:space="preserve">Subtypes of pancreatic ductal adenocarcinoma and their differing responses to therapy</w:t>
-        </w:r>
-      </w:hyperlink>
-      <w:r>
-        <w:t xml:space="preserve">.</w:t>
-      </w:r>
-      <w:r>
-        <w:t xml:space="preserve"> </w:t>
-      </w:r>
-      <w:r>
-        <w:rPr>
-          <w:iCs/>
-          <w:i/>
-        </w:rPr>
-        <w:t xml:space="preserve">Nature Medicine</w:t>
-      </w:r>
-      <w:r>
-        <w:t xml:space="preserve"> </w:t>
-      </w:r>
       <w:r>
         <w:rPr>
           <w:bCs/>
           <w:b/>
         </w:rPr>
-        <w:t xml:space="preserve">17</w:t>
-      </w:r>
-      <w:r>
-        <w:t xml:space="preserve">, 500–503 (2011).</w:t>
+        <w:t xml:space="preserve">Inclusion and Diversity.</w:t>
+      </w:r>
+      <w:r>
+        <w:t xml:space="preserve"> </w:t>
+      </w:r>
+      <w:r>
+        <w:t xml:space="preserve">The patient cohorts analyzed in this study were curated by the original investigators or consortia (TCGA, CPTAC, ICGC, and the original Moffitt, Dijk, and Puleo studies) and our access was limited to the de-identified expression and survival data they provide. Sex was recorded in every cohort and was included as a covariate in the clinical-adjustment analyses (Supplementary Table [tab:clinical-adjustment]), where the prognostic association of the DeSurv linear predictor was unchanged. We did not conduct sex-stratified analyses, because the study was not powered for subgroup comparisons within individual cohorts, and we did not stratify by race or ethnicity because those annotations were not consistently available across cohorts. Whether the prognostic relevance of these gene programs differs by sex, race, or ethnicity remains an important question for adequately powered, more comprehensively annotated cohorts.</w:t>
+      </w:r>
+    </w:p>
+    <w:bookmarkEnd w:id="55"/>
+    <w:bookmarkStart w:id="56" w:name="author-contributions"/>
+    <w:p>
+      <w:pPr>
+        <w:pStyle w:val="Heading1"/>
+      </w:pPr>
+      <w:r>
+        <w:t xml:space="preserve">Author Contributions</w:t>
+      </w:r>
+    </w:p>
+    <w:p>
+      <w:pPr>
+        <w:pStyle w:val="FirstParagraph"/>
+      </w:pPr>
+      <w:r>
+        <w:t xml:space="preserve">Conceptualization: A.M.Y., N.U.R. Methodology: A.M.Y., A.Y., D.L., N.U.R. Software: A.M.Y. Formal analysis: A.M.Y. Investigation: A.M.Y. Data curation: A.M.Y., X.L.P. Visualization: A.M.Y. Writing – original draft: A.M.Y., N.U.R. Writing – review and editing: A.M.Y., A.Y., X.L.P., J.J.Y., D.L., N.U.R. Resources (PDAC domain expertise and biological interpretation): X.L.P., J.J.Y. Supervision: N.U.R. Funding acquisition: A.M.Y., N.U.R. All authors reviewed and approved the final manuscript.</w:t>
+      </w:r>
+    </w:p>
+    <w:bookmarkEnd w:id="56"/>
+    <w:bookmarkStart w:id="57" w:name="competing-interests"/>
+    <w:p>
+      <w:pPr>
+        <w:pStyle w:val="Heading1"/>
+      </w:pPr>
+      <w:r>
+        <w:t xml:space="preserve">Competing Interests</w:t>
+      </w:r>
+    </w:p>
+    <w:p>
+      <w:pPr>
+        <w:pStyle w:val="FirstParagraph"/>
+      </w:pPr>
+      <w:r>
+        <w:t xml:space="preserve">N.U.R. and J.J.Y. are named as inventors on US patents US20220127676A1 and US20250066856A1, which relate to pancreatic cancer subtype classification. The PurIST and DeCAF classifiers were used only as published, independently derived comparators: their subtype calls were obtained with the released classifiers and included as fixed covariate annotations, and the adjustment analyses using these calls are objective and reproducible from the deposited code. They are not components of DeSurv. The other authors declare no competing interests.</w:t>
+      </w:r>
+    </w:p>
+    <w:bookmarkEnd w:id="57"/>
+    <w:bookmarkStart w:id="150" w:name="references"/>
+    <w:p>
+      <w:pPr>
+        <w:pStyle w:val="Heading1"/>
+      </w:pPr>
+      <w:r>
+        <w:t xml:space="preserve">References</w:t>
+      </w:r>
+    </w:p>
+    <w:bookmarkStart w:id="149" w:name="refs"/>
+    <w:bookmarkStart w:id="59" w:name="ref-siegel2026cancer"/>
+    <w:p>
+      <w:pPr>
+        <w:pStyle w:val="Bibliography"/>
+      </w:pPr>
+      <w:r>
+        <w:t xml:space="preserve">1.</w:t>
+      </w:r>
+      <w:r>
+        <w:t xml:space="preserve"> </w:t>
+      </w:r>
+      <w:r>
+        <w:t xml:space="preserve">	</w:t>
+      </w:r>
+      <w:r>
+        <w:t xml:space="preserve">Siegel, R. L., Kratzer, T. B., Wagle, N. S., Sung, H. &amp; Jemal, A. Cancer statistics, 2026.</w:t>
+      </w:r>
+      <w:r>
+        <w:t xml:space="preserve"> </w:t>
+      </w:r>
+      <w:r>
+        <w:rPr>
+          <w:iCs/>
+          <w:i/>
+        </w:rPr>
+        <w:t xml:space="preserve">CA: A Cancer Journal for Clinicians</w:t>
+      </w:r>
+      <w:r>
+        <w:t xml:space="preserve"> </w:t>
+      </w:r>
+      <w:hyperlink r:id="rId58">
+        <w:r>
+          <w:rPr>
+            <w:rStyle w:val="Hyperlink"/>
+          </w:rPr>
+          <w:t xml:space="preserve">https://doi.org/10.3322/caac.70043</w:t>
+        </w:r>
+      </w:hyperlink>
+      <w:r>
+        <w:t xml:space="preserve"> </w:t>
+      </w:r>
+      <w:r>
+        <w:t xml:space="preserve">(2026) doi:</w:t>
+      </w:r>
+      <w:hyperlink r:id="rId58">
+        <w:r>
+          <w:rPr>
+            <w:rStyle w:val="Hyperlink"/>
+          </w:rPr>
+          <w:t xml:space="preserve">10.3322/caac.70043</w:t>
+        </w:r>
+      </w:hyperlink>
+      <w:r>
+        <w:t xml:space="preserve">.</w:t>
       </w:r>
     </w:p>
     <w:bookmarkEnd w:id="59"/>
-    <w:bookmarkStart w:id="61" w:name="ref-moffitt2015virtual"/>
+    <w:bookmarkStart w:id="61" w:name="ref-collisson2011subtypes"/>
     <w:p>
       <w:pPr>
         <w:pStyle w:val="Bibliography"/>
       </w:pPr>
       <w:r>
-        <w:t xml:space="preserve">3.</w:t>
+        <w:t xml:space="preserve">2.</w:t>
       </w:r>
       <w:r>
         <w:t xml:space="preserve"> </w:t>
@@ -9924,7 +10025,7 @@
         <w:t xml:space="preserve">	</w:t>
       </w:r>
       <w:r>
-        <w:t xml:space="preserve">Moffitt, R. A.</w:t>
+        <w:t xml:space="preserve">Collisson, E. A.</w:t>
       </w:r>
       <w:r>
         <w:t xml:space="preserve"> </w:t>
@@ -9944,7 +10045,7 @@
           <w:rPr>
             <w:rStyle w:val="Hyperlink"/>
           </w:rPr>
-          <w:t xml:space="preserve">Virtual microdissection identifies distinct tumor- and stroma-specific subtypes of pancreatic ductal adenocarcinoma</w:t>
+          <w:t xml:space="preserve">Subtypes of pancreatic ductal adenocarcinoma and their differing responses to therapy</w:t>
         </w:r>
       </w:hyperlink>
       <w:r>
@@ -9958,7 +10059,7 @@
           <w:iCs/>
           <w:i/>
         </w:rPr>
-        <w:t xml:space="preserve">Nature Genetics</w:t>
+        <w:t xml:space="preserve">Nature Medicine</w:t>
       </w:r>
       <w:r>
         <w:t xml:space="preserve"> </w:t>
@@ -9968,20 +10069,20 @@
           <w:bCs/>
           <w:b/>
         </w:rPr>
-        <w:t xml:space="preserve">47</w:t>
-      </w:r>
-      <w:r>
-        <w:t xml:space="preserve">, 1168–1178 (2015).</w:t>
+        <w:t xml:space="preserve">17</w:t>
+      </w:r>
+      <w:r>
+        <w:t xml:space="preserve">, 500–503 (2011).</w:t>
       </w:r>
     </w:p>
     <w:bookmarkEnd w:id="61"/>
-    <w:bookmarkStart w:id="63" w:name="ref-rashid2020purity"/>
+    <w:bookmarkStart w:id="63" w:name="ref-moffitt2015virtual"/>
     <w:p>
       <w:pPr>
         <w:pStyle w:val="Bibliography"/>
       </w:pPr>
       <w:r>
-        <w:t xml:space="preserve">4.</w:t>
+        <w:t xml:space="preserve">3.</w:t>
       </w:r>
       <w:r>
         <w:t xml:space="preserve"> </w:t>
@@ -9990,7 +10091,7 @@
         <w:t xml:space="preserve">	</w:t>
       </w:r>
       <w:r>
-        <w:t xml:space="preserve">Rashid, N. U.</w:t>
+        <w:t xml:space="preserve">Moffitt, R. A.</w:t>
       </w:r>
       <w:r>
         <w:t xml:space="preserve"> </w:t>
@@ -10010,7 +10111,7 @@
           <w:rPr>
             <w:rStyle w:val="Hyperlink"/>
           </w:rPr>
-          <w:t xml:space="preserve">Purity independent subtyping of tumors (PurIST), a clinically robust, single-sample classifier for tumor subtyping in pancreatic cancer</w:t>
+          <w:t xml:space="preserve">Virtual microdissection identifies distinct tumor- and stroma-specific subtypes of pancreatic ductal adenocarcinoma</w:t>
         </w:r>
       </w:hyperlink>
       <w:r>
@@ -10024,7 +10125,7 @@
           <w:iCs/>
           <w:i/>
         </w:rPr>
-        <w:t xml:space="preserve">Clinical Cancer Research</w:t>
+        <w:t xml:space="preserve">Nature Genetics</w:t>
       </w:r>
       <w:r>
         <w:t xml:space="preserve"> </w:t>
@@ -10034,20 +10135,20 @@
           <w:bCs/>
           <w:b/>
         </w:rPr>
-        <w:t xml:space="preserve">26</w:t>
-      </w:r>
-      <w:r>
-        <w:t xml:space="preserve">, 82–92 (2020).</w:t>
+        <w:t xml:space="preserve">47</w:t>
+      </w:r>
+      <w:r>
+        <w:t xml:space="preserve">, 1168–1178 (2015).</w:t>
       </w:r>
     </w:p>
     <w:bookmarkEnd w:id="63"/>
-    <w:bookmarkStart w:id="65" w:name="ref-peng2024determination"/>
+    <w:bookmarkStart w:id="65" w:name="ref-rashid2020purity"/>
     <w:p>
       <w:pPr>
         <w:pStyle w:val="Bibliography"/>
       </w:pPr>
       <w:r>
-        <w:t xml:space="preserve">5.</w:t>
+        <w:t xml:space="preserve">4.</w:t>
       </w:r>
       <w:r>
         <w:t xml:space="preserve"> </w:t>
@@ -10056,7 +10157,7 @@
         <w:t xml:space="preserve">	</w:t>
       </w:r>
       <w:r>
-        <w:t xml:space="preserve">Peng, X. L.</w:t>
+        <w:t xml:space="preserve">Rashid, N. U.</w:t>
       </w:r>
       <w:r>
         <w:t xml:space="preserve"> </w:t>
@@ -10076,7 +10177,7 @@
           <w:rPr>
             <w:rStyle w:val="Hyperlink"/>
           </w:rPr>
-          <w:t xml:space="preserve">DeCAF defines clinical fibroblast subtypes and multidimensional tumor-stroma crosstalk shaping prognosis and immunotherapy response</w:t>
+          <w:t xml:space="preserve">Purity independent subtyping of tumors (PurIST), a clinically robust, single-sample classifier for tumor subtyping in pancreatic cancer</w:t>
         </w:r>
       </w:hyperlink>
       <w:r>
@@ -10090,7 +10191,7 @@
           <w:iCs/>
           <w:i/>
         </w:rPr>
-        <w:t xml:space="preserve">Cell Reports Medicine</w:t>
+        <w:t xml:space="preserve">Clinical Cancer Research</w:t>
       </w:r>
       <w:r>
         <w:t xml:space="preserve"> </w:t>
@@ -10100,20 +10201,20 @@
           <w:bCs/>
           <w:b/>
         </w:rPr>
-        <w:t xml:space="preserve">7</w:t>
-      </w:r>
-      <w:r>
-        <w:t xml:space="preserve">, 102611 (2026).</w:t>
+        <w:t xml:space="preserve">26</w:t>
+      </w:r>
+      <w:r>
+        <w:t xml:space="preserve">, 82–92 (2020).</w:t>
       </w:r>
     </w:p>
     <w:bookmarkEnd w:id="65"/>
-    <w:bookmarkStart w:id="67" w:name="ref-moncada2020spatial"/>
+    <w:bookmarkStart w:id="67" w:name="ref-peng2024determination"/>
     <w:p>
       <w:pPr>
         <w:pStyle w:val="Bibliography"/>
       </w:pPr>
       <w:r>
-        <w:t xml:space="preserve">6.</w:t>
+        <w:t xml:space="preserve">5.</w:t>
       </w:r>
       <w:r>
         <w:t xml:space="preserve"> </w:t>
@@ -10122,7 +10223,7 @@
         <w:t xml:space="preserve">	</w:t>
       </w:r>
       <w:r>
-        <w:t xml:space="preserve">Moncada, R.</w:t>
+        <w:t xml:space="preserve">Peng, X. L.</w:t>
       </w:r>
       <w:r>
         <w:t xml:space="preserve"> </w:t>
@@ -10142,25 +10243,7 @@
           <w:rPr>
             <w:rStyle w:val="Hyperlink"/>
           </w:rPr>
-          <w:t xml:space="preserve">Integrating microarray-based spatial transcriptomics and single-cell</w:t>
-        </w:r>
-        <w:r>
-          <w:rPr>
-            <w:rStyle w:val="Hyperlink"/>
-          </w:rPr>
-          <w:t xml:space="preserve"> </w:t>
-        </w:r>
-        <w:r>
-          <w:rPr>
-            <w:rStyle w:val="Hyperlink"/>
-          </w:rPr>
-          <w:t xml:space="preserve">RNA</w:t>
-        </w:r>
-        <w:r>
-          <w:rPr>
-            <w:rStyle w:val="Hyperlink"/>
-          </w:rPr>
-          <w:t xml:space="preserve">-seq reveals tissue architecture in pancreatic ductal adenocarcinomas</w:t>
+          <w:t xml:space="preserve">DeCAF defines clinical fibroblast subtypes and multidimensional tumor-stroma crosstalk shaping prognosis and immunotherapy response</w:t>
         </w:r>
       </w:hyperlink>
       <w:r>
@@ -10174,7 +10257,7 @@
           <w:iCs/>
           <w:i/>
         </w:rPr>
-        <w:t xml:space="preserve">Nature Biotechnology</w:t>
+        <w:t xml:space="preserve">Cell Reports Medicine</w:t>
       </w:r>
       <w:r>
         <w:t xml:space="preserve"> </w:t>
@@ -10184,20 +10267,20 @@
           <w:bCs/>
           <w:b/>
         </w:rPr>
-        <w:t xml:space="preserve">38</w:t>
-      </w:r>
-      <w:r>
-        <w:t xml:space="preserve">, 333–342 (2020).</w:t>
+        <w:t xml:space="preserve">7</w:t>
+      </w:r>
+      <w:r>
+        <w:t xml:space="preserve">, 102611 (2026).</w:t>
       </w:r>
     </w:p>
     <w:bookmarkEnd w:id="67"/>
-    <w:bookmarkStart w:id="69" w:name="ref-hwang2022single"/>
+    <w:bookmarkStart w:id="69" w:name="ref-moncada2020spatial"/>
     <w:p>
       <w:pPr>
         <w:pStyle w:val="Bibliography"/>
       </w:pPr>
       <w:r>
-        <w:t xml:space="preserve">7.</w:t>
+        <w:t xml:space="preserve">6.</w:t>
       </w:r>
       <w:r>
         <w:t xml:space="preserve"> </w:t>
@@ -10206,7 +10289,7 @@
         <w:t xml:space="preserve">	</w:t>
       </w:r>
       <w:r>
-        <w:t xml:space="preserve">Hwang, W. L.</w:t>
+        <w:t xml:space="preserve">Moncada, R.</w:t>
       </w:r>
       <w:r>
         <w:t xml:space="preserve"> </w:t>
@@ -10226,7 +10309,25 @@
           <w:rPr>
             <w:rStyle w:val="Hyperlink"/>
           </w:rPr>
-          <w:t xml:space="preserve">Single-nucleus and spatial transcriptome profiling of pancreatic cancer identifies multicellular dynamics associated with neoadjuvant treatment</w:t>
+          <w:t xml:space="preserve">Integrating microarray-based spatial transcriptomics and single-cell</w:t>
+        </w:r>
+        <w:r>
+          <w:rPr>
+            <w:rStyle w:val="Hyperlink"/>
+          </w:rPr>
+          <w:t xml:space="preserve"> </w:t>
+        </w:r>
+        <w:r>
+          <w:rPr>
+            <w:rStyle w:val="Hyperlink"/>
+          </w:rPr>
+          <w:t xml:space="preserve">RNA</w:t>
+        </w:r>
+        <w:r>
+          <w:rPr>
+            <w:rStyle w:val="Hyperlink"/>
+          </w:rPr>
+          <w:t xml:space="preserve">-seq reveals tissue architecture in pancreatic ductal adenocarcinomas</w:t>
         </w:r>
       </w:hyperlink>
       <w:r>
@@ -10240,7 +10341,7 @@
           <w:iCs/>
           <w:i/>
         </w:rPr>
-        <w:t xml:space="preserve">Nature Genetics</w:t>
+        <w:t xml:space="preserve">Nature Biotechnology</w:t>
       </w:r>
       <w:r>
         <w:t xml:space="preserve"> </w:t>
@@ -10250,20 +10351,20 @@
           <w:bCs/>
           <w:b/>
         </w:rPr>
-        <w:t xml:space="preserve">54</w:t>
-      </w:r>
-      <w:r>
-        <w:t xml:space="preserve">, 1178–1191 (2022).</w:t>
+        <w:t xml:space="preserve">38</w:t>
+      </w:r>
+      <w:r>
+        <w:t xml:space="preserve">, 333–342 (2020).</w:t>
       </w:r>
     </w:p>
     <w:bookmarkEnd w:id="69"/>
-    <w:bookmarkStart w:id="71" w:name="ref-werba2023single"/>
+    <w:bookmarkStart w:id="71" w:name="ref-hwang2022single"/>
     <w:p>
       <w:pPr>
         <w:pStyle w:val="Bibliography"/>
       </w:pPr>
       <w:r>
-        <w:t xml:space="preserve">8.</w:t>
+        <w:t xml:space="preserve">7.</w:t>
       </w:r>
       <w:r>
         <w:t xml:space="preserve"> </w:t>
@@ -10272,7 +10373,7 @@
         <w:t xml:space="preserve">	</w:t>
       </w:r>
       <w:r>
-        <w:t xml:space="preserve">Werba, G.</w:t>
+        <w:t xml:space="preserve">Hwang, W. L.</w:t>
       </w:r>
       <w:r>
         <w:t xml:space="preserve"> </w:t>
@@ -10292,7 +10393,7 @@
           <w:rPr>
             <w:rStyle w:val="Hyperlink"/>
           </w:rPr>
-          <w:t xml:space="preserve">Single-cell RNA sequencing reveals the effects of chemotherapy on human pancreatic adenocarcinoma and its tumor microenvironment</w:t>
+          <w:t xml:space="preserve">Single-nucleus and spatial transcriptome profiling of pancreatic cancer identifies multicellular dynamics associated with neoadjuvant treatment</w:t>
         </w:r>
       </w:hyperlink>
       <w:r>
@@ -10306,7 +10407,7 @@
           <w:iCs/>
           <w:i/>
         </w:rPr>
-        <w:t xml:space="preserve">Nature Communications</w:t>
+        <w:t xml:space="preserve">Nature Genetics</w:t>
       </w:r>
       <w:r>
         <w:t xml:space="preserve"> </w:t>
@@ -10316,20 +10417,20 @@
           <w:bCs/>
           <w:b/>
         </w:rPr>
-        <w:t xml:space="preserve">14</w:t>
-      </w:r>
-      <w:r>
-        <w:t xml:space="preserve">, 797 (2023).</w:t>
+        <w:t xml:space="preserve">54</w:t>
+      </w:r>
+      <w:r>
+        <w:t xml:space="preserve">, 1178–1191 (2022).</w:t>
       </w:r>
     </w:p>
     <w:bookmarkEnd w:id="71"/>
-    <w:bookmarkStart w:id="73" w:name="ref-Bailey2016"/>
+    <w:bookmarkStart w:id="73" w:name="ref-werba2023single"/>
     <w:p>
       <w:pPr>
         <w:pStyle w:val="Bibliography"/>
       </w:pPr>
       <w:r>
-        <w:t xml:space="preserve">9.</w:t>
+        <w:t xml:space="preserve">8.</w:t>
       </w:r>
       <w:r>
         <w:t xml:space="preserve"> </w:t>
@@ -10338,7 +10439,7 @@
         <w:t xml:space="preserve">	</w:t>
       </w:r>
       <w:r>
-        <w:t xml:space="preserve">Bailey, P.</w:t>
+        <w:t xml:space="preserve">Werba, G.</w:t>
       </w:r>
       <w:r>
         <w:t xml:space="preserve"> </w:t>
@@ -10358,7 +10459,7 @@
           <w:rPr>
             <w:rStyle w:val="Hyperlink"/>
           </w:rPr>
-          <w:t xml:space="preserve">Genomic analyses identify molecular subtypes of pancreatic cancer</w:t>
+          <w:t xml:space="preserve">Single-cell RNA sequencing reveals the effects of chemotherapy on human pancreatic adenocarcinoma and its tumor microenvironment</w:t>
         </w:r>
       </w:hyperlink>
       <w:r>
@@ -10372,7 +10473,7 @@
           <w:iCs/>
           <w:i/>
         </w:rPr>
-        <w:t xml:space="preserve">Nature</w:t>
+        <w:t xml:space="preserve">Nature Communications</w:t>
       </w:r>
       <w:r>
         <w:t xml:space="preserve"> </w:t>
@@ -10382,20 +10483,20 @@
           <w:bCs/>
           <w:b/>
         </w:rPr>
-        <w:t xml:space="preserve">531</w:t>
-      </w:r>
-      <w:r>
-        <w:t xml:space="preserve">, 47–52 (2016).</w:t>
+        <w:t xml:space="preserve">14</w:t>
+      </w:r>
+      <w:r>
+        <w:t xml:space="preserve">, 797 (2023).</w:t>
       </w:r>
     </w:p>
     <w:bookmarkEnd w:id="73"/>
-    <w:bookmarkStart w:id="75" w:name="ref-aung2018compass"/>
+    <w:bookmarkStart w:id="75" w:name="ref-Bailey2016"/>
     <w:p>
       <w:pPr>
         <w:pStyle w:val="Bibliography"/>
       </w:pPr>
       <w:r>
-        <w:t xml:space="preserve">10.</w:t>
+        <w:t xml:space="preserve">9.</w:t>
       </w:r>
       <w:r>
         <w:t xml:space="preserve"> </w:t>
@@ -10404,7 +10505,7 @@
         <w:t xml:space="preserve">	</w:t>
       </w:r>
       <w:r>
-        <w:t xml:space="preserve">Aung, K. L.</w:t>
+        <w:t xml:space="preserve">Bailey, P.</w:t>
       </w:r>
       <w:r>
         <w:t xml:space="preserve"> </w:t>
@@ -10424,7 +10525,7 @@
           <w:rPr>
             <w:rStyle w:val="Hyperlink"/>
           </w:rPr>
-          <w:t xml:space="preserve">Genomics-driven precision medicine for advanced pancreatic cancer: Early results from the COMPASS trial</w:t>
+          <w:t xml:space="preserve">Genomic analyses identify molecular subtypes of pancreatic cancer</w:t>
         </w:r>
       </w:hyperlink>
       <w:r>
@@ -10438,7 +10539,7 @@
           <w:iCs/>
           <w:i/>
         </w:rPr>
-        <w:t xml:space="preserve">Clinical Cancer Research</w:t>
+        <w:t xml:space="preserve">Nature</w:t>
       </w:r>
       <w:r>
         <w:t xml:space="preserve"> </w:t>
@@ -10448,20 +10549,20 @@
           <w:bCs/>
           <w:b/>
         </w:rPr>
-        <w:t xml:space="preserve">24</w:t>
-      </w:r>
-      <w:r>
-        <w:t xml:space="preserve">, 1344–1354 (2018).</w:t>
+        <w:t xml:space="preserve">531</w:t>
+      </w:r>
+      <w:r>
+        <w:t xml:space="preserve">, 47–52 (2016).</w:t>
       </w:r>
     </w:p>
     <w:bookmarkEnd w:id="75"/>
-    <w:bookmarkStart w:id="77" w:name="ref-nguyen2024fourteen"/>
+    <w:bookmarkStart w:id="77" w:name="ref-aung2018compass"/>
     <w:p>
       <w:pPr>
         <w:pStyle w:val="Bibliography"/>
       </w:pPr>
       <w:r>
-        <w:t xml:space="preserve">11.</w:t>
+        <w:t xml:space="preserve">10.</w:t>
       </w:r>
       <w:r>
         <w:t xml:space="preserve"> </w:t>
@@ -10470,7 +10571,17 @@
         <w:t xml:space="preserve">	</w:t>
       </w:r>
       <w:r>
-        <w:t xml:space="preserve">Nguyen, H., Nguyen, H., Tran, D., Draghici, S. &amp; Nguyen, T.</w:t>
+        <w:t xml:space="preserve">Aung, K. L.</w:t>
+      </w:r>
+      <w:r>
+        <w:t xml:space="preserve"> </w:t>
+      </w:r>
+      <w:r>
+        <w:rPr>
+          <w:iCs/>
+          <w:i/>
+        </w:rPr>
+        <w:t xml:space="preserve">et al.</w:t>
       </w:r>
       <w:r>
         <w:t xml:space="preserve"> </w:t>
@@ -10480,7 +10591,7 @@
           <w:rPr>
             <w:rStyle w:val="Hyperlink"/>
           </w:rPr>
-          <w:t xml:space="preserve">Fourteen years of cellular deconvolution: Methodology, applications, technical evaluation and outstanding challenges</w:t>
+          <w:t xml:space="preserve">Genomics-driven precision medicine for advanced pancreatic cancer: Early results from the COMPASS trial</w:t>
         </w:r>
       </w:hyperlink>
       <w:r>
@@ -10494,7 +10605,7 @@
           <w:iCs/>
           <w:i/>
         </w:rPr>
-        <w:t xml:space="preserve">Nucleic Acids Research</w:t>
+        <w:t xml:space="preserve">Clinical Cancer Research</w:t>
       </w:r>
       <w:r>
         <w:t xml:space="preserve"> </w:t>
@@ -10504,20 +10615,20 @@
           <w:bCs/>
           <w:b/>
         </w:rPr>
-        <w:t xml:space="preserve">52</w:t>
-      </w:r>
-      <w:r>
-        <w:t xml:space="preserve">, 4761–4783 (2024).</w:t>
+        <w:t xml:space="preserve">24</w:t>
+      </w:r>
+      <w:r>
+        <w:t xml:space="preserve">, 1344–1354 (2018).</w:t>
       </w:r>
     </w:p>
     <w:bookmarkEnd w:id="77"/>
-    <w:bookmarkStart w:id="79" w:name="ref-lee1999learning"/>
+    <w:bookmarkStart w:id="79" w:name="ref-nguyen2024fourteen"/>
     <w:p>
       <w:pPr>
         <w:pStyle w:val="Bibliography"/>
       </w:pPr>
       <w:r>
-        <w:t xml:space="preserve">12.</w:t>
+        <w:t xml:space="preserve">11.</w:t>
       </w:r>
       <w:r>
         <w:t xml:space="preserve"> </w:t>
@@ -10526,7 +10637,7 @@
         <w:t xml:space="preserve">	</w:t>
       </w:r>
       <w:r>
-        <w:t xml:space="preserve">Lee, D. D. &amp; Seung, H. S.</w:t>
+        <w:t xml:space="preserve">Nguyen, H., Nguyen, H., Tran, D., Draghici, S. &amp; Nguyen, T.</w:t>
       </w:r>
       <w:r>
         <w:t xml:space="preserve"> </w:t>
@@ -10536,7 +10647,7 @@
           <w:rPr>
             <w:rStyle w:val="Hyperlink"/>
           </w:rPr>
-          <w:t xml:space="preserve">Learning the parts of objects by non-negative matrix factorization</w:t>
+          <w:t xml:space="preserve">Fourteen years of cellular deconvolution: Methodology, applications, technical evaluation and outstanding challenges</w:t>
         </w:r>
       </w:hyperlink>
       <w:r>
@@ -10550,7 +10661,7 @@
           <w:iCs/>
           <w:i/>
         </w:rPr>
-        <w:t xml:space="preserve">Nature</w:t>
+        <w:t xml:space="preserve">Nucleic Acids Research</w:t>
       </w:r>
       <w:r>
         <w:t xml:space="preserve"> </w:t>
@@ -10560,20 +10671,20 @@
           <w:bCs/>
           <w:b/>
         </w:rPr>
-        <w:t xml:space="preserve">401</w:t>
-      </w:r>
-      <w:r>
-        <w:t xml:space="preserve">, 788–791 (1999).</w:t>
+        <w:t xml:space="preserve">52</w:t>
+      </w:r>
+      <w:r>
+        <w:t xml:space="preserve">, 4761–4783 (2024).</w:t>
       </w:r>
     </w:p>
     <w:bookmarkEnd w:id="79"/>
-    <w:bookmarkStart w:id="81" w:name="ref-brunet2004metagenes"/>
+    <w:bookmarkStart w:id="81" w:name="ref-lee1999learning"/>
     <w:p>
       <w:pPr>
         <w:pStyle w:val="Bibliography"/>
       </w:pPr>
       <w:r>
-        <w:t xml:space="preserve">13.</w:t>
+        <w:t xml:space="preserve">12.</w:t>
       </w:r>
       <w:r>
         <w:t xml:space="preserve"> </w:t>
@@ -10582,7 +10693,7 @@
         <w:t xml:space="preserve">	</w:t>
       </w:r>
       <w:r>
-        <w:t xml:space="preserve">Brunet, J.-P., Tamayo, P., Golub, T. R. &amp; Mesirov, J. P.</w:t>
+        <w:t xml:space="preserve">Lee, D. D. &amp; Seung, H. S.</w:t>
       </w:r>
       <w:r>
         <w:t xml:space="preserve"> </w:t>
@@ -10592,7 +10703,7 @@
           <w:rPr>
             <w:rStyle w:val="Hyperlink"/>
           </w:rPr>
-          <w:t xml:space="preserve">Metagenes and molecular pattern discovery using matrix factorization</w:t>
+          <w:t xml:space="preserve">Learning the parts of objects by non-negative matrix factorization</w:t>
         </w:r>
       </w:hyperlink>
       <w:r>
@@ -10606,7 +10717,7 @@
           <w:iCs/>
           <w:i/>
         </w:rPr>
-        <w:t xml:space="preserve">Proceedings of the National Academy of Sciences USA</w:t>
+        <w:t xml:space="preserve">Nature</w:t>
       </w:r>
       <w:r>
         <w:t xml:space="preserve"> </w:t>
@@ -10616,20 +10727,20 @@
           <w:bCs/>
           <w:b/>
         </w:rPr>
-        <w:t xml:space="preserve">101</w:t>
-      </w:r>
-      <w:r>
-        <w:t xml:space="preserve">, 4164–4169 (2004).</w:t>
+        <w:t xml:space="preserve">401</w:t>
+      </w:r>
+      <w:r>
+        <w:t xml:space="preserve">, 788–791 (1999).</w:t>
       </w:r>
     </w:p>
     <w:bookmarkEnd w:id="81"/>
-    <w:bookmarkStart w:id="83" w:name="ref-peng2019novo"/>
+    <w:bookmarkStart w:id="83" w:name="ref-brunet2004metagenes"/>
     <w:p>
       <w:pPr>
         <w:pStyle w:val="Bibliography"/>
       </w:pPr>
       <w:r>
-        <w:t xml:space="preserve">14.</w:t>
+        <w:t xml:space="preserve">13.</w:t>
       </w:r>
       <w:r>
         <w:t xml:space="preserve"> </w:t>
@@ -10638,7 +10749,7 @@
         <w:t xml:space="preserve">	</w:t>
       </w:r>
       <w:r>
-        <w:t xml:space="preserve">Peng, X. L., Moffitt, R. A., Torphy, R. J., Volmar, K. E. &amp; Yeh, J. J.</w:t>
+        <w:t xml:space="preserve">Brunet, J.-P., Tamayo, P., Golub, T. R. &amp; Mesirov, J. P.</w:t>
       </w:r>
       <w:r>
         <w:t xml:space="preserve"> </w:t>
@@ -10648,7 +10759,7 @@
           <w:rPr>
             <w:rStyle w:val="Hyperlink"/>
           </w:rPr>
-          <w:t xml:space="preserve">De novo compartment deconvolution and weight estimation of tumor samples using DECODER</w:t>
+          <w:t xml:space="preserve">Metagenes and molecular pattern discovery using matrix factorization</w:t>
         </w:r>
       </w:hyperlink>
       <w:r>
@@ -10662,7 +10773,7 @@
           <w:iCs/>
           <w:i/>
         </w:rPr>
-        <w:t xml:space="preserve">Nature Communications</w:t>
+        <w:t xml:space="preserve">Proceedings of the National Academy of Sciences USA</w:t>
       </w:r>
       <w:r>
         <w:t xml:space="preserve"> </w:t>
@@ -10672,20 +10783,20 @@
           <w:bCs/>
           <w:b/>
         </w:rPr>
-        <w:t xml:space="preserve">10</w:t>
-      </w:r>
-      <w:r>
-        <w:t xml:space="preserve">, 4729 (2019).</w:t>
+        <w:t xml:space="preserve">101</w:t>
+      </w:r>
+      <w:r>
+        <w:t xml:space="preserve">, 4164–4169 (2004).</w:t>
       </w:r>
     </w:p>
     <w:bookmarkEnd w:id="83"/>
-    <w:bookmarkStart w:id="85" w:name="ref-bair2004semi"/>
+    <w:bookmarkStart w:id="85" w:name="ref-peng2019novo"/>
     <w:p>
       <w:pPr>
         <w:pStyle w:val="Bibliography"/>
       </w:pPr>
       <w:r>
-        <w:t xml:space="preserve">15.</w:t>
+        <w:t xml:space="preserve">14.</w:t>
       </w:r>
       <w:r>
         <w:t xml:space="preserve"> </w:t>
@@ -10694,7 +10805,7 @@
         <w:t xml:space="preserve">	</w:t>
       </w:r>
       <w:r>
-        <w:t xml:space="preserve">Bair, E. &amp; Tibshirani, R.</w:t>
+        <w:t xml:space="preserve">Peng, X. L., Moffitt, R. A., Torphy, R. J., Volmar, K. E. &amp; Yeh, J. J.</w:t>
       </w:r>
       <w:r>
         <w:t xml:space="preserve"> </w:t>
@@ -10704,7 +10815,7 @@
           <w:rPr>
             <w:rStyle w:val="Hyperlink"/>
           </w:rPr>
-          <w:t xml:space="preserve">Semi-supervised methods to predict patient survival from gene expression data</w:t>
+          <w:t xml:space="preserve">De novo compartment deconvolution and weight estimation of tumor samples using DECODER</w:t>
         </w:r>
       </w:hyperlink>
       <w:r>
@@ -10718,7 +10829,7 @@
           <w:iCs/>
           <w:i/>
         </w:rPr>
-        <w:t xml:space="preserve">PLoS Biology</w:t>
+        <w:t xml:space="preserve">Nature Communications</w:t>
       </w:r>
       <w:r>
         <w:t xml:space="preserve"> </w:t>
@@ -10728,20 +10839,20 @@
           <w:bCs/>
           <w:b/>
         </w:rPr>
-        <w:t xml:space="preserve">2</w:t>
-      </w:r>
-      <w:r>
-        <w:t xml:space="preserve">, e108 (2004).</w:t>
+        <w:t xml:space="preserve">10</w:t>
+      </w:r>
+      <w:r>
+        <w:t xml:space="preserve">, 4729 (2019).</w:t>
       </w:r>
     </w:p>
     <w:bookmarkEnd w:id="85"/>
-    <w:bookmarkStart w:id="87" w:name="ref-cook2007fisher"/>
+    <w:bookmarkStart w:id="87" w:name="ref-bair2004semi"/>
     <w:p>
       <w:pPr>
         <w:pStyle w:val="Bibliography"/>
       </w:pPr>
       <w:r>
-        <w:t xml:space="preserve">16.</w:t>
+        <w:t xml:space="preserve">15.</w:t>
       </w:r>
       <w:r>
         <w:t xml:space="preserve"> </w:t>
@@ -10750,7 +10861,7 @@
         <w:t xml:space="preserve">	</w:t>
       </w:r>
       <w:r>
-        <w:t xml:space="preserve">Cook, R. D.</w:t>
+        <w:t xml:space="preserve">Bair, E. &amp; Tibshirani, R.</w:t>
       </w:r>
       <w:r>
         <w:t xml:space="preserve"> </w:t>
@@ -10760,7 +10871,7 @@
           <w:rPr>
             <w:rStyle w:val="Hyperlink"/>
           </w:rPr>
-          <w:t xml:space="preserve">Fisher lecture: Dimension reduction in regression</w:t>
+          <w:t xml:space="preserve">Semi-supervised methods to predict patient survival from gene expression data</w:t>
         </w:r>
       </w:hyperlink>
       <w:r>
@@ -10774,7 +10885,7 @@
           <w:iCs/>
           <w:i/>
         </w:rPr>
-        <w:t xml:space="preserve">Statistical Science</w:t>
+        <w:t xml:space="preserve">PLoS Biology</w:t>
       </w:r>
       <w:r>
         <w:t xml:space="preserve"> </w:t>
@@ -10784,20 +10895,20 @@
           <w:bCs/>
           <w:b/>
         </w:rPr>
-        <w:t xml:space="preserve">22</w:t>
-      </w:r>
-      <w:r>
-        <w:t xml:space="preserve">, 1–26 (2007).</w:t>
+        <w:t xml:space="preserve">2</w:t>
+      </w:r>
+      <w:r>
+        <w:t xml:space="preserve">, e108 (2004).</w:t>
       </w:r>
     </w:p>
     <w:bookmarkEnd w:id="87"/>
-    <w:bookmarkStart w:id="89" w:name="ref-torrehealy2023pdacr"/>
+    <w:bookmarkStart w:id="89" w:name="ref-cook2007fisher"/>
     <w:p>
       <w:pPr>
         <w:pStyle w:val="Bibliography"/>
       </w:pPr>
       <w:r>
-        <w:t xml:space="preserve">17.</w:t>
+        <w:t xml:space="preserve">16.</w:t>
       </w:r>
       <w:r>
         <w:t xml:space="preserve"> </w:t>
@@ -10806,17 +10917,7 @@
         <w:t xml:space="preserve">	</w:t>
       </w:r>
       <w:r>
-        <w:t xml:space="preserve">Torre-Healy, L. A.</w:t>
-      </w:r>
-      <w:r>
-        <w:t xml:space="preserve"> </w:t>
-      </w:r>
-      <w:r>
-        <w:rPr>
-          <w:iCs/>
-          <w:i/>
-        </w:rPr>
-        <w:t xml:space="preserve">et al.</w:t>
+        <w:t xml:space="preserve">Cook, R. D.</w:t>
       </w:r>
       <w:r>
         <w:t xml:space="preserve"> </w:t>
@@ -10826,7 +10927,7 @@
           <w:rPr>
             <w:rStyle w:val="Hyperlink"/>
           </w:rPr>
-          <w:t xml:space="preserve">Open-source curation of a pancreatic ductal adenocarcinoma gene expression analysis platform (pdacR) supports a two-subtype model of clinical relevance</w:t>
+          <w:t xml:space="preserve">Fisher lecture: Dimension reduction in regression</w:t>
         </w:r>
       </w:hyperlink>
       <w:r>
@@ -10840,7 +10941,7 @@
           <w:iCs/>
           <w:i/>
         </w:rPr>
-        <w:t xml:space="preserve">Communications Biology</w:t>
+        <w:t xml:space="preserve">Statistical Science</w:t>
       </w:r>
       <w:r>
         <w:t xml:space="preserve"> </w:t>
@@ -10850,20 +10951,20 @@
           <w:bCs/>
           <w:b/>
         </w:rPr>
-        <w:t xml:space="preserve">6</w:t>
-      </w:r>
-      <w:r>
-        <w:t xml:space="preserve">, 163 (2023).</w:t>
+        <w:t xml:space="preserve">22</w:t>
+      </w:r>
+      <w:r>
+        <w:t xml:space="preserve">, 1–26 (2007).</w:t>
       </w:r>
     </w:p>
     <w:bookmarkEnd w:id="89"/>
-    <w:bookmarkStart w:id="91" w:name="ref-aran2015systematic"/>
+    <w:bookmarkStart w:id="91" w:name="ref-torrehealy2023pdacr"/>
     <w:p>
       <w:pPr>
         <w:pStyle w:val="Bibliography"/>
       </w:pPr>
       <w:r>
-        <w:t xml:space="preserve">18.</w:t>
+        <w:t xml:space="preserve">17.</w:t>
       </w:r>
       <w:r>
         <w:t xml:space="preserve"> </w:t>
@@ -10872,7 +10973,17 @@
         <w:t xml:space="preserve">	</w:t>
       </w:r>
       <w:r>
-        <w:t xml:space="preserve">Aran, D., Sirota, M. &amp; Butte, A. J.</w:t>
+        <w:t xml:space="preserve">Torre-Healy, L. A.</w:t>
+      </w:r>
+      <w:r>
+        <w:t xml:space="preserve"> </w:t>
+      </w:r>
+      <w:r>
+        <w:rPr>
+          <w:iCs/>
+          <w:i/>
+        </w:rPr>
+        <w:t xml:space="preserve">et al.</w:t>
       </w:r>
       <w:r>
         <w:t xml:space="preserve"> </w:t>
@@ -10882,7 +10993,7 @@
           <w:rPr>
             <w:rStyle w:val="Hyperlink"/>
           </w:rPr>
-          <w:t xml:space="preserve">Systematic pan-cancer analysis of tumour purity</w:t>
+          <w:t xml:space="preserve">Open-source curation of a pancreatic ductal adenocarcinoma gene expression analysis platform (pdacR) supports a two-subtype model of clinical relevance</w:t>
         </w:r>
       </w:hyperlink>
       <w:r>
@@ -10896,7 +11007,7 @@
           <w:iCs/>
           <w:i/>
         </w:rPr>
-        <w:t xml:space="preserve">Nature Communications</w:t>
+        <w:t xml:space="preserve">Communications Biology</w:t>
       </w:r>
       <w:r>
         <w:t xml:space="preserve"> </w:t>
@@ -10909,17 +11020,17 @@
         <w:t xml:space="preserve">6</w:t>
       </w:r>
       <w:r>
-        <w:t xml:space="preserve">, 9971 (2015).</w:t>
+        <w:t xml:space="preserve">, 163 (2023).</w:t>
       </w:r>
     </w:p>
     <w:bookmarkEnd w:id="91"/>
-    <w:bookmarkStart w:id="92" w:name="ref-donoho2004nmf"/>
+    <w:bookmarkStart w:id="93" w:name="ref-aran2015systematic"/>
     <w:p>
       <w:pPr>
         <w:pStyle w:val="Bibliography"/>
       </w:pPr>
       <w:r>
-        <w:t xml:space="preserve">19.</w:t>
+        <w:t xml:space="preserve">18.</w:t>
       </w:r>
       <w:r>
         <w:t xml:space="preserve"> </w:t>
@@ -10928,52 +11039,17 @@
         <w:t xml:space="preserve">	</w:t>
       </w:r>
       <w:r>
-        <w:t xml:space="preserve">Donoho, D. &amp; Stodden, V. When does non-negative matrix factorization give a correct decomposition into parts? in</w:t>
-      </w:r>
-      <w:r>
-        <w:t xml:space="preserve"> </w:t>
-      </w:r>
-      <w:r>
-        <w:rPr>
-          <w:iCs/>
-          <w:i/>
-        </w:rPr>
-        <w:t xml:space="preserve">Advances in neural information processing systems 16 (NIPS 2003)</w:t>
-      </w:r>
-      <w:r>
-        <w:t xml:space="preserve"> </w:t>
-      </w:r>
-      <w:r>
-        <w:t xml:space="preserve">(eds. Thrun, S., Saul, L. K. &amp; Schölkopf, B.) 1141–1148 (MIT Press, 2004).</w:t>
-      </w:r>
-    </w:p>
-    <w:bookmarkEnd w:id="92"/>
-    <w:bookmarkStart w:id="94" w:name="ref-laurberg2008uniqueness"/>
-    <w:p>
-      <w:pPr>
-        <w:pStyle w:val="Bibliography"/>
-      </w:pPr>
-      <w:r>
-        <w:t xml:space="preserve">20.</w:t>
-      </w:r>
-      <w:r>
-        <w:t xml:space="preserve"> </w:t>
-      </w:r>
-      <w:r>
-        <w:t xml:space="preserve">	</w:t>
-      </w:r>
-      <w:r>
-        <w:t xml:space="preserve">Laurberg, H., Christensen, M. G., Plumbley, M. D., Hansen, L. K. &amp; Jensen, S. H.</w:t>
-      </w:r>
-      <w:r>
-        <w:t xml:space="preserve"> </w:t>
-      </w:r>
-      <w:hyperlink r:id="rId93">
-        <w:r>
-          <w:rPr>
-            <w:rStyle w:val="Hyperlink"/>
-          </w:rPr>
-          <w:t xml:space="preserve">Theorems on positive data: On the uniqueness of NMF</w:t>
+        <w:t xml:space="preserve">Aran, D., Sirota, M. &amp; Butte, A. J.</w:t>
+      </w:r>
+      <w:r>
+        <w:t xml:space="preserve"> </w:t>
+      </w:r>
+      <w:hyperlink r:id="rId92">
+        <w:r>
+          <w:rPr>
+            <w:rStyle w:val="Hyperlink"/>
+          </w:rPr>
+          <w:t xml:space="preserve">Systematic pan-cancer analysis of tumour purity</w:t>
         </w:r>
       </w:hyperlink>
       <w:r>
@@ -10987,7 +11063,7 @@
           <w:iCs/>
           <w:i/>
         </w:rPr>
-        <w:t xml:space="preserve">Computational Intelligence and Neuroscience</w:t>
+        <w:t xml:space="preserve">Nature Communications</w:t>
       </w:r>
       <w:r>
         <w:t xml:space="preserve"> </w:t>
@@ -10997,20 +11073,55 @@
           <w:bCs/>
           <w:b/>
         </w:rPr>
-        <w:t xml:space="preserve">2008</w:t>
-      </w:r>
-      <w:r>
-        <w:t xml:space="preserve">, 764206 (2008).</w:t>
+        <w:t xml:space="preserve">6</w:t>
+      </w:r>
+      <w:r>
+        <w:t xml:space="preserve">, 9971 (2015).</w:t>
+      </w:r>
+    </w:p>
+    <w:bookmarkEnd w:id="93"/>
+    <w:bookmarkStart w:id="94" w:name="ref-donoho2004nmf"/>
+    <w:p>
+      <w:pPr>
+        <w:pStyle w:val="Bibliography"/>
+      </w:pPr>
+      <w:r>
+        <w:t xml:space="preserve">19.</w:t>
+      </w:r>
+      <w:r>
+        <w:t xml:space="preserve"> </w:t>
+      </w:r>
+      <w:r>
+        <w:t xml:space="preserve">	</w:t>
+      </w:r>
+      <w:r>
+        <w:t xml:space="preserve">Donoho, D. &amp; Stodden, V. When does non-negative matrix factorization give a correct decomposition into parts? in</w:t>
+      </w:r>
+      <w:r>
+        <w:t xml:space="preserve"> </w:t>
+      </w:r>
+      <w:r>
+        <w:rPr>
+          <w:iCs/>
+          <w:i/>
+        </w:rPr>
+        <w:t xml:space="preserve">Advances in neural information processing systems 16 (NIPS 2003)</w:t>
+      </w:r>
+      <w:r>
+        <w:t xml:space="preserve"> </w:t>
+      </w:r>
+      <w:r>
+        <w:t xml:space="preserve">(eds. Thrun, S., Saul, L. K. &amp; Schölkopf, B.) 1141–1148 (MIT Press, 2004).</w:t>
       </w:r>
     </w:p>
     <w:bookmarkEnd w:id="94"/>
-    <w:bookmarkStart w:id="95" w:name="ref-gillis2014nmf"/>
+    <w:bookmarkStart w:id="96" w:name="ref-laurberg2008uniqueness"/>
     <w:p>
       <w:pPr>
         <w:pStyle w:val="Bibliography"/>
       </w:pPr>
       <w:r>
-        <w:t xml:space="preserve">21.</w:t>
+        <w:t xml:space="preserve">20.</w:t>
       </w:r>
       <w:r>
         <w:t xml:space="preserve"> </w:t>
@@ -11019,52 +11130,17 @@
         <w:t xml:space="preserve">	</w:t>
       </w:r>
       <w:r>
-        <w:t xml:space="preserve">Gillis, N. The why and how of nonnegative matrix factorization. in</w:t>
-      </w:r>
-      <w:r>
-        <w:t xml:space="preserve"> </w:t>
-      </w:r>
-      <w:r>
-        <w:rPr>
-          <w:iCs/>
-          <w:i/>
-        </w:rPr>
-        <w:t xml:space="preserve">Regularization, optimization, kernels, and support vector machines</w:t>
-      </w:r>
-      <w:r>
-        <w:t xml:space="preserve"> </w:t>
-      </w:r>
-      <w:r>
-        <w:t xml:space="preserve">(eds. Suykens, J. A. K., Signoretto, M. &amp; Argyriou, A.) 257–291 (Chapman; Hall/CRC, 2014).</w:t>
-      </w:r>
-    </w:p>
-    <w:bookmarkEnd w:id="95"/>
-    <w:bookmarkStart w:id="97" w:name="ref-lautizi2022pancreatic"/>
-    <w:p>
-      <w:pPr>
-        <w:pStyle w:val="Bibliography"/>
-      </w:pPr>
-      <w:r>
-        <w:t xml:space="preserve">22.</w:t>
-      </w:r>
-      <w:r>
-        <w:t xml:space="preserve"> </w:t>
-      </w:r>
-      <w:r>
-        <w:t xml:space="preserve">	</w:t>
-      </w:r>
-      <w:r>
-        <w:t xml:space="preserve">Lautizi, M., Baumbach, J., Weichert, W., Steiger, K. &amp; List, M.</w:t>
-      </w:r>
-      <w:r>
-        <w:t xml:space="preserve"> </w:t>
-      </w:r>
-      <w:hyperlink r:id="rId96">
-        <w:r>
-          <w:rPr>
-            <w:rStyle w:val="Hyperlink"/>
-          </w:rPr>
-          <w:t xml:space="preserve">A systematic assessment of pancreatic cancer molecular subtype classification across cohorts</w:t>
+        <w:t xml:space="preserve">Laurberg, H., Christensen, M. G., Plumbley, M. D., Hansen, L. K. &amp; Jensen, S. H.</w:t>
+      </w:r>
+      <w:r>
+        <w:t xml:space="preserve"> </w:t>
+      </w:r>
+      <w:hyperlink r:id="rId95">
+        <w:r>
+          <w:rPr>
+            <w:rStyle w:val="Hyperlink"/>
+          </w:rPr>
+          <w:t xml:space="preserve">Theorems on positive data: On the uniqueness of NMF</w:t>
         </w:r>
       </w:hyperlink>
       <w:r>
@@ -11078,7 +11154,7 @@
           <w:iCs/>
           <w:i/>
         </w:rPr>
-        <w:t xml:space="preserve">NAR Cancer</w:t>
+        <w:t xml:space="preserve">Computational Intelligence and Neuroscience</w:t>
       </w:r>
       <w:r>
         <w:t xml:space="preserve"> </w:t>
@@ -11088,20 +11164,55 @@
           <w:bCs/>
           <w:b/>
         </w:rPr>
-        <w:t xml:space="preserve">4</w:t>
-      </w:r>
-      <w:r>
-        <w:t xml:space="preserve">, zcac030 (2022).</w:t>
+        <w:t xml:space="preserve">2008</w:t>
+      </w:r>
+      <w:r>
+        <w:t xml:space="preserve">, 764206 (2008).</w:t>
+      </w:r>
+    </w:p>
+    <w:bookmarkEnd w:id="96"/>
+    <w:bookmarkStart w:id="97" w:name="ref-gillis2014nmf"/>
+    <w:p>
+      <w:pPr>
+        <w:pStyle w:val="Bibliography"/>
+      </w:pPr>
+      <w:r>
+        <w:t xml:space="preserve">21.</w:t>
+      </w:r>
+      <w:r>
+        <w:t xml:space="preserve"> </w:t>
+      </w:r>
+      <w:r>
+        <w:t xml:space="preserve">	</w:t>
+      </w:r>
+      <w:r>
+        <w:t xml:space="preserve">Gillis, N. The why and how of nonnegative matrix factorization. in</w:t>
+      </w:r>
+      <w:r>
+        <w:t xml:space="preserve"> </w:t>
+      </w:r>
+      <w:r>
+        <w:rPr>
+          <w:iCs/>
+          <w:i/>
+        </w:rPr>
+        <w:t xml:space="preserve">Regularization, optimization, kernels, and support vector machines</w:t>
+      </w:r>
+      <w:r>
+        <w:t xml:space="preserve"> </w:t>
+      </w:r>
+      <w:r>
+        <w:t xml:space="preserve">(eds. Suykens, J. A. K., Signoretto, M. &amp; Argyriou, A.) 257–291 (Chapman; Hall/CRC, 2014).</w:t>
       </w:r>
     </w:p>
     <w:bookmarkEnd w:id="97"/>
-    <w:bookmarkStart w:id="99" w:name="ref-simon2011regularization"/>
+    <w:bookmarkStart w:id="99" w:name="ref-lautizi2022pancreatic"/>
     <w:p>
       <w:pPr>
         <w:pStyle w:val="Bibliography"/>
       </w:pPr>
       <w:r>
-        <w:t xml:space="preserve">23.</w:t>
+        <w:t xml:space="preserve">22.</w:t>
       </w:r>
       <w:r>
         <w:t xml:space="preserve"> </w:t>
@@ -11110,7 +11221,7 @@
         <w:t xml:space="preserve">	</w:t>
       </w:r>
       <w:r>
-        <w:t xml:space="preserve">Simon, N., Friedman, J. H., Hastie, T. &amp; Tibshirani, R.</w:t>
+        <w:t xml:space="preserve">Lautizi, M., Baumbach, J., Weichert, W., Steiger, K. &amp; List, M.</w:t>
       </w:r>
       <w:r>
         <w:t xml:space="preserve"> </w:t>
@@ -11120,7 +11231,7 @@
           <w:rPr>
             <w:rStyle w:val="Hyperlink"/>
           </w:rPr>
-          <w:t xml:space="preserve">Regularization paths for cox’s proportional hazards model via coordinate descent</w:t>
+          <w:t xml:space="preserve">A systematic assessment of pancreatic cancer molecular subtype classification across cohorts</w:t>
         </w:r>
       </w:hyperlink>
       <w:r>
@@ -11134,7 +11245,7 @@
           <w:iCs/>
           <w:i/>
         </w:rPr>
-        <w:t xml:space="preserve">Journal of Statistical Software</w:t>
+        <w:t xml:space="preserve">NAR Cancer</w:t>
       </w:r>
       <w:r>
         <w:t xml:space="preserve"> </w:t>
@@ -11144,20 +11255,20 @@
           <w:bCs/>
           <w:b/>
         </w:rPr>
-        <w:t xml:space="preserve">39</w:t>
-      </w:r>
-      <w:r>
-        <w:t xml:space="preserve">, 1–13 (2011).</w:t>
+        <w:t xml:space="preserve">4</w:t>
+      </w:r>
+      <w:r>
+        <w:t xml:space="preserve">, zcac030 (2022).</w:t>
       </w:r>
     </w:p>
     <w:bookmarkEnd w:id="99"/>
-    <w:bookmarkStart w:id="101" w:name="ref-raphael2017integrated"/>
+    <w:bookmarkStart w:id="101" w:name="ref-simon2011regularization"/>
     <w:p>
       <w:pPr>
         <w:pStyle w:val="Bibliography"/>
       </w:pPr>
       <w:r>
-        <w:t xml:space="preserve">24.</w:t>
+        <w:t xml:space="preserve">23.</w:t>
       </w:r>
       <w:r>
         <w:t xml:space="preserve"> </w:t>
@@ -11166,17 +11277,7 @@
         <w:t xml:space="preserve">	</w:t>
       </w:r>
       <w:r>
-        <w:t xml:space="preserve">Raphael, B. J.</w:t>
-      </w:r>
-      <w:r>
-        <w:t xml:space="preserve"> </w:t>
-      </w:r>
-      <w:r>
-        <w:rPr>
-          <w:iCs/>
-          <w:i/>
-        </w:rPr>
-        <w:t xml:space="preserve">et al.</w:t>
+        <w:t xml:space="preserve">Simon, N., Friedman, J. H., Hastie, T. &amp; Tibshirani, R.</w:t>
       </w:r>
       <w:r>
         <w:t xml:space="preserve"> </w:t>
@@ -11186,7 +11287,7 @@
           <w:rPr>
             <w:rStyle w:val="Hyperlink"/>
           </w:rPr>
-          <w:t xml:space="preserve">Integrated genomic characterization of pancreatic ductal adenocarcinoma</w:t>
+          <w:t xml:space="preserve">Regularization paths for cox’s proportional hazards model via coordinate descent</w:t>
         </w:r>
       </w:hyperlink>
       <w:r>
@@ -11200,7 +11301,7 @@
           <w:iCs/>
           <w:i/>
         </w:rPr>
-        <w:t xml:space="preserve">Cancer Cell</w:t>
+        <w:t xml:space="preserve">Journal of Statistical Software</w:t>
       </w:r>
       <w:r>
         <w:t xml:space="preserve"> </w:t>
@@ -11210,20 +11311,20 @@
           <w:bCs/>
           <w:b/>
         </w:rPr>
-        <w:t xml:space="preserve">32</w:t>
-      </w:r>
-      <w:r>
-        <w:t xml:space="preserve">, 185–203 (2017).</w:t>
+        <w:t xml:space="preserve">39</w:t>
+      </w:r>
+      <w:r>
+        <w:t xml:space="preserve">, 1–13 (2011).</w:t>
       </w:r>
     </w:p>
     <w:bookmarkEnd w:id="101"/>
-    <w:bookmarkStart w:id="103" w:name="ref-cao2021proteogenomic"/>
+    <w:bookmarkStart w:id="103" w:name="ref-raphael2017integrated"/>
     <w:p>
       <w:pPr>
         <w:pStyle w:val="Bibliography"/>
       </w:pPr>
       <w:r>
-        <w:t xml:space="preserve">25.</w:t>
+        <w:t xml:space="preserve">24.</w:t>
       </w:r>
       <w:r>
         <w:t xml:space="preserve"> </w:t>
@@ -11232,7 +11333,7 @@
         <w:t xml:space="preserve">	</w:t>
       </w:r>
       <w:r>
-        <w:t xml:space="preserve">Cao, L.</w:t>
+        <w:t xml:space="preserve">Raphael, B. J.</w:t>
       </w:r>
       <w:r>
         <w:t xml:space="preserve"> </w:t>
@@ -11252,7 +11353,7 @@
           <w:rPr>
             <w:rStyle w:val="Hyperlink"/>
           </w:rPr>
-          <w:t xml:space="preserve">Proteogenomic characterization of pancreatic ductal adenocarcinoma</w:t>
+          <w:t xml:space="preserve">Integrated genomic characterization of pancreatic ductal adenocarcinoma</w:t>
         </w:r>
       </w:hyperlink>
       <w:r>
@@ -11266,7 +11367,7 @@
           <w:iCs/>
           <w:i/>
         </w:rPr>
-        <w:t xml:space="preserve">Cell</w:t>
+        <w:t xml:space="preserve">Cancer Cell</w:t>
       </w:r>
       <w:r>
         <w:t xml:space="preserve"> </w:t>
@@ -11276,20 +11377,20 @@
           <w:bCs/>
           <w:b/>
         </w:rPr>
-        <w:t xml:space="preserve">184</w:t>
-      </w:r>
-      <w:r>
-        <w:t xml:space="preserve">, 5031–5052 (2021).</w:t>
+        <w:t xml:space="preserve">32</w:t>
+      </w:r>
+      <w:r>
+        <w:t xml:space="preserve">, 185–203 (2017).</w:t>
       </w:r>
     </w:p>
     <w:bookmarkEnd w:id="103"/>
-    <w:bookmarkStart w:id="105" w:name="ref-snoek2012practical"/>
+    <w:bookmarkStart w:id="105" w:name="ref-cao2021proteogenomic"/>
     <w:p>
       <w:pPr>
         <w:pStyle w:val="Bibliography"/>
       </w:pPr>
       <w:r>
-        <w:t xml:space="preserve">26.</w:t>
+        <w:t xml:space="preserve">25.</w:t>
       </w:r>
       <w:r>
         <w:t xml:space="preserve"> </w:t>
@@ -11298,7 +11399,17 @@
         <w:t xml:space="preserve">	</w:t>
       </w:r>
       <w:r>
-        <w:t xml:space="preserve">Snoek, J., Larochelle, H. &amp; Adams, R. P.</w:t>
+        <w:t xml:space="preserve">Cao, L.</w:t>
+      </w:r>
+      <w:r>
+        <w:t xml:space="preserve"> </w:t>
+      </w:r>
+      <w:r>
+        <w:rPr>
+          <w:iCs/>
+          <w:i/>
+        </w:rPr>
+        <w:t xml:space="preserve">et al.</w:t>
       </w:r>
       <w:r>
         <w:t xml:space="preserve"> </w:t>
@@ -11308,95 +11419,10 @@
           <w:rPr>
             <w:rStyle w:val="Hyperlink"/>
           </w:rPr>
-          <w:t xml:space="preserve">Practical</w:t>
-        </w:r>
-        <w:r>
-          <w:rPr>
-            <w:rStyle w:val="Hyperlink"/>
-          </w:rPr>
-          <w:t xml:space="preserve"> </w:t>
-        </w:r>
-        <w:r>
-          <w:rPr>
-            <w:rStyle w:val="Hyperlink"/>
-          </w:rPr>
-          <w:t xml:space="preserve">B</w:t>
-        </w:r>
-        <w:r>
-          <w:rPr>
-            <w:rStyle w:val="Hyperlink"/>
-          </w:rPr>
-          <w:t xml:space="preserve">ayesian optimization of machine learning algorithms</w:t>
+          <w:t xml:space="preserve">Proteogenomic characterization of pancreatic ductal adenocarcinoma</w:t>
         </w:r>
       </w:hyperlink>
       <w:r>
-        <w:t xml:space="preserve">. in</w:t>
-      </w:r>
-      <w:r>
-        <w:t xml:space="preserve"> </w:t>
-      </w:r>
-      <w:r>
-        <w:rPr>
-          <w:iCs/>
-          <w:i/>
-        </w:rPr>
-        <w:t xml:space="preserve">Advances in neural information processing systems 25 (NeurIPS 2012)</w:t>
-      </w:r>
-      <w:r>
-        <w:t xml:space="preserve"> </w:t>
-      </w:r>
-      <w:r>
-        <w:t xml:space="preserve">(2012).</w:t>
-      </w:r>
-    </w:p>
-    <w:bookmarkEnd w:id="105"/>
-    <w:bookmarkStart w:id="107" w:name="ref-shahriari2016taking"/>
-    <w:p>
-      <w:pPr>
-        <w:pStyle w:val="Bibliography"/>
-      </w:pPr>
-      <w:r>
-        <w:t xml:space="preserve">27.</w:t>
-      </w:r>
-      <w:r>
-        <w:t xml:space="preserve"> </w:t>
-      </w:r>
-      <w:r>
-        <w:t xml:space="preserve">	</w:t>
-      </w:r>
-      <w:r>
-        <w:t xml:space="preserve">Shahriari, B., Swersky, K., Wang, Z., Adams, R. P. &amp; Freitas, N. de.</w:t>
-      </w:r>
-      <w:r>
-        <w:t xml:space="preserve"> </w:t>
-      </w:r>
-      <w:hyperlink r:id="rId106">
-        <w:r>
-          <w:rPr>
-            <w:rStyle w:val="Hyperlink"/>
-          </w:rPr>
-          <w:t xml:space="preserve">Taking the human out of the loop: A review of</w:t>
-        </w:r>
-        <w:r>
-          <w:rPr>
-            <w:rStyle w:val="Hyperlink"/>
-          </w:rPr>
-          <w:t xml:space="preserve"> </w:t>
-        </w:r>
-        <w:r>
-          <w:rPr>
-            <w:rStyle w:val="Hyperlink"/>
-          </w:rPr>
-          <w:t xml:space="preserve">B</w:t>
-        </w:r>
-        <w:r>
-          <w:rPr>
-            <w:rStyle w:val="Hyperlink"/>
-          </w:rPr>
-          <w:t xml:space="preserve">ayesian optimization</w:t>
-        </w:r>
-      </w:hyperlink>
-      <w:r>
         <w:t xml:space="preserve">.</w:t>
       </w:r>
       <w:r>
@@ -11407,7 +11433,7 @@
           <w:iCs/>
           <w:i/>
         </w:rPr>
-        <w:t xml:space="preserve">Proceedings of the IEEE</w:t>
+        <w:t xml:space="preserve">Cell</w:t>
       </w:r>
       <w:r>
         <w:t xml:space="preserve"> </w:t>
@@ -11417,20 +11443,87 @@
           <w:bCs/>
           <w:b/>
         </w:rPr>
-        <w:t xml:space="preserve">104</w:t>
-      </w:r>
-      <w:r>
-        <w:t xml:space="preserve">, 148–175 (2016).</w:t>
+        <w:t xml:space="preserve">184</w:t>
+      </w:r>
+      <w:r>
+        <w:t xml:space="preserve">, 5031–5052 (2021).</w:t>
+      </w:r>
+    </w:p>
+    <w:bookmarkEnd w:id="105"/>
+    <w:bookmarkStart w:id="107" w:name="ref-snoek2012practical"/>
+    <w:p>
+      <w:pPr>
+        <w:pStyle w:val="Bibliography"/>
+      </w:pPr>
+      <w:r>
+        <w:t xml:space="preserve">26.</w:t>
+      </w:r>
+      <w:r>
+        <w:t xml:space="preserve"> </w:t>
+      </w:r>
+      <w:r>
+        <w:t xml:space="preserve">	</w:t>
+      </w:r>
+      <w:r>
+        <w:t xml:space="preserve">Snoek, J., Larochelle, H. &amp; Adams, R. P.</w:t>
+      </w:r>
+      <w:r>
+        <w:t xml:space="preserve"> </w:t>
+      </w:r>
+      <w:hyperlink r:id="rId106">
+        <w:r>
+          <w:rPr>
+            <w:rStyle w:val="Hyperlink"/>
+          </w:rPr>
+          <w:t xml:space="preserve">Practical</w:t>
+        </w:r>
+        <w:r>
+          <w:rPr>
+            <w:rStyle w:val="Hyperlink"/>
+          </w:rPr>
+          <w:t xml:space="preserve"> </w:t>
+        </w:r>
+        <w:r>
+          <w:rPr>
+            <w:rStyle w:val="Hyperlink"/>
+          </w:rPr>
+          <w:t xml:space="preserve">B</w:t>
+        </w:r>
+        <w:r>
+          <w:rPr>
+            <w:rStyle w:val="Hyperlink"/>
+          </w:rPr>
+          <w:t xml:space="preserve">ayesian optimization of machine learning algorithms</w:t>
+        </w:r>
+      </w:hyperlink>
+      <w:r>
+        <w:t xml:space="preserve">. in</w:t>
+      </w:r>
+      <w:r>
+        <w:t xml:space="preserve"> </w:t>
+      </w:r>
+      <w:r>
+        <w:rPr>
+          <w:iCs/>
+          <w:i/>
+        </w:rPr>
+        <w:t xml:space="preserve">Advances in neural information processing systems 25 (NeurIPS 2012)</w:t>
+      </w:r>
+      <w:r>
+        <w:t xml:space="preserve"> </w:t>
+      </w:r>
+      <w:r>
+        <w:t xml:space="preserve">(2012).</w:t>
       </w:r>
     </w:p>
     <w:bookmarkEnd w:id="107"/>
-    <w:bookmarkStart w:id="109" w:name="ref-frigyesi2008nmf"/>
+    <w:bookmarkStart w:id="109" w:name="ref-shahriari2016taking"/>
     <w:p>
       <w:pPr>
         <w:pStyle w:val="Bibliography"/>
       </w:pPr>
       <w:r>
-        <w:t xml:space="preserve">28.</w:t>
+        <w:t xml:space="preserve">27.</w:t>
       </w:r>
       <w:r>
         <w:t xml:space="preserve"> </w:t>
@@ -11439,7 +11532,7 @@
         <w:t xml:space="preserve">	</w:t>
       </w:r>
       <w:r>
-        <w:t xml:space="preserve">Frigyesi, A. &amp; Höglund, M.</w:t>
+        <w:t xml:space="preserve">Shahriari, B., Swersky, K., Wang, Z., Adams, R. P. &amp; Freitas, N. de.</w:t>
       </w:r>
       <w:r>
         <w:t xml:space="preserve"> </w:t>
@@ -11449,7 +11542,25 @@
           <w:rPr>
             <w:rStyle w:val="Hyperlink"/>
           </w:rPr>
-          <w:t xml:space="preserve">Non-negative matrix factorization for the analysis of complex gene expression data: Identification of clinically relevant tumor subtypes</w:t>
+          <w:t xml:space="preserve">Taking the human out of the loop: A review of</w:t>
+        </w:r>
+        <w:r>
+          <w:rPr>
+            <w:rStyle w:val="Hyperlink"/>
+          </w:rPr>
+          <w:t xml:space="preserve"> </w:t>
+        </w:r>
+        <w:r>
+          <w:rPr>
+            <w:rStyle w:val="Hyperlink"/>
+          </w:rPr>
+          <w:t xml:space="preserve">B</w:t>
+        </w:r>
+        <w:r>
+          <w:rPr>
+            <w:rStyle w:val="Hyperlink"/>
+          </w:rPr>
+          <w:t xml:space="preserve">ayesian optimization</w:t>
         </w:r>
       </w:hyperlink>
       <w:r>
@@ -11463,7 +11574,7 @@
           <w:iCs/>
           <w:i/>
         </w:rPr>
-        <w:t xml:space="preserve">Cancer Informatics</w:t>
+        <w:t xml:space="preserve">Proceedings of the IEEE</w:t>
       </w:r>
       <w:r>
         <w:t xml:space="preserve"> </w:t>
@@ -11473,20 +11584,20 @@
           <w:bCs/>
           <w:b/>
         </w:rPr>
-        <w:t xml:space="preserve">6</w:t>
-      </w:r>
-      <w:r>
-        <w:t xml:space="preserve">, 275–292 (2008).</w:t>
+        <w:t xml:space="preserve">104</w:t>
+      </w:r>
+      <w:r>
+        <w:t xml:space="preserve">, 148–175 (2016).</w:t>
       </w:r>
     </w:p>
     <w:bookmarkEnd w:id="109"/>
-    <w:bookmarkStart w:id="111" w:name="ref-leary2023s"/>
+    <w:bookmarkStart w:id="111" w:name="ref-frigyesi2008nmf"/>
     <w:p>
       <w:pPr>
         <w:pStyle w:val="Bibliography"/>
       </w:pPr>
       <w:r>
-        <w:t xml:space="preserve">29.</w:t>
+        <w:t xml:space="preserve">28.</w:t>
       </w:r>
       <w:r>
         <w:t xml:space="preserve"> </w:t>
@@ -11495,17 +11606,7 @@
         <w:t xml:space="preserve">	</w:t>
       </w:r>
       <w:r>
-        <w:t xml:space="preserve">Leary, J. R.</w:t>
-      </w:r>
-      <w:r>
-        <w:t xml:space="preserve"> </w:t>
-      </w:r>
-      <w:r>
-        <w:rPr>
-          <w:iCs/>
-          <w:i/>
-        </w:rPr>
-        <w:t xml:space="preserve">et al.</w:t>
+        <w:t xml:space="preserve">Frigyesi, A. &amp; Höglund, M.</w:t>
       </w:r>
       <w:r>
         <w:t xml:space="preserve"> </w:t>
@@ -11515,37 +11616,7 @@
           <w:rPr>
             <w:rStyle w:val="Hyperlink"/>
           </w:rPr>
-          <w:t xml:space="preserve">Sub-cluster identification through semi-supervised optimization of rare-cell silhouettes (</w:t>
-        </w:r>
-        <w:r>
-          <w:rPr>
-            <w:rStyle w:val="Hyperlink"/>
-          </w:rPr>
-          <w:t xml:space="preserve">SCISSORS</w:t>
-        </w:r>
-        <w:r>
-          <w:rPr>
-            <w:rStyle w:val="Hyperlink"/>
-          </w:rPr>
-          <w:t xml:space="preserve">) in single-cell</w:t>
-        </w:r>
-        <w:r>
-          <w:rPr>
-            <w:rStyle w:val="Hyperlink"/>
-          </w:rPr>
-          <w:t xml:space="preserve"> </w:t>
-        </w:r>
-        <w:r>
-          <w:rPr>
-            <w:rStyle w:val="Hyperlink"/>
-          </w:rPr>
-          <w:t xml:space="preserve">RNA</w:t>
-        </w:r>
-        <w:r>
-          <w:rPr>
-            <w:rStyle w:val="Hyperlink"/>
-          </w:rPr>
-          <w:t xml:space="preserve">-sequencing</w:t>
+          <w:t xml:space="preserve">Non-negative matrix factorization for the analysis of complex gene expression data: Identification of clinically relevant tumor subtypes</w:t>
         </w:r>
       </w:hyperlink>
       <w:r>
@@ -11559,7 +11630,7 @@
           <w:iCs/>
           <w:i/>
         </w:rPr>
-        <w:t xml:space="preserve">Bioinformatics</w:t>
+        <w:t xml:space="preserve">Cancer Informatics</w:t>
       </w:r>
       <w:r>
         <w:t xml:space="preserve"> </w:t>
@@ -11569,20 +11640,20 @@
           <w:bCs/>
           <w:b/>
         </w:rPr>
-        <w:t xml:space="preserve">39</w:t>
-      </w:r>
-      <w:r>
-        <w:t xml:space="preserve">, btad449 (2023).</w:t>
+        <w:t xml:space="preserve">6</w:t>
+      </w:r>
+      <w:r>
+        <w:t xml:space="preserve">, 275–292 (2008).</w:t>
       </w:r>
     </w:p>
     <w:bookmarkEnd w:id="111"/>
-    <w:bookmarkStart w:id="113" w:name="ref-Maurer2019"/>
+    <w:bookmarkStart w:id="113" w:name="ref-leary2023s"/>
     <w:p>
       <w:pPr>
         <w:pStyle w:val="Bibliography"/>
       </w:pPr>
       <w:r>
-        <w:t xml:space="preserve">30.</w:t>
+        <w:t xml:space="preserve">29.</w:t>
       </w:r>
       <w:r>
         <w:t xml:space="preserve"> </w:t>
@@ -11591,7 +11662,7 @@
         <w:t xml:space="preserve">	</w:t>
       </w:r>
       <w:r>
-        <w:t xml:space="preserve">Maurer, C.</w:t>
+        <w:t xml:space="preserve">Leary, J. R.</w:t>
       </w:r>
       <w:r>
         <w:t xml:space="preserve"> </w:t>
@@ -11611,7 +11682,37 @@
           <w:rPr>
             <w:rStyle w:val="Hyperlink"/>
           </w:rPr>
-          <w:t xml:space="preserve">Experimental microdissection enables functional harmonisation of pancreatic cancer subtypes</w:t>
+          <w:t xml:space="preserve">Sub-cluster identification through semi-supervised optimization of rare-cell silhouettes (</w:t>
+        </w:r>
+        <w:r>
+          <w:rPr>
+            <w:rStyle w:val="Hyperlink"/>
+          </w:rPr>
+          <w:t xml:space="preserve">SCISSORS</w:t>
+        </w:r>
+        <w:r>
+          <w:rPr>
+            <w:rStyle w:val="Hyperlink"/>
+          </w:rPr>
+          <w:t xml:space="preserve">) in single-cell</w:t>
+        </w:r>
+        <w:r>
+          <w:rPr>
+            <w:rStyle w:val="Hyperlink"/>
+          </w:rPr>
+          <w:t xml:space="preserve"> </w:t>
+        </w:r>
+        <w:r>
+          <w:rPr>
+            <w:rStyle w:val="Hyperlink"/>
+          </w:rPr>
+          <w:t xml:space="preserve">RNA</w:t>
+        </w:r>
+        <w:r>
+          <w:rPr>
+            <w:rStyle w:val="Hyperlink"/>
+          </w:rPr>
+          <w:t xml:space="preserve">-sequencing</w:t>
         </w:r>
       </w:hyperlink>
       <w:r>
@@ -11625,7 +11726,7 @@
           <w:iCs/>
           <w:i/>
         </w:rPr>
-        <w:t xml:space="preserve">Gut</w:t>
+        <w:t xml:space="preserve">Bioinformatics</w:t>
       </w:r>
       <w:r>
         <w:t xml:space="preserve"> </w:t>
@@ -11635,20 +11736,20 @@
           <w:bCs/>
           <w:b/>
         </w:rPr>
-        <w:t xml:space="preserve">68</w:t>
-      </w:r>
-      <w:r>
-        <w:t xml:space="preserve">, 1034–1043 (2019).</w:t>
+        <w:t xml:space="preserve">39</w:t>
+      </w:r>
+      <w:r>
+        <w:t xml:space="preserve">, btad449 (2023).</w:t>
       </w:r>
     </w:p>
     <w:bookmarkEnd w:id="113"/>
-    <w:bookmarkStart w:id="114" w:name="ref-shapley1953value"/>
+    <w:bookmarkStart w:id="115" w:name="ref-Maurer2019"/>
     <w:p>
       <w:pPr>
         <w:pStyle w:val="Bibliography"/>
       </w:pPr>
       <w:r>
-        <w:t xml:space="preserve">31.</w:t>
+        <w:t xml:space="preserve">30.</w:t>
       </w:r>
       <w:r>
         <w:t xml:space="preserve"> </w:t>
@@ -11657,77 +11758,7 @@
         <w:t xml:space="preserve">	</w:t>
       </w:r>
       <w:r>
-        <w:t xml:space="preserve">Shapley, L. S. A value for n-person games. in</w:t>
-      </w:r>
-      <w:r>
-        <w:t xml:space="preserve"> </w:t>
-      </w:r>
-      <w:r>
-        <w:rPr>
-          <w:iCs/>
-          <w:i/>
-        </w:rPr>
-        <w:t xml:space="preserve">Contributions to the theory of games, volume II</w:t>
-      </w:r>
-      <w:r>
-        <w:t xml:space="preserve"> </w:t>
-      </w:r>
-      <w:r>
-        <w:t xml:space="preserve">(eds. Kuhn, H. W. &amp; Tucker, A. W.) 307–317 (Princeton University Press, 1953).</w:t>
-      </w:r>
-    </w:p>
-    <w:bookmarkEnd w:id="114"/>
-    <w:bookmarkStart w:id="115" w:name="ref-huang2020low"/>
-    <w:p>
-      <w:pPr>
-        <w:pStyle w:val="Bibliography"/>
-      </w:pPr>
-      <w:r>
-        <w:t xml:space="preserve">32.</w:t>
-      </w:r>
-      <w:r>
-        <w:t xml:space="preserve"> </w:t>
-      </w:r>
-      <w:r>
-        <w:t xml:space="preserve">	</w:t>
-      </w:r>
-      <w:r>
-        <w:t xml:space="preserve">Huang, Z., Salama, P., Shao, W., Zhang, J. &amp; Huang, K. Low-rank reorganization via proportional hazards non-negative matrix factorization unveils survival associated gene clusters.</w:t>
-      </w:r>
-      <w:r>
-        <w:t xml:space="preserve"> </w:t>
-      </w:r>
-      <w:r>
-        <w:rPr>
-          <w:iCs/>
-          <w:i/>
-        </w:rPr>
-        <w:t xml:space="preserve">Preprint at https://arxiv.org/abs/2008.03776</w:t>
-      </w:r>
-      <w:r>
-        <w:t xml:space="preserve"> </w:t>
-      </w:r>
-      <w:r>
-        <w:t xml:space="preserve">(2020).</w:t>
-      </w:r>
-    </w:p>
-    <w:bookmarkEnd w:id="115"/>
-    <w:bookmarkStart w:id="116" w:name="ref-le2025survnmf"/>
-    <w:p>
-      <w:pPr>
-        <w:pStyle w:val="Bibliography"/>
-      </w:pPr>
-      <w:r>
-        <w:t xml:space="preserve">33.</w:t>
-      </w:r>
-      <w:r>
-        <w:t xml:space="preserve"> </w:t>
-      </w:r>
-      <w:r>
-        <w:t xml:space="preserve">	</w:t>
-      </w:r>
-      <w:r>
-        <w:t xml:space="preserve">Le Goff, V.</w:t>
+        <w:t xml:space="preserve">Maurer, C.</w:t>
       </w:r>
       <w:r>
         <w:t xml:space="preserve"> </w:t>
@@ -11740,86 +11771,14 @@
         <w:t xml:space="preserve">et al.</w:t>
       </w:r>
       <w:r>
-        <w:t xml:space="preserve"> SurvNMF: Non-negative matrix factorization supervised for survival data analysis.</w:t>
-      </w:r>
-      <w:r>
-        <w:t xml:space="preserve"> </w:t>
-      </w:r>
-      <w:r>
-        <w:rPr>
-          <w:iCs/>
-          <w:i/>
-        </w:rPr>
-        <w:t xml:space="preserve">Preprint at https://hal.science/hal-04975434</w:t>
-      </w:r>
-      <w:r>
-        <w:t xml:space="preserve"> </w:t>
-      </w:r>
-      <w:r>
-        <w:t xml:space="preserve">(2025).</w:t>
-      </w:r>
-    </w:p>
-    <w:bookmarkEnd w:id="116"/>
-    <w:bookmarkStart w:id="118" w:name="ref-zaccaria2023surviae"/>
-    <w:p>
-      <w:pPr>
-        <w:pStyle w:val="Bibliography"/>
-      </w:pPr>
-      <w:r>
-        <w:t xml:space="preserve">34.</w:t>
-      </w:r>
-      <w:r>
-        <w:t xml:space="preserve"> </w:t>
-      </w:r>
-      <w:r>
-        <w:t xml:space="preserve">	</w:t>
-      </w:r>
-      <w:r>
-        <w:t xml:space="preserve">Zaccaria, G. M., Altini, N., Mezzolla, G.,</w:t>
-      </w:r>
-      <w:r>
-        <w:t xml:space="preserve"> </w:t>
-      </w:r>
-      <w:r>
-        <w:rPr>
-          <w:iCs/>
-          <w:i/>
-        </w:rPr>
-        <w:t xml:space="preserve">et al.</w:t>
-      </w:r>
-      <w:r>
-        <w:t xml:space="preserve"> </w:t>
-      </w:r>
-      <w:hyperlink r:id="rId117">
-        <w:r>
-          <w:rPr>
-            <w:rStyle w:val="Hyperlink"/>
-          </w:rPr>
-          <w:t xml:space="preserve">SurvIAE</w:t>
-        </w:r>
-        <w:r>
-          <w:rPr>
-            <w:rStyle w:val="Hyperlink"/>
-          </w:rPr>
-          <w:t xml:space="preserve">: Survival prediction with interpretable autoencoders from diffuse large</w:t>
-        </w:r>
-        <w:r>
-          <w:rPr>
-            <w:rStyle w:val="Hyperlink"/>
-          </w:rPr>
-          <w:t xml:space="preserve"> </w:t>
-        </w:r>
-        <w:r>
-          <w:rPr>
-            <w:rStyle w:val="Hyperlink"/>
-          </w:rPr>
-          <w:t xml:space="preserve">B</w:t>
-        </w:r>
-        <w:r>
-          <w:rPr>
-            <w:rStyle w:val="Hyperlink"/>
-          </w:rPr>
-          <w:t xml:space="preserve">-cell lymphoma gene expression data</w:t>
+        <w:t xml:space="preserve"> </w:t>
+      </w:r>
+      <w:hyperlink r:id="rId114">
+        <w:r>
+          <w:rPr>
+            <w:rStyle w:val="Hyperlink"/>
+          </w:rPr>
+          <w:t xml:space="preserve">Experimental microdissection enables functional harmonisation of pancreatic cancer subtypes</w:t>
         </w:r>
       </w:hyperlink>
       <w:r>
@@ -11833,7 +11792,7 @@
           <w:iCs/>
           <w:i/>
         </w:rPr>
-        <w:t xml:space="preserve">Computer Methods and Programs in Biomedicine</w:t>
+        <w:t xml:space="preserve">Gut</w:t>
       </w:r>
       <w:r>
         <w:t xml:space="preserve"> </w:t>
@@ -11843,20 +11802,138 @@
           <w:bCs/>
           <w:b/>
         </w:rPr>
-        <w:t xml:space="preserve">244</w:t>
-      </w:r>
-      <w:r>
-        <w:t xml:space="preserve">, 107966 (2024).</w:t>
+        <w:t xml:space="preserve">68</w:t>
+      </w:r>
+      <w:r>
+        <w:t xml:space="preserve">, 1034–1043 (2019).</w:t>
+      </w:r>
+    </w:p>
+    <w:bookmarkEnd w:id="115"/>
+    <w:bookmarkStart w:id="116" w:name="ref-shapley1953value"/>
+    <w:p>
+      <w:pPr>
+        <w:pStyle w:val="Bibliography"/>
+      </w:pPr>
+      <w:r>
+        <w:t xml:space="preserve">31.</w:t>
+      </w:r>
+      <w:r>
+        <w:t xml:space="preserve"> </w:t>
+      </w:r>
+      <w:r>
+        <w:t xml:space="preserve">	</w:t>
+      </w:r>
+      <w:r>
+        <w:t xml:space="preserve">Shapley, L. S. A value for n-person games. in</w:t>
+      </w:r>
+      <w:r>
+        <w:t xml:space="preserve"> </w:t>
+      </w:r>
+      <w:r>
+        <w:rPr>
+          <w:iCs/>
+          <w:i/>
+        </w:rPr>
+        <w:t xml:space="preserve">Contributions to the theory of games, volume II</w:t>
+      </w:r>
+      <w:r>
+        <w:t xml:space="preserve"> </w:t>
+      </w:r>
+      <w:r>
+        <w:t xml:space="preserve">(eds. Kuhn, H. W. &amp; Tucker, A. W.) 307–317 (Princeton University Press, 1953).</w:t>
+      </w:r>
+    </w:p>
+    <w:bookmarkEnd w:id="116"/>
+    <w:bookmarkStart w:id="117" w:name="ref-huang2020low"/>
+    <w:p>
+      <w:pPr>
+        <w:pStyle w:val="Bibliography"/>
+      </w:pPr>
+      <w:r>
+        <w:t xml:space="preserve">32.</w:t>
+      </w:r>
+      <w:r>
+        <w:t xml:space="preserve"> </w:t>
+      </w:r>
+      <w:r>
+        <w:t xml:space="preserve">	</w:t>
+      </w:r>
+      <w:r>
+        <w:t xml:space="preserve">Huang, Z., Salama, P., Shao, W., Zhang, J. &amp; Huang, K. Low-rank reorganization via proportional hazards non-negative matrix factorization unveils survival associated gene clusters.</w:t>
+      </w:r>
+      <w:r>
+        <w:t xml:space="preserve"> </w:t>
+      </w:r>
+      <w:r>
+        <w:rPr>
+          <w:iCs/>
+          <w:i/>
+        </w:rPr>
+        <w:t xml:space="preserve">Preprint at https://arxiv.org/abs/2008.03776</w:t>
+      </w:r>
+      <w:r>
+        <w:t xml:space="preserve"> </w:t>
+      </w:r>
+      <w:r>
+        <w:t xml:space="preserve">(2020).</w:t>
+      </w:r>
+    </w:p>
+    <w:bookmarkEnd w:id="117"/>
+    <w:bookmarkStart w:id="118" w:name="ref-le2025survnmf"/>
+    <w:p>
+      <w:pPr>
+        <w:pStyle w:val="Bibliography"/>
+      </w:pPr>
+      <w:r>
+        <w:t xml:space="preserve">33.</w:t>
+      </w:r>
+      <w:r>
+        <w:t xml:space="preserve"> </w:t>
+      </w:r>
+      <w:r>
+        <w:t xml:space="preserve">	</w:t>
+      </w:r>
+      <w:r>
+        <w:t xml:space="preserve">Le Goff, V.</w:t>
+      </w:r>
+      <w:r>
+        <w:t xml:space="preserve"> </w:t>
+      </w:r>
+      <w:r>
+        <w:rPr>
+          <w:iCs/>
+          <w:i/>
+        </w:rPr>
+        <w:t xml:space="preserve">et al.</w:t>
+      </w:r>
+      <w:r>
+        <w:t xml:space="preserve"> SurvNMF: Non-negative matrix factorization supervised for survival data analysis.</w:t>
+      </w:r>
+      <w:r>
+        <w:t xml:space="preserve"> </w:t>
+      </w:r>
+      <w:r>
+        <w:rPr>
+          <w:iCs/>
+          <w:i/>
+        </w:rPr>
+        <w:t xml:space="preserve">Preprint at https://hal.science/hal-04975434</w:t>
+      </w:r>
+      <w:r>
+        <w:t xml:space="preserve"> </w:t>
+      </w:r>
+      <w:r>
+        <w:t xml:space="preserve">(2025).</w:t>
       </w:r>
     </w:p>
     <w:bookmarkEnd w:id="118"/>
-    <w:bookmarkStart w:id="120" w:name="ref-meng2022savae"/>
+    <w:bookmarkStart w:id="120" w:name="ref-zaccaria2023surviae"/>
     <w:p>
       <w:pPr>
         <w:pStyle w:val="Bibliography"/>
       </w:pPr>
       <w:r>
-        <w:t xml:space="preserve">35.</w:t>
+        <w:t xml:space="preserve">34.</w:t>
       </w:r>
       <w:r>
         <w:t xml:space="preserve"> </w:t>
@@ -11865,7 +11942,7 @@
         <w:t xml:space="preserve">	</w:t>
       </w:r>
       <w:r>
-        <w:t xml:space="preserve">Meng, X., Wang, X., Zhang, X.,</w:t>
+        <w:t xml:space="preserve">Zaccaria, G. M., Altini, N., Mezzolla, G.,</w:t>
       </w:r>
       <w:r>
         <w:t xml:space="preserve"> </w:t>
@@ -11885,7 +11962,13 @@
           <w:rPr>
             <w:rStyle w:val="Hyperlink"/>
           </w:rPr>
-          <w:t xml:space="preserve">A novel attention-mechanism based</w:t>
+          <w:t xml:space="preserve">SurvIAE</w:t>
+        </w:r>
+        <w:r>
+          <w:rPr>
+            <w:rStyle w:val="Hyperlink"/>
+          </w:rPr>
+          <w:t xml:space="preserve">: Survival prediction with interpretable autoencoders from diffuse large</w:t>
         </w:r>
         <w:r>
           <w:rPr>
@@ -11897,19 +11980,13 @@
           <w:rPr>
             <w:rStyle w:val="Hyperlink"/>
           </w:rPr>
-          <w:t xml:space="preserve">Cox</w:t>
-        </w:r>
-        <w:r>
-          <w:rPr>
-            <w:rStyle w:val="Hyperlink"/>
-          </w:rPr>
-          <w:t xml:space="preserve"> </w:t>
-        </w:r>
-        <w:r>
-          <w:rPr>
-            <w:rStyle w:val="Hyperlink"/>
-          </w:rPr>
-          <w:t xml:space="preserve">survival model by exploiting pan-cancer empirical genomic information</w:t>
+          <w:t xml:space="preserve">B</w:t>
+        </w:r>
+        <w:r>
+          <w:rPr>
+            <w:rStyle w:val="Hyperlink"/>
+          </w:rPr>
+          <w:t xml:space="preserve">-cell lymphoma gene expression data</w:t>
         </w:r>
       </w:hyperlink>
       <w:r>
@@ -11923,7 +12000,7 @@
           <w:iCs/>
           <w:i/>
         </w:rPr>
-        <w:t xml:space="preserve">Cells</w:t>
+        <w:t xml:space="preserve">Computer Methods and Programs in Biomedicine</w:t>
       </w:r>
       <w:r>
         <w:t xml:space="preserve"> </w:t>
@@ -11933,20 +12010,20 @@
           <w:bCs/>
           <w:b/>
         </w:rPr>
-        <w:t xml:space="preserve">11</w:t>
-      </w:r>
-      <w:r>
-        <w:t xml:space="preserve">, 1421 (2022).</w:t>
+        <w:t xml:space="preserve">244</w:t>
+      </w:r>
+      <w:r>
+        <w:t xml:space="preserve">, 107966 (2024).</w:t>
       </w:r>
     </w:p>
     <w:bookmarkEnd w:id="120"/>
-    <w:bookmarkStart w:id="122" w:name="ref-ogawa2020stroma"/>
+    <w:bookmarkStart w:id="122" w:name="ref-meng2022savae"/>
     <w:p>
       <w:pPr>
         <w:pStyle w:val="Bibliography"/>
       </w:pPr>
       <w:r>
-        <w:t xml:space="preserve">36.</w:t>
+        <w:t xml:space="preserve">35.</w:t>
       </w:r>
       <w:r>
         <w:t xml:space="preserve"> </w:t>
@@ -11955,7 +12032,7 @@
         <w:t xml:space="preserve">	</w:t>
       </w:r>
       <w:r>
-        <w:t xml:space="preserve">Ogawa, Y., Masugi, Y., Abe, T.,</w:t>
+        <w:t xml:space="preserve">Meng, X., Wang, X., Zhang, X.,</w:t>
       </w:r>
       <w:r>
         <w:t xml:space="preserve"> </w:t>
@@ -11975,7 +12052,31 @@
           <w:rPr>
             <w:rStyle w:val="Hyperlink"/>
           </w:rPr>
-          <w:t xml:space="preserve">Three distinct stroma types in human pancreatic cancer identified by image analysis of fibroblast subpopulations and collagen</w:t>
+          <w:t xml:space="preserve">A novel attention-mechanism based</w:t>
+        </w:r>
+        <w:r>
+          <w:rPr>
+            <w:rStyle w:val="Hyperlink"/>
+          </w:rPr>
+          <w:t xml:space="preserve"> </w:t>
+        </w:r>
+        <w:r>
+          <w:rPr>
+            <w:rStyle w:val="Hyperlink"/>
+          </w:rPr>
+          <w:t xml:space="preserve">Cox</w:t>
+        </w:r>
+        <w:r>
+          <w:rPr>
+            <w:rStyle w:val="Hyperlink"/>
+          </w:rPr>
+          <w:t xml:space="preserve"> </w:t>
+        </w:r>
+        <w:r>
+          <w:rPr>
+            <w:rStyle w:val="Hyperlink"/>
+          </w:rPr>
+          <w:t xml:space="preserve">survival model by exploiting pan-cancer empirical genomic information</w:t>
         </w:r>
       </w:hyperlink>
       <w:r>
@@ -11989,7 +12090,7 @@
           <w:iCs/>
           <w:i/>
         </w:rPr>
-        <w:t xml:space="preserve">Clinical Cancer Research</w:t>
+        <w:t xml:space="preserve">Cells</w:t>
       </w:r>
       <w:r>
         <w:t xml:space="preserve"> </w:t>
@@ -11999,20 +12100,20 @@
           <w:bCs/>
           <w:b/>
         </w:rPr>
-        <w:t xml:space="preserve">27</w:t>
-      </w:r>
-      <w:r>
-        <w:t xml:space="preserve">, 107–119 (2021).</w:t>
+        <w:t xml:space="preserve">11</w:t>
+      </w:r>
+      <w:r>
+        <w:t xml:space="preserve">, 1421 (2022).</w:t>
       </w:r>
     </w:p>
     <w:bookmarkEnd w:id="122"/>
-    <w:bookmarkStart w:id="124" w:name="ref-neuzillet2022periostin"/>
+    <w:bookmarkStart w:id="124" w:name="ref-ogawa2020stroma"/>
     <w:p>
       <w:pPr>
         <w:pStyle w:val="Bibliography"/>
       </w:pPr>
       <w:r>
-        <w:t xml:space="preserve">37.</w:t>
+        <w:t xml:space="preserve">36.</w:t>
       </w:r>
       <w:r>
         <w:t xml:space="preserve"> </w:t>
@@ -12021,7 +12122,7 @@
         <w:t xml:space="preserve">	</w:t>
       </w:r>
       <w:r>
-        <w:t xml:space="preserve">Neuzillet, C., Nicolle, R., Raffenne, J.,</w:t>
+        <w:t xml:space="preserve">Ogawa, Y., Masugi, Y., Abe, T.,</w:t>
       </w:r>
       <w:r>
         <w:t xml:space="preserve"> </w:t>
@@ -12041,7 +12142,7 @@
           <w:rPr>
             <w:rStyle w:val="Hyperlink"/>
           </w:rPr>
-          <w:t xml:space="preserve">Periostin- and podoplanin-positive cancer-associated fibroblast subtypes cooperate to shape the inflamed tumor microenvironment in aggressive pancreatic adenocarcinoma</w:t>
+          <w:t xml:space="preserve">Three distinct stroma types in human pancreatic cancer identified by image analysis of fibroblast subpopulations and collagen</w:t>
         </w:r>
       </w:hyperlink>
       <w:r>
@@ -12055,7 +12156,7 @@
           <w:iCs/>
           <w:i/>
         </w:rPr>
-        <w:t xml:space="preserve">The Journal of Pathology</w:t>
+        <w:t xml:space="preserve">Clinical Cancer Research</w:t>
       </w:r>
       <w:r>
         <w:t xml:space="preserve"> </w:t>
@@ -12065,20 +12166,20 @@
           <w:bCs/>
           <w:b/>
         </w:rPr>
-        <w:t xml:space="preserve">258</w:t>
-      </w:r>
-      <w:r>
-        <w:t xml:space="preserve">, 408–425 (2022).</w:t>
+        <w:t xml:space="preserve">27</w:t>
+      </w:r>
+      <w:r>
+        <w:t xml:space="preserve">, 107–119 (2021).</w:t>
       </w:r>
     </w:p>
     <w:bookmarkEnd w:id="124"/>
-    <w:bookmarkStart w:id="126" w:name="ref-lee2024tumorcaf"/>
+    <w:bookmarkStart w:id="126" w:name="ref-neuzillet2022periostin"/>
     <w:p>
       <w:pPr>
         <w:pStyle w:val="Bibliography"/>
       </w:pPr>
       <w:r>
-        <w:t xml:space="preserve">38.</w:t>
+        <w:t xml:space="preserve">37.</w:t>
       </w:r>
       <w:r>
         <w:t xml:space="preserve"> </w:t>
@@ -12087,7 +12188,7 @@
         <w:t xml:space="preserve">	</w:t>
       </w:r>
       <w:r>
-        <w:t xml:space="preserve">Lee, J. J., Kearney, J. F., Trembath, H. E.,</w:t>
+        <w:t xml:space="preserve">Neuzillet, C., Nicolle, R., Raffenne, J.,</w:t>
       </w:r>
       <w:r>
         <w:t xml:space="preserve"> </w:t>
@@ -12107,7 +12208,7 @@
           <w:rPr>
             <w:rStyle w:val="Hyperlink"/>
           </w:rPr>
-          <w:t xml:space="preserve">Tumor-intrinsic and cancer-associated fibroblast subtypes independently predict outcomes in pancreatic cancer</w:t>
+          <w:t xml:space="preserve">Periostin- and podoplanin-positive cancer-associated fibroblast subtypes cooperate to shape the inflamed tumor microenvironment in aggressive pancreatic adenocarcinoma</w:t>
         </w:r>
       </w:hyperlink>
       <w:r>
@@ -12121,7 +12222,7 @@
           <w:iCs/>
           <w:i/>
         </w:rPr>
-        <w:t xml:space="preserve">Annals of Surgery</w:t>
+        <w:t xml:space="preserve">The Journal of Pathology</w:t>
       </w:r>
       <w:r>
         <w:t xml:space="preserve"> </w:t>
@@ -12131,20 +12232,20 @@
           <w:bCs/>
           <w:b/>
         </w:rPr>
-        <w:t xml:space="preserve">280</w:t>
-      </w:r>
-      <w:r>
-        <w:t xml:space="preserve">, 659–666 (2024).</w:t>
+        <w:t xml:space="preserve">258</w:t>
+      </w:r>
+      <w:r>
+        <w:t xml:space="preserve">, 408–425 (2022).</w:t>
       </w:r>
     </w:p>
     <w:bookmarkEnd w:id="126"/>
-    <w:bookmarkStart w:id="128" w:name="ref-newman2019cibersortx"/>
+    <w:bookmarkStart w:id="128" w:name="ref-lee2024tumorcaf"/>
     <w:p>
       <w:pPr>
         <w:pStyle w:val="Bibliography"/>
       </w:pPr>
       <w:r>
-        <w:t xml:space="preserve">39.</w:t>
+        <w:t xml:space="preserve">38.</w:t>
       </w:r>
       <w:r>
         <w:t xml:space="preserve"> </w:t>
@@ -12153,7 +12254,7 @@
         <w:t xml:space="preserve">	</w:t>
       </w:r>
       <w:r>
-        <w:t xml:space="preserve">Newman, A. M., Steen, C. B., Liu, C. L., Gentles, A. J.,</w:t>
+        <w:t xml:space="preserve">Lee, J. J., Kearney, J. F., Trembath, H. E.,</w:t>
       </w:r>
       <w:r>
         <w:t xml:space="preserve"> </w:t>
@@ -12173,7 +12274,7 @@
           <w:rPr>
             <w:rStyle w:val="Hyperlink"/>
           </w:rPr>
-          <w:t xml:space="preserve">Determining cell type abundance and expression from bulk tissues with digital cytometry</w:t>
+          <w:t xml:space="preserve">Tumor-intrinsic and cancer-associated fibroblast subtypes independently predict outcomes in pancreatic cancer</w:t>
         </w:r>
       </w:hyperlink>
       <w:r>
@@ -12187,7 +12288,7 @@
           <w:iCs/>
           <w:i/>
         </w:rPr>
-        <w:t xml:space="preserve">Nature Biotechnology</w:t>
+        <w:t xml:space="preserve">Annals of Surgery</w:t>
       </w:r>
       <w:r>
         <w:t xml:space="preserve"> </w:t>
@@ -12197,20 +12298,20 @@
           <w:bCs/>
           <w:b/>
         </w:rPr>
-        <w:t xml:space="preserve">37</w:t>
-      </w:r>
-      <w:r>
-        <w:t xml:space="preserve">, 773–782 (2019).</w:t>
+        <w:t xml:space="preserve">280</w:t>
+      </w:r>
+      <w:r>
+        <w:t xml:space="preserve">, 659–666 (2024).</w:t>
       </w:r>
     </w:p>
     <w:bookmarkEnd w:id="128"/>
-    <w:bookmarkStart w:id="130" w:name="ref-chu2022bayesprism"/>
+    <w:bookmarkStart w:id="130" w:name="ref-newman2019cibersortx"/>
     <w:p>
       <w:pPr>
         <w:pStyle w:val="Bibliography"/>
       </w:pPr>
       <w:r>
-        <w:t xml:space="preserve">40.</w:t>
+        <w:t xml:space="preserve">39.</w:t>
       </w:r>
       <w:r>
         <w:t xml:space="preserve"> </w:t>
@@ -12219,7 +12320,17 @@
         <w:t xml:space="preserve">	</w:t>
       </w:r>
       <w:r>
-        <w:t xml:space="preserve">Chu, T., Wang, Z., Pe’er, D. &amp; Danko, C. G.</w:t>
+        <w:t xml:space="preserve">Newman, A. M., Steen, C. B., Liu, C. L., Gentles, A. J.,</w:t>
+      </w:r>
+      <w:r>
+        <w:t xml:space="preserve"> </w:t>
+      </w:r>
+      <w:r>
+        <w:rPr>
+          <w:iCs/>
+          <w:i/>
+        </w:rPr>
+        <w:t xml:space="preserve">et al.</w:t>
       </w:r>
       <w:r>
         <w:t xml:space="preserve"> </w:t>
@@ -12229,79 +12340,7 @@
           <w:rPr>
             <w:rStyle w:val="Hyperlink"/>
           </w:rPr>
-          <w:t xml:space="preserve">Cell type and gene expression deconvolution with</w:t>
-        </w:r>
-        <w:r>
-          <w:rPr>
-            <w:rStyle w:val="Hyperlink"/>
-          </w:rPr>
-          <w:t xml:space="preserve"> </w:t>
-        </w:r>
-        <w:r>
-          <w:rPr>
-            <w:rStyle w:val="Hyperlink"/>
-          </w:rPr>
-          <w:t xml:space="preserve">BayesPrism</w:t>
-        </w:r>
-        <w:r>
-          <w:rPr>
-            <w:rStyle w:val="Hyperlink"/>
-          </w:rPr>
-          <w:t xml:space="preserve"> </w:t>
-        </w:r>
-        <w:r>
-          <w:rPr>
-            <w:rStyle w:val="Hyperlink"/>
-          </w:rPr>
-          <w:t xml:space="preserve">enables</w:t>
-        </w:r>
-        <w:r>
-          <w:rPr>
-            <w:rStyle w:val="Hyperlink"/>
-          </w:rPr>
-          <w:t xml:space="preserve"> </w:t>
-        </w:r>
-        <w:r>
-          <w:rPr>
-            <w:rStyle w:val="Hyperlink"/>
-          </w:rPr>
-          <w:t xml:space="preserve">Bayesian</w:t>
-        </w:r>
-        <w:r>
-          <w:rPr>
-            <w:rStyle w:val="Hyperlink"/>
-          </w:rPr>
-          <w:t xml:space="preserve"> </w:t>
-        </w:r>
-        <w:r>
-          <w:rPr>
-            <w:rStyle w:val="Hyperlink"/>
-          </w:rPr>
-          <w:t xml:space="preserve">integrative analysis across bulk and single-cell</w:t>
-        </w:r>
-        <w:r>
-          <w:rPr>
-            <w:rStyle w:val="Hyperlink"/>
-          </w:rPr>
-          <w:t xml:space="preserve"> </w:t>
-        </w:r>
-        <w:r>
-          <w:rPr>
-            <w:rStyle w:val="Hyperlink"/>
-          </w:rPr>
-          <w:t xml:space="preserve">RNA</w:t>
-        </w:r>
-        <w:r>
-          <w:rPr>
-            <w:rStyle w:val="Hyperlink"/>
-          </w:rPr>
-          <w:t xml:space="preserve"> </w:t>
-        </w:r>
-        <w:r>
-          <w:rPr>
-            <w:rStyle w:val="Hyperlink"/>
-          </w:rPr>
-          <w:t xml:space="preserve">sequencing in oncology</w:t>
+          <w:t xml:space="preserve">Determining cell type abundance and expression from bulk tissues with digital cytometry</w:t>
         </w:r>
       </w:hyperlink>
       <w:r>
@@ -12315,7 +12354,7 @@
           <w:iCs/>
           <w:i/>
         </w:rPr>
-        <w:t xml:space="preserve">Nature Cancer</w:t>
+        <w:t xml:space="preserve">Nature Biotechnology</w:t>
       </w:r>
       <w:r>
         <w:t xml:space="preserve"> </w:t>
@@ -12325,20 +12364,20 @@
           <w:bCs/>
           <w:b/>
         </w:rPr>
-        <w:t xml:space="preserve">3</w:t>
-      </w:r>
-      <w:r>
-        <w:t xml:space="preserve">, 505–517 (2022).</w:t>
+        <w:t xml:space="preserve">37</w:t>
+      </w:r>
+      <w:r>
+        <w:t xml:space="preserve">, 773–782 (2019).</w:t>
       </w:r>
     </w:p>
     <w:bookmarkEnd w:id="130"/>
-    <w:bookmarkStart w:id="132" w:name="ref-smith2020standard"/>
+    <w:bookmarkStart w:id="132" w:name="ref-chu2022bayesprism"/>
     <w:p>
       <w:pPr>
         <w:pStyle w:val="Bibliography"/>
       </w:pPr>
       <w:r>
-        <w:t xml:space="preserve">41.</w:t>
+        <w:t xml:space="preserve">40.</w:t>
       </w:r>
       <w:r>
         <w:t xml:space="preserve"> </w:t>
@@ -12347,17 +12386,7 @@
         <w:t xml:space="preserve">	</w:t>
       </w:r>
       <w:r>
-        <w:t xml:space="preserve">Smith, A. M., Walsh, J. R., Long, J.,</w:t>
-      </w:r>
-      <w:r>
-        <w:t xml:space="preserve"> </w:t>
-      </w:r>
-      <w:r>
-        <w:rPr>
-          <w:iCs/>
-          <w:i/>
-        </w:rPr>
-        <w:t xml:space="preserve">et al.</w:t>
+        <w:t xml:space="preserve">Chu, T., Wang, Z., Pe’er, D. &amp; Danko, C. G.</w:t>
       </w:r>
       <w:r>
         <w:t xml:space="preserve"> </w:t>
@@ -12367,7 +12396,79 @@
           <w:rPr>
             <w:rStyle w:val="Hyperlink"/>
           </w:rPr>
-          <w:t xml:space="preserve">Standard machine learning approaches outperform deep representation learning on phenotype prediction from transcriptomics data</w:t>
+          <w:t xml:space="preserve">Cell type and gene expression deconvolution with</w:t>
+        </w:r>
+        <w:r>
+          <w:rPr>
+            <w:rStyle w:val="Hyperlink"/>
+          </w:rPr>
+          <w:t xml:space="preserve"> </w:t>
+        </w:r>
+        <w:r>
+          <w:rPr>
+            <w:rStyle w:val="Hyperlink"/>
+          </w:rPr>
+          <w:t xml:space="preserve">BayesPrism</w:t>
+        </w:r>
+        <w:r>
+          <w:rPr>
+            <w:rStyle w:val="Hyperlink"/>
+          </w:rPr>
+          <w:t xml:space="preserve"> </w:t>
+        </w:r>
+        <w:r>
+          <w:rPr>
+            <w:rStyle w:val="Hyperlink"/>
+          </w:rPr>
+          <w:t xml:space="preserve">enables</w:t>
+        </w:r>
+        <w:r>
+          <w:rPr>
+            <w:rStyle w:val="Hyperlink"/>
+          </w:rPr>
+          <w:t xml:space="preserve"> </w:t>
+        </w:r>
+        <w:r>
+          <w:rPr>
+            <w:rStyle w:val="Hyperlink"/>
+          </w:rPr>
+          <w:t xml:space="preserve">Bayesian</w:t>
+        </w:r>
+        <w:r>
+          <w:rPr>
+            <w:rStyle w:val="Hyperlink"/>
+          </w:rPr>
+          <w:t xml:space="preserve"> </w:t>
+        </w:r>
+        <w:r>
+          <w:rPr>
+            <w:rStyle w:val="Hyperlink"/>
+          </w:rPr>
+          <w:t xml:space="preserve">integrative analysis across bulk and single-cell</w:t>
+        </w:r>
+        <w:r>
+          <w:rPr>
+            <w:rStyle w:val="Hyperlink"/>
+          </w:rPr>
+          <w:t xml:space="preserve"> </w:t>
+        </w:r>
+        <w:r>
+          <w:rPr>
+            <w:rStyle w:val="Hyperlink"/>
+          </w:rPr>
+          <w:t xml:space="preserve">RNA</w:t>
+        </w:r>
+        <w:r>
+          <w:rPr>
+            <w:rStyle w:val="Hyperlink"/>
+          </w:rPr>
+          <w:t xml:space="preserve"> </w:t>
+        </w:r>
+        <w:r>
+          <w:rPr>
+            <w:rStyle w:val="Hyperlink"/>
+          </w:rPr>
+          <w:t xml:space="preserve">sequencing in oncology</w:t>
         </w:r>
       </w:hyperlink>
       <w:r>
@@ -12381,7 +12482,7 @@
           <w:iCs/>
           <w:i/>
         </w:rPr>
-        <w:t xml:space="preserve">BMC Bioinformatics</w:t>
+        <w:t xml:space="preserve">Nature Cancer</w:t>
       </w:r>
       <w:r>
         <w:t xml:space="preserve"> </w:t>
@@ -12391,20 +12492,20 @@
           <w:bCs/>
           <w:b/>
         </w:rPr>
-        <w:t xml:space="preserve">21</w:t>
-      </w:r>
-      <w:r>
-        <w:t xml:space="preserve">, 119 (2020).</w:t>
+        <w:t xml:space="preserve">3</w:t>
+      </w:r>
+      <w:r>
+        <w:t xml:space="preserve">, 505–517 (2022).</w:t>
       </w:r>
     </w:p>
     <w:bookmarkEnd w:id="132"/>
-    <w:bookmarkStart w:id="134" w:name="ref-gaujoux2010flexible"/>
+    <w:bookmarkStart w:id="134" w:name="ref-smith2020standard"/>
     <w:p>
       <w:pPr>
         <w:pStyle w:val="Bibliography"/>
       </w:pPr>
       <w:r>
-        <w:t xml:space="preserve">42.</w:t>
+        <w:t xml:space="preserve">41.</w:t>
       </w:r>
       <w:r>
         <w:t xml:space="preserve"> </w:t>
@@ -12413,7 +12514,17 @@
         <w:t xml:space="preserve">	</w:t>
       </w:r>
       <w:r>
-        <w:t xml:space="preserve">Gaujoux, R. &amp; Seoighe, C.</w:t>
+        <w:t xml:space="preserve">Smith, A. M., Walsh, J. R., Long, J.,</w:t>
+      </w:r>
+      <w:r>
+        <w:t xml:space="preserve"> </w:t>
+      </w:r>
+      <w:r>
+        <w:rPr>
+          <w:iCs/>
+          <w:i/>
+        </w:rPr>
+        <w:t xml:space="preserve">et al.</w:t>
       </w:r>
       <w:r>
         <w:t xml:space="preserve"> </w:t>
@@ -12423,7 +12534,7 @@
           <w:rPr>
             <w:rStyle w:val="Hyperlink"/>
           </w:rPr>
-          <w:t xml:space="preserve">A flexible r package for nonnegative matrix factorization</w:t>
+          <w:t xml:space="preserve">Standard machine learning approaches outperform deep representation learning on phenotype prediction from transcriptomics data</w:t>
         </w:r>
       </w:hyperlink>
       <w:r>
@@ -12447,14 +12558,70 @@
           <w:bCs/>
           <w:b/>
         </w:rPr>
+        <w:t xml:space="preserve">21</w:t>
+      </w:r>
+      <w:r>
+        <w:t xml:space="preserve">, 119 (2020).</w:t>
+      </w:r>
+    </w:p>
+    <w:bookmarkEnd w:id="134"/>
+    <w:bookmarkStart w:id="136" w:name="ref-gaujoux2010flexible"/>
+    <w:p>
+      <w:pPr>
+        <w:pStyle w:val="Bibliography"/>
+      </w:pPr>
+      <w:r>
+        <w:t xml:space="preserve">42.</w:t>
+      </w:r>
+      <w:r>
+        <w:t xml:space="preserve"> </w:t>
+      </w:r>
+      <w:r>
+        <w:t xml:space="preserve">	</w:t>
+      </w:r>
+      <w:r>
+        <w:t xml:space="preserve">Gaujoux, R. &amp; Seoighe, C.</w:t>
+      </w:r>
+      <w:r>
+        <w:t xml:space="preserve"> </w:t>
+      </w:r>
+      <w:hyperlink r:id="rId135">
+        <w:r>
+          <w:rPr>
+            <w:rStyle w:val="Hyperlink"/>
+          </w:rPr>
+          <w:t xml:space="preserve">A flexible r package for nonnegative matrix factorization</w:t>
+        </w:r>
+      </w:hyperlink>
+      <w:r>
+        <w:t xml:space="preserve">.</w:t>
+      </w:r>
+      <w:r>
+        <w:t xml:space="preserve"> </w:t>
+      </w:r>
+      <w:r>
+        <w:rPr>
+          <w:iCs/>
+          <w:i/>
+        </w:rPr>
+        <w:t xml:space="preserve">BMC Bioinformatics</w:t>
+      </w:r>
+      <w:r>
+        <w:t xml:space="preserve"> </w:t>
+      </w:r>
+      <w:r>
+        <w:rPr>
+          <w:bCs/>
+          <w:b/>
+        </w:rPr>
         <w:t xml:space="preserve">11</w:t>
       </w:r>
       <w:r>
         <w:t xml:space="preserve">, 367 (2010).</w:t>
       </w:r>
     </w:p>
-    <w:bookmarkEnd w:id="134"/>
-    <w:bookmarkStart w:id="136" w:name="ref-data_tcga_paad"/>
+    <w:bookmarkEnd w:id="136"/>
+    <w:bookmarkStart w:id="138" w:name="ref-data_tcga_paad"/>
     <w:p>
       <w:pPr>
         <w:pStyle w:val="Bibliography"/>
@@ -12474,7 +12641,7 @@
       <w:r>
         <w:t xml:space="preserve"> </w:t>
       </w:r>
-      <w:hyperlink r:id="rId135">
+      <w:hyperlink r:id="rId137">
         <w:r>
           <w:rPr>
             <w:rStyle w:val="Hyperlink"/>
@@ -12510,8 +12677,8 @@
         <w:t xml:space="preserve">. (2017).</w:t>
       </w:r>
     </w:p>
-    <w:bookmarkEnd w:id="136"/>
-    <w:bookmarkStart w:id="138" w:name="ref-data_cptac3"/>
+    <w:bookmarkEnd w:id="138"/>
+    <w:bookmarkStart w:id="140" w:name="ref-data_cptac3"/>
     <w:p>
       <w:pPr>
         <w:pStyle w:val="Bibliography"/>
@@ -12531,7 +12698,7 @@
       <w:r>
         <w:t xml:space="preserve"> </w:t>
       </w:r>
-      <w:hyperlink r:id="rId137">
+      <w:hyperlink r:id="rId139">
         <w:r>
           <w:rPr>
             <w:rStyle w:val="Hyperlink"/>
@@ -12543,8 +12710,8 @@
         <w:t xml:space="preserve">. (2019).</w:t>
       </w:r>
     </w:p>
-    <w:bookmarkEnd w:id="138"/>
-    <w:bookmarkStart w:id="140" w:name="ref-data_dijk_emtab6830"/>
+    <w:bookmarkEnd w:id="140"/>
+    <w:bookmarkStart w:id="142" w:name="ref-data_dijk_emtab6830"/>
     <w:p>
       <w:pPr>
         <w:pStyle w:val="Bibliography"/>
@@ -12574,7 +12741,7 @@
       <w:r>
         <w:t xml:space="preserve"> </w:t>
       </w:r>
-      <w:hyperlink r:id="rId139">
+      <w:hyperlink r:id="rId141">
         <w:r>
           <w:rPr>
             <w:rStyle w:val="Hyperlink"/>
@@ -12598,8 +12765,8 @@
         <w:t xml:space="preserve">. (2020).</w:t>
       </w:r>
     </w:p>
-    <w:bookmarkEnd w:id="140"/>
-    <w:bookmarkStart w:id="142" w:name="ref-data_puleo_emtab6134"/>
+    <w:bookmarkEnd w:id="142"/>
+    <w:bookmarkStart w:id="144" w:name="ref-data_puleo_emtab6134"/>
     <w:p>
       <w:pPr>
         <w:pStyle w:val="Bibliography"/>
@@ -12629,7 +12796,7 @@
       <w:r>
         <w:t xml:space="preserve"> </w:t>
       </w:r>
-      <w:hyperlink r:id="rId141">
+      <w:hyperlink r:id="rId143">
         <w:r>
           <w:rPr>
             <w:rStyle w:val="Hyperlink"/>
@@ -12653,8 +12820,8 @@
         <w:t xml:space="preserve">. (2018).</w:t>
       </w:r>
     </w:p>
-    <w:bookmarkEnd w:id="142"/>
-    <w:bookmarkStart w:id="144" w:name="ref-data_moffitt_gse71729"/>
+    <w:bookmarkEnd w:id="144"/>
+    <w:bookmarkStart w:id="146" w:name="ref-data_moffitt_gse71729"/>
     <w:p>
       <w:pPr>
         <w:pStyle w:val="Bibliography"/>
@@ -12684,7 +12851,7 @@
       <w:r>
         <w:t xml:space="preserve"> </w:t>
       </w:r>
-      <w:hyperlink r:id="rId143">
+      <w:hyperlink r:id="rId145">
         <w:r>
           <w:rPr>
             <w:rStyle w:val="Hyperlink"/>
@@ -12708,8 +12875,8 @@
         <w:t xml:space="preserve">. (2015).</w:t>
       </w:r>
     </w:p>
-    <w:bookmarkEnd w:id="144"/>
-    <w:bookmarkStart w:id="146" w:name="ref-data_paca_au_egas"/>
+    <w:bookmarkEnd w:id="146"/>
+    <w:bookmarkStart w:id="148" w:name="ref-data_paca_au_egas"/>
     <w:p>
       <w:pPr>
         <w:pStyle w:val="Bibliography"/>
@@ -12729,7 +12896,7 @@
       <w:r>
         <w:t xml:space="preserve"> </w:t>
       </w:r>
-      <w:hyperlink r:id="rId145">
+      <w:hyperlink r:id="rId147">
         <w:r>
           <w:rPr>
             <w:rStyle w:val="Hyperlink"/>
@@ -12741,9 +12908,9 @@
         <w:t xml:space="preserve">. (2016).</w:t>
       </w:r>
     </w:p>
-    <w:bookmarkEnd w:id="146"/>
-    <w:bookmarkEnd w:id="147"/>
     <w:bookmarkEnd w:id="148"/>
+    <w:bookmarkEnd w:id="149"/>
+    <w:bookmarkEnd w:id="150"/>
     <w:sectPr/>
   </w:body>
 </w:document>

</xml_diff>

<commit_message>
Regenerate tracked DOCX exports at the freeze
Co-Authored-By: Claude Fable 5.1 <noreply@anthropic.com>
Claude-Session: https://claude.ai/code/session_01DM2PQPFgP8hwwDvWbvdo4R
</commit_message>
<xml_diff>
--- a/paper/paper.docx
+++ b/paper/paper.docx
@@ -31,7 +31,13 @@
         <w:t xml:space="preserve"> </w:t>
       </w:r>
       <w:r>
-        <w:t xml:space="preserve">factorization,</w:t>
+        <w:t xml:space="preserve">factorization</w:t>
+      </w:r>
+      <w:r>
+        <w:t xml:space="preserve"> </w:t>
+      </w:r>
+      <w:r>
+        <w:t xml:space="preserve">framework,</w:t>
       </w:r>
       <w:r>
         <w:t xml:space="preserve"> </w:t>
@@ -161,7 +167,7 @@
         <w:t xml:space="preserve"> </w:t>
       </w:r>
       <w:r>
-        <w:t xml:space="preserve">but</w:t>
+        <w:t xml:space="preserve">yet</w:t>
       </w:r>
       <w:r>
         <w:t xml:space="preserve"> </w:t>
@@ -203,19 +209,193 @@
         <w:t xml:space="preserve"> </w:t>
       </w:r>
       <w:r>
+        <w:t xml:space="preserve">patient</w:t>
+      </w:r>
+      <w:r>
+        <w:t xml:space="preserve"> </w:t>
+      </w:r>
+      <w:r>
+        <w:t xml:space="preserve">outcomes.</w:t>
+      </w:r>
+      <w:r>
+        <w:t xml:space="preserve"> </w:t>
+      </w:r>
+      <w:r>
+        <w:t xml:space="preserve">Consequently,</w:t>
+      </w:r>
+      <w:r>
+        <w:t xml:space="preserve"> </w:t>
+      </w:r>
+      <w:r>
+        <w:t xml:space="preserve">the</w:t>
+      </w:r>
+      <w:r>
+        <w:t xml:space="preserve"> </w:t>
+      </w:r>
+      <w:r>
+        <w:t xml:space="preserve">programs</w:t>
+      </w:r>
+      <w:r>
+        <w:t xml:space="preserve"> </w:t>
+      </w:r>
+      <w:r>
+        <w:t xml:space="preserve">explaining</w:t>
+      </w:r>
+      <w:r>
+        <w:t xml:space="preserve"> </w:t>
+      </w:r>
+      <w:r>
+        <w:t xml:space="preserve">most</w:t>
+      </w:r>
+      <w:r>
+        <w:t xml:space="preserve"> </w:t>
+      </w:r>
+      <w:r>
+        <w:t xml:space="preserve">expression</w:t>
+      </w:r>
+      <w:r>
+        <w:t xml:space="preserve"> </w:t>
+      </w:r>
+      <w:r>
+        <w:t xml:space="preserve">variation</w:t>
+      </w:r>
+      <w:r>
+        <w:t xml:space="preserve"> </w:t>
+      </w:r>
+      <w:r>
+        <w:t xml:space="preserve">need</w:t>
+      </w:r>
+      <w:r>
+        <w:t xml:space="preserve"> </w:t>
+      </w:r>
+      <w:r>
+        <w:t xml:space="preserve">not</w:t>
+      </w:r>
+      <w:r>
+        <w:t xml:space="preserve"> </w:t>
+      </w:r>
+      <w:r>
+        <w:t xml:space="preserve">be</w:t>
+      </w:r>
+      <w:r>
+        <w:t xml:space="preserve"> </w:t>
+      </w:r>
+      <w:r>
+        <w:t xml:space="preserve">the</w:t>
+      </w:r>
+      <w:r>
+        <w:t xml:space="preserve"> </w:t>
+      </w:r>
+      <w:r>
+        <w:t xml:space="preserve">most</w:t>
+      </w:r>
+      <w:r>
+        <w:t xml:space="preserve"> </w:t>
+      </w:r>
+      <w:r>
+        <w:t xml:space="preserve">relevant</w:t>
+      </w:r>
+      <w:r>
+        <w:t xml:space="preserve"> </w:t>
+      </w:r>
+      <w:r>
+        <w:t xml:space="preserve">to</w:t>
+      </w:r>
+      <w:r>
+        <w:t xml:space="preserve"> </w:t>
+      </w:r>
+      <w:r>
+        <w:t xml:space="preserve">survival.</w:t>
+      </w:r>
+      <w:r>
+        <w:t xml:space="preserve"> </w:t>
+      </w:r>
+      <w:r>
+        <w:t xml:space="preserve">We</w:t>
+      </w:r>
+      <w:r>
+        <w:t xml:space="preserve"> </w:t>
+      </w:r>
+      <w:r>
+        <w:t xml:space="preserve">developed</w:t>
+      </w:r>
+      <w:r>
+        <w:t xml:space="preserve"> </w:t>
+      </w:r>
+      <w:r>
+        <w:t xml:space="preserve">DeSurv,</w:t>
+      </w:r>
+      <w:r>
+        <w:t xml:space="preserve"> </w:t>
+      </w:r>
+      <w:r>
+        <w:t xml:space="preserve">a</w:t>
+      </w:r>
+      <w:r>
+        <w:t xml:space="preserve"> </w:t>
+      </w:r>
+      <w:r>
+        <w:t xml:space="preserve">survival-supervised</w:t>
+      </w:r>
+      <w:r>
+        <w:t xml:space="preserve"> </w:t>
+      </w:r>
+      <w:r>
+        <w:t xml:space="preserve">matrix</w:t>
+      </w:r>
+      <w:r>
+        <w:t xml:space="preserve"> </w:t>
+      </w:r>
+      <w:r>
+        <w:t xml:space="preserve">factorization</w:t>
+      </w:r>
+      <w:r>
+        <w:t xml:space="preserve"> </w:t>
+      </w:r>
+      <w:r>
+        <w:t xml:space="preserve">that</w:t>
+      </w:r>
+      <w:r>
+        <w:t xml:space="preserve"> </w:t>
+      </w:r>
+      <w:r>
+        <w:t xml:space="preserve">incorporates</w:t>
+      </w:r>
+      <w:r>
+        <w:t xml:space="preserve"> </w:t>
+      </w:r>
+      <w:r>
         <w:t xml:space="preserve">outcome</w:t>
       </w:r>
       <w:r>
         <w:t xml:space="preserve"> </w:t>
       </w:r>
       <w:r>
-        <w:t xml:space="preserve">information,</w:t>
-      </w:r>
-      <w:r>
-        <w:t xml:space="preserve"> </w:t>
-      </w:r>
-      <w:r>
-        <w:t xml:space="preserve">so</w:t>
+        <w:t xml:space="preserve">into</w:t>
+      </w:r>
+      <w:r>
+        <w:t xml:space="preserve"> </w:t>
+      </w:r>
+      <w:r>
+        <w:t xml:space="preserve">gene-program</w:t>
+      </w:r>
+      <w:r>
+        <w:t xml:space="preserve"> </w:t>
+      </w:r>
+      <w:r>
+        <w:t xml:space="preserve">estimation</w:t>
+      </w:r>
+      <w:r>
+        <w:t xml:space="preserve"> </w:t>
+      </w:r>
+      <w:r>
+        <w:t xml:space="preserve">and</w:t>
+      </w:r>
+      <w:r>
+        <w:t xml:space="preserve"> </w:t>
+      </w:r>
+      <w:r>
+        <w:t xml:space="preserve">fixes</w:t>
       </w:r>
       <w:r>
         <w:t xml:space="preserve"> </w:t>
@@ -227,31 +407,415 @@
         <w:t xml:space="preserve"> </w:t>
       </w:r>
       <w:r>
-        <w:t xml:space="preserve">programs</w:t>
-      </w:r>
-      <w:r>
-        <w:t xml:space="preserve"> </w:t>
-      </w:r>
-      <w:r>
-        <w:t xml:space="preserve">dominating</w:t>
-      </w:r>
-      <w:r>
-        <w:t xml:space="preserve"> </w:t>
-      </w:r>
-      <w:r>
-        <w:t xml:space="preserve">expression</w:t>
-      </w:r>
-      <w:r>
-        <w:t xml:space="preserve"> </w:t>
-      </w:r>
-      <w:r>
-        <w:t xml:space="preserve">variation</w:t>
-      </w:r>
-      <w:r>
-        <w:t xml:space="preserve"> </w:t>
-      </w:r>
-      <w:r>
-        <w:t xml:space="preserve">need</w:t>
+        <w:t xml:space="preserve">gene</w:t>
+      </w:r>
+      <w:r>
+        <w:t xml:space="preserve"> </w:t>
+      </w:r>
+      <w:r>
+        <w:t xml:space="preserve">weights</w:t>
+      </w:r>
+      <w:r>
+        <w:t xml:space="preserve"> </w:t>
+      </w:r>
+      <w:r>
+        <w:t xml:space="preserve">for</w:t>
+      </w:r>
+      <w:r>
+        <w:t xml:space="preserve"> </w:t>
+      </w:r>
+      <w:r>
+        <w:t xml:space="preserve">scoring</w:t>
+      </w:r>
+      <w:r>
+        <w:t xml:space="preserve"> </w:t>
+      </w:r>
+      <w:r>
+        <w:t xml:space="preserve">new</w:t>
+      </w:r>
+      <w:r>
+        <w:t xml:space="preserve"> </w:t>
+      </w:r>
+      <w:r>
+        <w:t xml:space="preserve">cohorts.</w:t>
+      </w:r>
+      <w:r>
+        <w:t xml:space="preserve"> </w:t>
+      </w:r>
+      <w:r>
+        <w:t xml:space="preserve">In</w:t>
+      </w:r>
+      <w:r>
+        <w:t xml:space="preserve"> </w:t>
+      </w:r>
+      <w:r>
+        <w:t xml:space="preserve">pooled</w:t>
+      </w:r>
+      <w:r>
+        <w:t xml:space="preserve"> </w:t>
+      </w:r>
+      <w:r>
+        <w:t xml:space="preserve">TCGA</w:t>
+      </w:r>
+      <w:r>
+        <w:t xml:space="preserve"> </w:t>
+      </w:r>
+      <w:r>
+        <w:t xml:space="preserve">and</w:t>
+      </w:r>
+      <w:r>
+        <w:t xml:space="preserve"> </w:t>
+      </w:r>
+      <w:r>
+        <w:t xml:space="preserve">CPTAC</w:t>
+      </w:r>
+      <w:r>
+        <w:t xml:space="preserve"> </w:t>
+      </w:r>
+      <w:r>
+        <w:t xml:space="preserve">cohorts,</w:t>
+      </w:r>
+      <w:r>
+        <w:t xml:space="preserve"> </w:t>
+      </w:r>
+      <w:r>
+        <w:t xml:space="preserve">DeSurv</w:t>
+      </w:r>
+      <w:r>
+        <w:t xml:space="preserve"> </w:t>
+      </w:r>
+      <w:r>
+        <w:t xml:space="preserve">recovered</w:t>
+      </w:r>
+      <w:r>
+        <w:t xml:space="preserve"> </w:t>
+      </w:r>
+      <w:r>
+        <w:t xml:space="preserve">a</w:t>
+      </w:r>
+      <w:r>
+        <w:t xml:space="preserve"> </w:t>
+      </w:r>
+      <w:r>
+        <w:t xml:space="preserve">three-program</w:t>
+      </w:r>
+      <w:r>
+        <w:t xml:space="preserve"> </w:t>
+      </w:r>
+      <w:r>
+        <w:t xml:space="preserve">tumor–stroma</w:t>
+      </w:r>
+      <w:r>
+        <w:t xml:space="preserve"> </w:t>
+      </w:r>
+      <w:r>
+        <w:t xml:space="preserve">architecture</w:t>
+      </w:r>
+      <w:r>
+        <w:t xml:space="preserve"> </w:t>
+      </w:r>
+      <w:r>
+        <w:t xml:space="preserve">whose</w:t>
+      </w:r>
+      <w:r>
+        <w:t xml:space="preserve"> </w:t>
+      </w:r>
+      <w:r>
+        <w:t xml:space="preserve">dominant</w:t>
+      </w:r>
+      <w:r>
+        <w:t xml:space="preserve"> </w:t>
+      </w:r>
+      <w:r>
+        <w:t xml:space="preserve">survival-aligned</w:t>
+      </w:r>
+      <w:r>
+        <w:t xml:space="preserve"> </w:t>
+      </w:r>
+      <w:r>
+        <w:t xml:space="preserve">direction</w:t>
+      </w:r>
+      <w:r>
+        <w:t xml:space="preserve"> </w:t>
+      </w:r>
+      <w:r>
+        <w:t xml:space="preserve">(D1)</w:t>
+      </w:r>
+      <w:r>
+        <w:t xml:space="preserve"> </w:t>
+      </w:r>
+      <w:r>
+        <w:t xml:space="preserve">linked</w:t>
+      </w:r>
+      <w:r>
+        <w:t xml:space="preserve"> </w:t>
+      </w:r>
+      <w:r>
+        <w:t xml:space="preserve">classical</w:t>
+      </w:r>
+      <w:r>
+        <w:t xml:space="preserve"> </w:t>
+      </w:r>
+      <w:r>
+        <w:t xml:space="preserve">tumor</w:t>
+      </w:r>
+      <w:r>
+        <w:t xml:space="preserve"> </w:t>
+      </w:r>
+      <w:r>
+        <w:t xml:space="preserve">identity</w:t>
+      </w:r>
+      <w:r>
+        <w:t xml:space="preserve"> </w:t>
+      </w:r>
+      <w:r>
+        <w:t xml:space="preserve">with</w:t>
+      </w:r>
+      <w:r>
+        <w:t xml:space="preserve"> </w:t>
+      </w:r>
+      <w:r>
+        <w:t xml:space="preserve">restCAF-like</w:t>
+      </w:r>
+      <w:r>
+        <w:t xml:space="preserve"> </w:t>
+      </w:r>
+      <w:r>
+        <w:t xml:space="preserve">stroma.</w:t>
+      </w:r>
+      <w:r>
+        <w:t xml:space="preserve"> </w:t>
+      </w:r>
+      <w:r>
+        <w:t xml:space="preserve">Applied</w:t>
+      </w:r>
+      <w:r>
+        <w:t xml:space="preserve"> </w:t>
+      </w:r>
+      <w:r>
+        <w:t xml:space="preserve">without</w:t>
+      </w:r>
+      <w:r>
+        <w:t xml:space="preserve"> </w:t>
+      </w:r>
+      <w:r>
+        <w:t xml:space="preserve">refitting</w:t>
+      </w:r>
+      <w:r>
+        <w:t xml:space="preserve"> </w:t>
+      </w:r>
+      <w:r>
+        <w:t xml:space="preserve">to</w:t>
+      </w:r>
+      <w:r>
+        <w:t xml:space="preserve"> </w:t>
+      </w:r>
+      <w:r>
+        <w:t xml:space="preserve">five</w:t>
+      </w:r>
+      <w:r>
+        <w:t xml:space="preserve"> </w:t>
+      </w:r>
+      <w:r>
+        <w:t xml:space="preserve">external</w:t>
+      </w:r>
+      <w:r>
+        <w:t xml:space="preserve"> </w:t>
+      </w:r>
+      <w:r>
+        <w:t xml:space="preserve">datasets</w:t>
+      </w:r>
+      <w:r>
+        <w:t xml:space="preserve"> </w:t>
+      </w:r>
+      <w:r>
+        <w:t xml:space="preserve">spanning</w:t>
+      </w:r>
+      <w:r>
+        <w:t xml:space="preserve"> </w:t>
+      </w:r>
+      <w:r>
+        <w:t xml:space="preserve">four</w:t>
+      </w:r>
+      <w:r>
+        <w:t xml:space="preserve"> </w:t>
+      </w:r>
+      <w:r>
+        <w:t xml:space="preserve">independent</w:t>
+      </w:r>
+      <w:r>
+        <w:t xml:space="preserve"> </w:t>
+      </w:r>
+      <w:r>
+        <w:t xml:space="preserve">cohorts,</w:t>
+      </w:r>
+      <w:r>
+        <w:t xml:space="preserve"> </w:t>
+      </w:r>
+      <w:r>
+        <w:t xml:space="preserve">the</w:t>
+      </w:r>
+      <w:r>
+        <w:t xml:space="preserve"> </w:t>
+      </w:r>
+      <w:r>
+        <w:t xml:space="preserve">frozen</w:t>
+      </w:r>
+      <w:r>
+        <w:t xml:space="preserve"> </w:t>
+      </w:r>
+      <w:r>
+        <w:t xml:space="preserve">representation</w:t>
+      </w:r>
+      <w:r>
+        <w:t xml:space="preserve"> </w:t>
+      </w:r>
+      <w:r>
+        <w:t xml:space="preserve">remained</w:t>
+      </w:r>
+      <w:r>
+        <w:t xml:space="preserve"> </w:t>
+      </w:r>
+      <w:r>
+        <w:t xml:space="preserve">prognostic</w:t>
+      </w:r>
+      <w:r>
+        <w:t xml:space="preserve"> </w:t>
+      </w:r>
+      <w:r>
+        <w:t xml:space="preserve">(HR</w:t>
+      </w:r>
+      <w:r>
+        <w:t xml:space="preserve"> </w:t>
+      </w:r>
+      <w:r>
+        <w:t xml:space="preserve">per</w:t>
+      </w:r>
+      <w:r>
+        <w:t xml:space="preserve"> </w:t>
+      </w:r>
+      <w:r>
+        <w:t xml:space="preserve">SD,</w:t>
+      </w:r>
+      <w:r>
+        <w:t xml:space="preserve"> </w:t>
+      </w:r>
+      <w:r>
+        <w:t xml:space="preserve">1.42;</w:t>
+      </w:r>
+      <w:r>
+        <w:t xml:space="preserve"> </w:t>
+      </w:r>
+      <w:r>
+        <w:t xml:space="preserve">95%</w:t>
+      </w:r>
+      <w:r>
+        <w:t xml:space="preserve"> </w:t>
+      </w:r>
+      <w:r>
+        <w:t xml:space="preserve">CI,</w:t>
+      </w:r>
+      <w:r>
+        <w:t xml:space="preserve"> </w:t>
+      </w:r>
+      <w:r>
+        <w:t xml:space="preserve">1.26–1.59),</w:t>
+      </w:r>
+      <w:r>
+        <w:t xml:space="preserve"> </w:t>
+      </w:r>
+      <w:r>
+        <w:t xml:space="preserve">including</w:t>
+      </w:r>
+      <w:r>
+        <w:t xml:space="preserve"> </w:t>
+      </w:r>
+      <w:r>
+        <w:t xml:space="preserve">after</w:t>
+      </w:r>
+      <w:r>
+        <w:t xml:space="preserve"> </w:t>
+      </w:r>
+      <w:r>
+        <w:t xml:space="preserve">PurIST</w:t>
+      </w:r>
+      <w:r>
+        <w:t xml:space="preserve"> </w:t>
+      </w:r>
+      <w:r>
+        <w:t xml:space="preserve">and</w:t>
+      </w:r>
+      <w:r>
+        <w:t xml:space="preserve"> </w:t>
+      </w:r>
+      <w:r>
+        <w:t xml:space="preserve">DeCAF</w:t>
+      </w:r>
+      <w:r>
+        <w:t xml:space="preserve"> </w:t>
+      </w:r>
+      <w:r>
+        <w:t xml:space="preserve">adjustment.</w:t>
+      </w:r>
+      <w:r>
+        <w:t xml:space="preserve"> </w:t>
+      </w:r>
+      <w:r>
+        <w:t xml:space="preserve">Unsupervised</w:t>
+      </w:r>
+      <w:r>
+        <w:t xml:space="preserve"> </w:t>
+      </w:r>
+      <w:r>
+        <w:t xml:space="preserve">factorization</w:t>
+      </w:r>
+      <w:r>
+        <w:t xml:space="preserve"> </w:t>
+      </w:r>
+      <w:r>
+        <w:t xml:space="preserve">matched</w:t>
+      </w:r>
+      <w:r>
+        <w:t xml:space="preserve"> </w:t>
+      </w:r>
+      <w:r>
+        <w:t xml:space="preserve">on</w:t>
+      </w:r>
+      <w:r>
+        <w:t xml:space="preserve"> </w:t>
+      </w:r>
+      <w:r>
+        <w:t xml:space="preserve">program</w:t>
+      </w:r>
+      <w:r>
+        <w:t xml:space="preserve"> </w:t>
+      </w:r>
+      <w:r>
+        <w:t xml:space="preserve">number</w:t>
+      </w:r>
+      <w:r>
+        <w:t xml:space="preserve"> </w:t>
+      </w:r>
+      <w:r>
+        <w:t xml:space="preserve">and</w:t>
+      </w:r>
+      <w:r>
+        <w:t xml:space="preserve"> </w:t>
+      </w:r>
+      <w:r>
+        <w:t xml:space="preserve">tuning</w:t>
+      </w:r>
+      <w:r>
+        <w:t xml:space="preserve"> </w:t>
+      </w:r>
+      <w:r>
+        <w:t xml:space="preserve">budget</w:t>
+      </w:r>
+      <w:r>
+        <w:t xml:space="preserve"> </w:t>
+      </w:r>
+      <w:r>
+        <w:t xml:space="preserve">did</w:t>
       </w:r>
       <w:r>
         <w:t xml:space="preserve"> </w:t>
@@ -263,169 +827,73 @@
         <w:t xml:space="preserve"> </w:t>
       </w:r>
       <w:r>
-        <w:t xml:space="preserve">be</w:t>
-      </w:r>
-      <w:r>
-        <w:t xml:space="preserve"> </w:t>
-      </w:r>
-      <w:r>
-        <w:t xml:space="preserve">the</w:t>
-      </w:r>
-      <w:r>
-        <w:t xml:space="preserve"> </w:t>
-      </w:r>
-      <w:r>
-        <w:t xml:space="preserve">most</w:t>
-      </w:r>
-      <w:r>
-        <w:t xml:space="preserve"> </w:t>
-      </w:r>
-      <w:r>
-        <w:t xml:space="preserve">relevant</w:t>
-      </w:r>
-      <w:r>
-        <w:t xml:space="preserve"> </w:t>
-      </w:r>
-      <w:r>
-        <w:t xml:space="preserve">to</w:t>
-      </w:r>
-      <w:r>
-        <w:t xml:space="preserve"> </w:t>
-      </w:r>
-      <w:r>
-        <w:t xml:space="preserve">survival.</w:t>
-      </w:r>
-      <w:r>
-        <w:t xml:space="preserve"> </w:t>
-      </w:r>
-      <w:r>
-        <w:t xml:space="preserve">We</w:t>
-      </w:r>
-      <w:r>
-        <w:t xml:space="preserve"> </w:t>
-      </w:r>
-      <w:r>
-        <w:t xml:space="preserve">developed</w:t>
-      </w:r>
-      <w:r>
-        <w:t xml:space="preserve"> </w:t>
-      </w:r>
-      <w:r>
-        <w:t xml:space="preserve">DeSurv,</w:t>
-      </w:r>
-      <w:r>
-        <w:t xml:space="preserve"> </w:t>
-      </w:r>
-      <w:r>
-        <w:t xml:space="preserve">a</w:t>
-      </w:r>
-      <w:r>
-        <w:t xml:space="preserve"> </w:t>
-      </w:r>
-      <w:r>
-        <w:t xml:space="preserve">survival-supervised</w:t>
-      </w:r>
-      <w:r>
-        <w:t xml:space="preserve"> </w:t>
-      </w:r>
-      <w:r>
-        <w:t xml:space="preserve">matrix</w:t>
-      </w:r>
-      <w:r>
-        <w:t xml:space="preserve"> </w:t>
-      </w:r>
-      <w:r>
-        <w:t xml:space="preserve">factorization</w:t>
-      </w:r>
-      <w:r>
-        <w:t xml:space="preserve"> </w:t>
-      </w:r>
-      <w:r>
-        <w:t xml:space="preserve">that</w:t>
-      </w:r>
-      <w:r>
-        <w:t xml:space="preserve"> </w:t>
-      </w:r>
-      <w:r>
-        <w:t xml:space="preserve">incorporates</w:t>
-      </w:r>
-      <w:r>
-        <w:t xml:space="preserve"> </w:t>
-      </w:r>
-      <w:r>
-        <w:t xml:space="preserve">outcome</w:t>
-      </w:r>
-      <w:r>
-        <w:t xml:space="preserve"> </w:t>
-      </w:r>
-      <w:r>
-        <w:t xml:space="preserve">into</w:t>
-      </w:r>
-      <w:r>
-        <w:t xml:space="preserve"> </w:t>
-      </w:r>
-      <w:r>
-        <w:t xml:space="preserve">gene-program</w:t>
-      </w:r>
-      <w:r>
-        <w:t xml:space="preserve"> </w:t>
-      </w:r>
-      <w:r>
-        <w:t xml:space="preserve">estimation</w:t>
-      </w:r>
-      <w:r>
-        <w:t xml:space="preserve"> </w:t>
-      </w:r>
-      <w:r>
-        <w:t xml:space="preserve">and</w:t>
-      </w:r>
-      <w:r>
-        <w:t xml:space="preserve"> </w:t>
-      </w:r>
-      <w:r>
-        <w:t xml:space="preserve">fixes</w:t>
-      </w:r>
-      <w:r>
-        <w:t xml:space="preserve"> </w:t>
-      </w:r>
-      <w:r>
-        <w:t xml:space="preserve">the</w:t>
-      </w:r>
-      <w:r>
-        <w:t xml:space="preserve"> </w:t>
-      </w:r>
-      <w:r>
-        <w:t xml:space="preserve">gene</w:t>
-      </w:r>
-      <w:r>
-        <w:t xml:space="preserve"> </w:t>
-      </w:r>
-      <w:r>
-        <w:t xml:space="preserve">weights</w:t>
-      </w:r>
-      <w:r>
-        <w:t xml:space="preserve"> </w:t>
-      </w:r>
-      <w:r>
-        <w:t xml:space="preserve">for</w:t>
-      </w:r>
-      <w:r>
-        <w:t xml:space="preserve"> </w:t>
-      </w:r>
-      <w:r>
-        <w:t xml:space="preserve">scoring</w:t>
-      </w:r>
-      <w:r>
-        <w:t xml:space="preserve"> </w:t>
-      </w:r>
-      <w:r>
-        <w:t xml:space="preserve">new</w:t>
-      </w:r>
-      <w:r>
-        <w:t xml:space="preserve"> </w:t>
-      </w:r>
-      <w:r>
-        <w:t xml:space="preserve">cohorts.</w:t>
+        <w:t xml:space="preserve">recover</w:t>
+      </w:r>
+      <w:r>
+        <w:t xml:space="preserve"> </w:t>
+      </w:r>
+      <w:r>
+        <w:t xml:space="preserve">D1,</w:t>
+      </w:r>
+      <w:r>
+        <w:t xml:space="preserve"> </w:t>
+      </w:r>
+      <w:r>
+        <w:t xml:space="preserve">implicating</w:t>
+      </w:r>
+      <w:r>
+        <w:t xml:space="preserve"> </w:t>
+      </w:r>
+      <w:r>
+        <w:t xml:space="preserve">survival</w:t>
+      </w:r>
+      <w:r>
+        <w:t xml:space="preserve"> </w:t>
+      </w:r>
+      <w:r>
+        <w:t xml:space="preserve">supervision</w:t>
+      </w:r>
+      <w:r>
+        <w:t xml:space="preserve"> </w:t>
+      </w:r>
+      <w:r>
+        <w:t xml:space="preserve">rather</w:t>
+      </w:r>
+      <w:r>
+        <w:t xml:space="preserve"> </w:t>
+      </w:r>
+      <w:r>
+        <w:t xml:space="preserve">than</w:t>
+      </w:r>
+      <w:r>
+        <w:t xml:space="preserve"> </w:t>
+      </w:r>
+      <w:r>
+        <w:t xml:space="preserve">model</w:t>
+      </w:r>
+      <w:r>
+        <w:t xml:space="preserve"> </w:t>
+      </w:r>
+      <w:r>
+        <w:t xml:space="preserve">size</w:t>
+      </w:r>
+      <w:r>
+        <w:t xml:space="preserve"> </w:t>
+      </w:r>
+      <w:r>
+        <w:t xml:space="preserve">or</w:t>
+      </w:r>
+      <w:r>
+        <w:t xml:space="preserve"> </w:t>
+      </w:r>
+      <w:r>
+        <w:t xml:space="preserve">tuning</w:t>
+      </w:r>
+      <w:r>
+        <w:t xml:space="preserve"> </w:t>
+      </w:r>
+      <w:r>
+        <w:t xml:space="preserve">effort.</w:t>
       </w:r>
       <w:r>
         <w:t xml:space="preserve"> </w:t>
@@ -437,31 +905,25 @@
         <w:t xml:space="preserve"> </w:t>
       </w:r>
       <w:r>
-        <w:t xml:space="preserve">pooled</w:t>
-      </w:r>
-      <w:r>
-        <w:t xml:space="preserve"> </w:t>
-      </w:r>
-      <w:r>
-        <w:t xml:space="preserve">TCGA</w:t>
-      </w:r>
-      <w:r>
-        <w:t xml:space="preserve"> </w:t>
-      </w:r>
-      <w:r>
-        <w:t xml:space="preserve">and</w:t>
-      </w:r>
-      <w:r>
-        <w:t xml:space="preserve"> </w:t>
-      </w:r>
-      <w:r>
-        <w:t xml:space="preserve">CPTAC</w:t>
-      </w:r>
-      <w:r>
-        <w:t xml:space="preserve"> </w:t>
-      </w:r>
-      <w:r>
-        <w:t xml:space="preserve">cohorts,</w:t>
+        <w:t xml:space="preserve">simulations</w:t>
+      </w:r>
+      <w:r>
+        <w:t xml:space="preserve"> </w:t>
+      </w:r>
+      <w:r>
+        <w:t xml:space="preserve">with</w:t>
+      </w:r>
+      <w:r>
+        <w:t xml:space="preserve"> </w:t>
+      </w:r>
+      <w:r>
+        <w:t xml:space="preserve">known</w:t>
+      </w:r>
+      <w:r>
+        <w:t xml:space="preserve"> </w:t>
+      </w:r>
+      <w:r>
+        <w:t xml:space="preserve">structure,</w:t>
       </w:r>
       <w:r>
         <w:t xml:space="preserve"> </w:t>
@@ -473,379 +935,37 @@
         <w:t xml:space="preserve"> </w:t>
       </w:r>
       <w:r>
+        <w:t xml:space="preserve">more</w:t>
+      </w:r>
+      <w:r>
+        <w:t xml:space="preserve"> </w:t>
+      </w:r>
+      <w:r>
+        <w:t xml:space="preserve">accurately</w:t>
+      </w:r>
+      <w:r>
+        <w:t xml:space="preserve"> </w:t>
+      </w:r>
+      <w:r>
         <w:t xml:space="preserve">recovered</w:t>
       </w:r>
       <w:r>
         <w:t xml:space="preserve"> </w:t>
       </w:r>
       <w:r>
-        <w:t xml:space="preserve">a</w:t>
-      </w:r>
-      <w:r>
-        <w:t xml:space="preserve"> </w:t>
-      </w:r>
-      <w:r>
-        <w:t xml:space="preserve">three-program</w:t>
-      </w:r>
-      <w:r>
-        <w:t xml:space="preserve"> </w:t>
-      </w:r>
-      <w:r>
-        <w:t xml:space="preserve">tumor–stroma</w:t>
-      </w:r>
-      <w:r>
-        <w:t xml:space="preserve"> </w:t>
-      </w:r>
-      <w:r>
-        <w:t xml:space="preserve">architecture</w:t>
-      </w:r>
-      <w:r>
-        <w:t xml:space="preserve"> </w:t>
-      </w:r>
-      <w:r>
-        <w:t xml:space="preserve">whose</w:t>
-      </w:r>
-      <w:r>
-        <w:t xml:space="preserve"> </w:t>
-      </w:r>
-      <w:r>
-        <w:t xml:space="preserve">dominant</w:t>
-      </w:r>
-      <w:r>
-        <w:t xml:space="preserve"> </w:t>
-      </w:r>
-      <w:r>
-        <w:t xml:space="preserve">survival-aligned</w:t>
-      </w:r>
-      <w:r>
-        <w:t xml:space="preserve"> </w:t>
-      </w:r>
-      <w:r>
-        <w:t xml:space="preserve">direction</w:t>
-      </w:r>
-      <w:r>
-        <w:t xml:space="preserve"> </w:t>
-      </w:r>
-      <w:r>
-        <w:t xml:space="preserve">(D1)</w:t>
-      </w:r>
-      <w:r>
-        <w:t xml:space="preserve"> </w:t>
-      </w:r>
-      <w:r>
-        <w:t xml:space="preserve">linked</w:t>
-      </w:r>
-      <w:r>
-        <w:t xml:space="preserve"> </w:t>
-      </w:r>
-      <w:r>
-        <w:t xml:space="preserve">classical</w:t>
-      </w:r>
-      <w:r>
-        <w:t xml:space="preserve"> </w:t>
-      </w:r>
-      <w:r>
-        <w:t xml:space="preserve">tumor</w:t>
-      </w:r>
-      <w:r>
-        <w:t xml:space="preserve"> </w:t>
-      </w:r>
-      <w:r>
-        <w:t xml:space="preserve">identity</w:t>
-      </w:r>
-      <w:r>
-        <w:t xml:space="preserve"> </w:t>
-      </w:r>
-      <w:r>
-        <w:t xml:space="preserve">with</w:t>
-      </w:r>
-      <w:r>
-        <w:t xml:space="preserve"> </w:t>
-      </w:r>
-      <w:r>
-        <w:t xml:space="preserve">restCAF-like</w:t>
-      </w:r>
-      <w:r>
-        <w:t xml:space="preserve"> </w:t>
-      </w:r>
-      <w:r>
-        <w:t xml:space="preserve">stroma.</w:t>
-      </w:r>
-      <w:r>
-        <w:t xml:space="preserve"> </w:t>
-      </w:r>
-      <w:r>
-        <w:t xml:space="preserve">The</w:t>
-      </w:r>
-      <w:r>
-        <w:t xml:space="preserve"> </w:t>
-      </w:r>
-      <w:r>
-        <w:t xml:space="preserve">frozen</w:t>
-      </w:r>
-      <w:r>
-        <w:t xml:space="preserve"> </w:t>
-      </w:r>
-      <w:r>
-        <w:t xml:space="preserve">representation</w:t>
-      </w:r>
-      <w:r>
-        <w:t xml:space="preserve"> </w:t>
-      </w:r>
-      <w:r>
-        <w:t xml:space="preserve">transferred</w:t>
-      </w:r>
-      <w:r>
-        <w:t xml:space="preserve"> </w:t>
-      </w:r>
-      <w:r>
-        <w:t xml:space="preserve">across</w:t>
-      </w:r>
-      <w:r>
-        <w:t xml:space="preserve"> </w:t>
-      </w:r>
-      <w:r>
-        <w:t xml:space="preserve">five</w:t>
-      </w:r>
-      <w:r>
-        <w:t xml:space="preserve"> </w:t>
-      </w:r>
-      <w:r>
-        <w:t xml:space="preserve">external</w:t>
-      </w:r>
-      <w:r>
-        <w:t xml:space="preserve"> </w:t>
-      </w:r>
-      <w:r>
-        <w:t xml:space="preserve">datasets</w:t>
-      </w:r>
-      <w:r>
-        <w:t xml:space="preserve"> </w:t>
-      </w:r>
-      <w:r>
-        <w:t xml:space="preserve">spanning</w:t>
-      </w:r>
-      <w:r>
-        <w:t xml:space="preserve"> </w:t>
-      </w:r>
-      <w:r>
-        <w:t xml:space="preserve">four</w:t>
-      </w:r>
-      <w:r>
-        <w:t xml:space="preserve"> </w:t>
-      </w:r>
-      <w:r>
-        <w:t xml:space="preserve">independent</w:t>
-      </w:r>
-      <w:r>
-        <w:t xml:space="preserve"> </w:t>
-      </w:r>
-      <w:r>
-        <w:t xml:space="preserve">cohorts,</w:t>
-      </w:r>
-      <w:r>
-        <w:t xml:space="preserve"> </w:t>
-      </w:r>
-      <w:r>
-        <w:t xml:space="preserve">where</w:t>
-      </w:r>
-      <w:r>
-        <w:t xml:space="preserve"> </w:t>
-      </w:r>
-      <w:r>
-        <w:t xml:space="preserve">the</w:t>
-      </w:r>
-      <w:r>
-        <w:t xml:space="preserve"> </w:t>
-      </w:r>
-      <w:r>
-        <w:t xml:space="preserve">combined</w:t>
-      </w:r>
-      <w:r>
-        <w:t xml:space="preserve"> </w:t>
-      </w:r>
-      <w:r>
-        <w:t xml:space="preserve">risk</w:t>
-      </w:r>
-      <w:r>
-        <w:t xml:space="preserve"> </w:t>
-      </w:r>
-      <w:r>
-        <w:t xml:space="preserve">score</w:t>
-      </w:r>
-      <w:r>
-        <w:t xml:space="preserve"> </w:t>
-      </w:r>
-      <w:r>
-        <w:t xml:space="preserve">remained</w:t>
-      </w:r>
-      <w:r>
-        <w:t xml:space="preserve"> </w:t>
-      </w:r>
-      <w:r>
         <w:t xml:space="preserve">prognostic</w:t>
       </w:r>
       <w:r>
         <w:t xml:space="preserve"> </w:t>
       </w:r>
       <w:r>
-        <w:t xml:space="preserve">(HR</w:t>
-      </w:r>
-      <w:r>
-        <w:t xml:space="preserve"> </w:t>
-      </w:r>
-      <w:r>
-        <w:t xml:space="preserve">per</w:t>
-      </w:r>
-      <w:r>
-        <w:t xml:space="preserve"> </w:t>
-      </w:r>
-      <w:r>
-        <w:t xml:space="preserve">SD,</w:t>
-      </w:r>
-      <w:r>
-        <w:t xml:space="preserve"> </w:t>
-      </w:r>
-      <w:r>
-        <w:t xml:space="preserve">1.42;</w:t>
-      </w:r>
-      <w:r>
-        <w:t xml:space="preserve"> </w:t>
-      </w:r>
-      <w:r>
-        <w:t xml:space="preserve">95%</w:t>
-      </w:r>
-      <w:r>
-        <w:t xml:space="preserve"> </w:t>
-      </w:r>
-      <w:r>
-        <w:t xml:space="preserve">CI,</w:t>
-      </w:r>
-      <w:r>
-        <w:t xml:space="preserve"> </w:t>
-      </w:r>
-      <w:r>
-        <w:t xml:space="preserve">1.26–1.59),</w:t>
-      </w:r>
-      <w:r>
-        <w:t xml:space="preserve"> </w:t>
-      </w:r>
-      <w:r>
-        <w:t xml:space="preserve">including</w:t>
-      </w:r>
-      <w:r>
-        <w:t xml:space="preserve"> </w:t>
-      </w:r>
-      <w:r>
-        <w:t xml:space="preserve">after</w:t>
-      </w:r>
-      <w:r>
-        <w:t xml:space="preserve"> </w:t>
-      </w:r>
-      <w:r>
-        <w:t xml:space="preserve">PurIST</w:t>
-      </w:r>
-      <w:r>
-        <w:t xml:space="preserve"> </w:t>
-      </w:r>
-      <w:r>
-        <w:t xml:space="preserve">and</w:t>
-      </w:r>
-      <w:r>
-        <w:t xml:space="preserve"> </w:t>
-      </w:r>
-      <w:r>
-        <w:t xml:space="preserve">DeCAF</w:t>
-      </w:r>
-      <w:r>
-        <w:t xml:space="preserve"> </w:t>
-      </w:r>
-      <w:r>
-        <w:t xml:space="preserve">adjustment.</w:t>
-      </w:r>
-      <w:r>
-        <w:t xml:space="preserve"> </w:t>
-      </w:r>
-      <w:r>
-        <w:t xml:space="preserve">Unsupervised</w:t>
-      </w:r>
-      <w:r>
-        <w:t xml:space="preserve"> </w:t>
-      </w:r>
-      <w:r>
-        <w:t xml:space="preserve">factorization</w:t>
-      </w:r>
-      <w:r>
-        <w:t xml:space="preserve"> </w:t>
-      </w:r>
-      <w:r>
-        <w:t xml:space="preserve">matched</w:t>
-      </w:r>
-      <w:r>
-        <w:t xml:space="preserve"> </w:t>
-      </w:r>
-      <w:r>
-        <w:t xml:space="preserve">on</w:t>
-      </w:r>
-      <w:r>
-        <w:t xml:space="preserve"> </w:t>
-      </w:r>
-      <w:r>
-        <w:t xml:space="preserve">program</w:t>
-      </w:r>
-      <w:r>
-        <w:t xml:space="preserve"> </w:t>
-      </w:r>
-      <w:r>
-        <w:t xml:space="preserve">number</w:t>
-      </w:r>
-      <w:r>
-        <w:t xml:space="preserve"> </w:t>
-      </w:r>
-      <w:r>
-        <w:t xml:space="preserve">and</w:t>
-      </w:r>
-      <w:r>
-        <w:t xml:space="preserve"> </w:t>
-      </w:r>
-      <w:r>
-        <w:t xml:space="preserve">tuning</w:t>
-      </w:r>
-      <w:r>
-        <w:t xml:space="preserve"> </w:t>
-      </w:r>
-      <w:r>
-        <w:t xml:space="preserve">budget</w:t>
-      </w:r>
-      <w:r>
-        <w:t xml:space="preserve"> </w:t>
-      </w:r>
-      <w:r>
-        <w:t xml:space="preserve">did</w:t>
-      </w:r>
-      <w:r>
-        <w:t xml:space="preserve"> </w:t>
-      </w:r>
-      <w:r>
-        <w:t xml:space="preserve">not</w:t>
-      </w:r>
-      <w:r>
-        <w:t xml:space="preserve"> </w:t>
-      </w:r>
-      <w:r>
-        <w:t xml:space="preserve">recover</w:t>
-      </w:r>
-      <w:r>
-        <w:t xml:space="preserve"> </w:t>
-      </w:r>
-      <w:r>
-        <w:t xml:space="preserve">D1,</w:t>
-      </w:r>
-      <w:r>
-        <w:t xml:space="preserve"> </w:t>
-      </w:r>
-      <w:r>
-        <w:t xml:space="preserve">supporting</w:t>
+        <w:t xml:space="preserve">genes</w:t>
+      </w:r>
+      <w:r>
+        <w:t xml:space="preserve"> </w:t>
+      </w:r>
+      <w:r>
+        <w:t xml:space="preserve">when</w:t>
       </w:r>
       <w:r>
         <w:t xml:space="preserve"> </w:t>
@@ -857,120 +977,6 @@
         <w:t xml:space="preserve"> </w:t>
       </w:r>
       <w:r>
-        <w:t xml:space="preserve">supervision</w:t>
-      </w:r>
-      <w:r>
-        <w:t xml:space="preserve"> </w:t>
-      </w:r>
-      <w:r>
-        <w:t xml:space="preserve">rather</w:t>
-      </w:r>
-      <w:r>
-        <w:t xml:space="preserve"> </w:t>
-      </w:r>
-      <w:r>
-        <w:t xml:space="preserve">than</w:t>
-      </w:r>
-      <w:r>
-        <w:t xml:space="preserve"> </w:t>
-      </w:r>
-      <w:r>
-        <w:t xml:space="preserve">model</w:t>
-      </w:r>
-      <w:r>
-        <w:t xml:space="preserve"> </w:t>
-      </w:r>
-      <w:r>
-        <w:t xml:space="preserve">size</w:t>
-      </w:r>
-      <w:r>
-        <w:t xml:space="preserve"> </w:t>
-      </w:r>
-      <w:r>
-        <w:t xml:space="preserve">or</w:t>
-      </w:r>
-      <w:r>
-        <w:t xml:space="preserve"> </w:t>
-      </w:r>
-      <w:r>
-        <w:t xml:space="preserve">computational</w:t>
-      </w:r>
-      <w:r>
-        <w:t xml:space="preserve"> </w:t>
-      </w:r>
-      <w:r>
-        <w:t xml:space="preserve">effort.</w:t>
-      </w:r>
-      <w:r>
-        <w:t xml:space="preserve"> </w:t>
-      </w:r>
-      <w:r>
-        <w:t xml:space="preserve">In</w:t>
-      </w:r>
-      <w:r>
-        <w:t xml:space="preserve"> </w:t>
-      </w:r>
-      <w:r>
-        <w:t xml:space="preserve">known-truth</w:t>
-      </w:r>
-      <w:r>
-        <w:t xml:space="preserve"> </w:t>
-      </w:r>
-      <w:r>
-        <w:t xml:space="preserve">simulations,</w:t>
-      </w:r>
-      <w:r>
-        <w:t xml:space="preserve"> </w:t>
-      </w:r>
-      <w:r>
-        <w:t xml:space="preserve">DeSurv</w:t>
-      </w:r>
-      <w:r>
-        <w:t xml:space="preserve"> </w:t>
-      </w:r>
-      <w:r>
-        <w:t xml:space="preserve">more</w:t>
-      </w:r>
-      <w:r>
-        <w:t xml:space="preserve"> </w:t>
-      </w:r>
-      <w:r>
-        <w:t xml:space="preserve">accurately</w:t>
-      </w:r>
-      <w:r>
-        <w:t xml:space="preserve"> </w:t>
-      </w:r>
-      <w:r>
-        <w:t xml:space="preserve">recovered</w:t>
-      </w:r>
-      <w:r>
-        <w:t xml:space="preserve"> </w:t>
-      </w:r>
-      <w:r>
-        <w:t xml:space="preserve">prognostic</w:t>
-      </w:r>
-      <w:r>
-        <w:t xml:space="preserve"> </w:t>
-      </w:r>
-      <w:r>
-        <w:t xml:space="preserve">genes</w:t>
-      </w:r>
-      <w:r>
-        <w:t xml:space="preserve"> </w:t>
-      </w:r>
-      <w:r>
-        <w:t xml:space="preserve">when</w:t>
-      </w:r>
-      <w:r>
-        <w:t xml:space="preserve"> </w:t>
-      </w:r>
-      <w:r>
-        <w:t xml:space="preserve">survival</w:t>
-      </w:r>
-      <w:r>
-        <w:t xml:space="preserve"> </w:t>
-      </w:r>
-      <w:r>
         <w:t xml:space="preserve">signal</w:t>
       </w:r>
       <w:r>
@@ -1394,7 +1400,7 @@
         </w:r>
       </w:hyperlink>
       <w:r>
-        <w:t xml:space="preserve">. Consequently, establishing which unsupervised programs are clinically relevant and transportable has required extensive multi-study refinement: in PDAC, the basal-like/classical dichotomy took roughly a decade of iterative subtyping, virtual microdissection, independent cohorts, single-cell analyses and prospective clinical profiling</w:t>
+        <w:t xml:space="preserve">. Consequently, establishing which unsupervised programs are clinically relevant and transportable has required extensive multi-study refinement. In PDAC, the basal-like/classical dichotomy emerged through roughly a decade of iterative subtyping, virtual microdissection, independent cohorts, single-cell analyses and prospective clinical profiling</w:t>
       </w:r>
       <w:hyperlink w:anchor="ref-collisson2011subtypes">
         <w:r>
@@ -1471,7 +1477,7 @@
         <w:pStyle w:val="BodyText"/>
       </w:pPr>
       <w:r>
-        <w:t xml:space="preserve">Conversely, survival-supervised models such as penalized Cox regression and supervised principal components</w:t>
+        <w:t xml:space="preserve">By contrast, survival-supervised models such as penalized Cox regression and supervised principal components</w:t>
       </w:r>
       <w:hyperlink w:anchor="ref-bair2004semi">
         <w:r>
@@ -1501,7 +1507,7 @@
         <w:t xml:space="preserve"> </w:t>
       </w:r>
       <w:r>
-        <w:t xml:space="preserve">can identify outcome-associated expression patterns. Such models may predict survival without organizing the prognostic signal into biologically interpretable tumor and microenvironmental programs, which is the form in which PDAC subtypes, and the single-sample classifiers built from them, have been defined</w:t>
+        <w:t xml:space="preserve">can identify outcome-associated expression patterns. Such models may predict survival without organizing the prognostic signal into biologically interpretable tumor and microenvironmental programs: the form in which PDAC subtypes, and the single-sample classifiers built from them, have been defined</w:t>
       </w:r>
       <w:hyperlink w:anchor="ref-rashid2020purity">
         <w:r>
@@ -1536,7 +1542,7 @@
         <w:pStyle w:val="BodyText"/>
       </w:pPr>
       <w:r>
-        <w:t xml:space="preserve">Here, we present DeSurv, a survival-supervised matrix factorization framework that integrates NMF with Cox regression so that survival helps shape gene programs as they are learned. By incorporating survival during factorization, DeSurv is designed to recover survival-aligned biological structure that may be obscured when other sources of expression variation dominate. A consensus across many restarts supplies the initialization for a final fit, after which the gene weights defining each program are held fixed, or frozen, allowing the same programs to be evaluated directly in independent cohorts without refitting the factorization. DeSurv therefore moves clinical relevance from a post hoc criterion for selecting among unsupervised factors to a criterion that shapes the factors themselves, while making cross-study transportability a direct test of the same frozen gene programs. We evaluate DeSurv in PDAC across five external validation datasets spanning four independent patient cohorts, and use simulations in which the true underlying (latent) programs are known, to characterize when survival supervision improves recovery of prognostic programs.</w:t>
+        <w:t xml:space="preserve">Here, we present DeSurv, a survival-supervised matrix factorization framework that integrates NMF with Cox regression so that survival helps shape gene programs as they are learned. By incorporating survival during factorization, DeSurv is designed to recover survival-aligned biological structure that may be obscured when other sources of expression variation dominate. A consensus across many restarts supplies the initialization for a final fit. The gene weights defining each program are then held fixed, or frozen, allowing the same programs to be evaluated directly in independent cohorts without refitting the factorization. DeSurv therefore moves clinical relevance from a post hoc criterion for selecting among unsupervised factors to a criterion that shapes the factors themselves. Freezing the learned gene weights then makes cross-study transportability a direct test of the same programs rather than of a refitted representation. We evaluate DeSurv in PDAC across four independent external patient cohorts, and use simulations in which the true underlying (latent) programs are known, to characterize when survival supervision improves recovery of prognostic programs.</w:t>
       </w:r>
     </w:p>
     <w:p>
@@ -1570,7 +1576,7 @@
         <w:pStyle w:val="FirstParagraph"/>
       </w:pPr>
       <w:r>
-        <w:t xml:space="preserve">DeSurv learns gene programs by balancing reconstruction of the tumor transcriptome with association to patient survival. Unlike the conventional sequence of unsupervised factorization followed by post hoc clinical screening, survival directly shapes the gene programs during discovery. After training, the gene weights are fixed, allowing the same programs to be scored and tested in new tumors without refitting the factorization (Fig. [fig:schema]A; Methods).</w:t>
+        <w:t xml:space="preserve">DeSurv learns gene programs by balancing reconstruction of the tumor transcriptome with association to patient survival. Unlike the conventional sequence of unsupervised factorization followed by post hoc clinical screening, survival directly shapes the gene programs during discovery. After training, the gene weights are fixed, allowing the same programs to be scored and tested in new tumors without refitting the factorization (Fig. [fig:schema]a; Methods).</w:t>
       </w:r>
     </w:p>
     <w:p>
@@ -1712,7 +1718,7 @@
         </m:r>
       </m:oMath>
       <w:r>
-        <w:t xml:space="preserve">; Fig. [fig:schema]B and Supplementary Fig. [fig:fig-cindex-by-k]). By contrast, standard unsupervised NMF rank criteria (reconstruction residuals, cophenetic correlation and silhouette width</w:t>
+        <w:t xml:space="preserve">; Fig. [fig:schema]b and Supplementary Fig. [fig:fig-cindex-by-k]). By contrast, standard unsupervised NMF rank criteria (reconstruction residuals, cophenetic correlation and silhouette width</w:t>
       </w:r>
       <w:hyperlink w:anchor="ref-brunet2004metagenes">
         <w:r>
@@ -1798,7 +1804,7 @@
           <w:iCs/>
           <w:i/>
         </w:rPr>
-        <w:t xml:space="preserve">Overview of the DeSurv framework. (A) DeSurv jointly optimizes NMF reconstruction (</w:t>
+        <w:t xml:space="preserve">Overview of the DeSurv framework. (a) DeSurv jointly optimizes NMF reconstruction (</w:t>
       </w:r>
       <m:oMath>
         <m:r>
@@ -2013,7 +2019,7 @@
           <w:iCs/>
           <w:i/>
         </w:rPr>
-        <w:t xml:space="preserve">close to 1). (B) Hyperparameters (rank</w:t>
+        <w:t xml:space="preserve">close to 1). (b) Hyperparameters (rank</w:t>
       </w:r>
       <w:r>
         <w:rPr>
@@ -2189,7 +2195,7 @@
         </m:r>
       </m:oMath>
       <w:r>
-        <w:t xml:space="preserve">), thereby holding model complexity constant. DeSurv resolved three distinct programs (D1–D3): D1, enriched for classical tumor and restCAF-like stromal signatures; D2, enriched for proCAF-like stroma; and D3, enriched for basal-like tumor programs (Fig. [fig:pdac]a). Together, these programs define a tumor–stroma prognostic architecture spanning classical/restCAF-like and basal-like/proCAF-like states across patients. The classical component of D1 was independently supported in the COMPASS cohort, where D1 scores correlated with GATA6 RNA in situ hybridization (Spearman</w:t>
+        <w:t xml:space="preserve">), thereby holding model complexity constant. DeSurv resolved three distinct programs (D1–D3): D1, enriched for classical tumor and restCAF-like stromal signatures; D2, enriched for proCAF-like stroma; and D3, enriched for basal-like tumor programs (Fig. [fig:pdac]a). Together, these programs define a tumor–stroma prognostic architecture spanning classical/restCAF-like and basal-like/proCAF-like states across patients. The classical component of D1 was independently supported in the COMPASS trial cohort, where D1 scores correlated with GATA6 RNA in situ hybridization (Spearman</w:t>
       </w:r>
       <w:r>
         <w:t xml:space="preserve"> </w:t>
@@ -2365,7 +2371,7 @@
         </m:r>
       </m:oMath>
       <w:r>
-        <w:t xml:space="preserve">% of the reconstruction gain (Fig. [fig:pdac]c). Within the fitted model, the survival contribution was therefore concentrated in D1 despite its small contribution to reconstruction. Because D1 was estimated using these outcomes, its increment describes where the model placed the survival signal rather than testing whether that signal is real. The unsupervised factors were fit without survival; the factor with the largest reconstruction contribution (</w:t>
+        <w:t xml:space="preserve">% of the reconstruction gain (Fig. [fig:pdac]c). Within the fitted model, the survival contribution was therefore concentrated in D1 despite its small share of reconstruction. Because D1 was estimated using these outcomes, its increment describes where the model placed the survival signal rather than testing whether that signal is real. The unsupervised factors were fit without survival; the factor with the largest reconstruction contribution (</w:t>
       </w:r>
       <m:oMath>
         <m:r>
@@ -2455,7 +2461,7 @@
         </m:r>
       </m:oMath>
       <w:r>
-        <w:t xml:space="preserve">; Spearman correlation of gene loadings over all analysed genes; Fig. [fig:pdac]d). Consistently, D1 was poorly reconstructable from the full set of NMF factors (</w:t>
+        <w:t xml:space="preserve">; Spearman correlation of gene loadings over all analyzed genes; Fig. [fig:pdac]d). Consistently, D1 was poorly reconstructable from the full set of NMF factors (</w:t>
       </w:r>
       <m:oMath>
         <m:sSup>
@@ -2682,18 +2688,18 @@
           <w:iCs/>
           <w:i/>
         </w:rPr>
-        <w:t xml:space="preserve">. Both panels display the same rows, the union of reference programs correlating at</w:t>
-      </w:r>
-      <w:r>
-        <w:rPr>
-          <w:iCs/>
-          <w:i/>
-        </w:rPr>
-        <w:t xml:space="preserve"> </w:t>
-      </w:r>
-      <m:oMath>
-        <m:r>
-          <m:t>r</m:t>
+        <w:t xml:space="preserve">. Both panels display the same rows, the union of reference programs correlating at Spearman</w:t>
+      </w:r>
+      <w:r>
+        <w:rPr>
+          <w:iCs/>
+          <w:i/>
+        </w:rPr>
+        <w:t xml:space="preserve"> </w:t>
+      </w:r>
+      <m:oMath>
+        <m:r>
+          <m:t>ρ</m:t>
         </m:r>
         <m:r>
           <m:rPr>
@@ -2717,7 +2723,7 @@
           <w:iCs/>
           <w:i/>
         </w:rPr>
-        <w:t xml:space="preserve">with at least one factor of either method; grey cells denote programs with none of their genes in that method’s displayed gene space, where the correlation is not computable. The rows labelled SCISSORS: restCAF and SCISSORS: proCAF display the SCISSORS iCAF and myCAF gene sets under the naming used by the DeCAF classification (Supplementary Information). (c) Per-factor reconstruction contribution (normalized Shapley share, summing to 100%) versus survival contribution (</w:t>
+        <w:t xml:space="preserve">with at least one factor of either method; grey cells denote programs with none of their genes in that method’s displayed gene space, where the correlation is not computable. The rows labeled SCISSORS: restCAF and SCISSORS: proCAF display the SCISSORS iCAF and myCAF gene sets under the naming used by the DeCAF classification (Supplementary Information). (c) Per-factor reconstruction contribution (normalized Shapley share, summing to 100%) versus survival contribution (</w:t>
       </w:r>
       <m:oMath>
         <m:r>
@@ -2859,10 +2865,7 @@
         </m:r>
       </m:oMath>
       <w:r>
-        <w:t xml:space="preserve"> </w:t>
-      </w:r>
-      <w:r>
-        <w:t xml:space="preserve">(95% CI</w:t>
+        <w:t xml:space="preserve">, 95% CI</w:t>
       </w:r>
       <w:r>
         <w:t xml:space="preserve"> </w:t>
@@ -2881,7 +2884,7 @@
         </m:r>
       </m:oMath>
       <w:r>
-        <w:t xml:space="preserve">),</w:t>
+        <w:t xml:space="preserve">,</w:t>
       </w:r>
       <w:r>
         <w:t xml:space="preserve"> </w:t>
@@ -2895,7 +2898,7 @@
         <w:t xml:space="preserve"> </w:t>
       </w:r>
       <w:r>
-        <w:t xml:space="preserve">&lt;0.001). D3 had hazard ratios above 1 in four of the five datasets but was not significant in any of them, nor combined (</w:t>
+        <w:t xml:space="preserve">&lt; 0.001). D3 had hazard ratios above 1 in four of the five datasets but was not significant in any of them, nor combined (</w:t>
       </w:r>
       <m:oMath>
         <m:r>
@@ -2903,10 +2906,7 @@
         </m:r>
       </m:oMath>
       <w:r>
-        <w:t xml:space="preserve"> </w:t>
-      </w:r>
-      <w:r>
-        <w:t xml:space="preserve">(95% CI</w:t>
+        <w:t xml:space="preserve">, 95% CI</w:t>
       </w:r>
       <w:r>
         <w:t xml:space="preserve"> </w:t>
@@ -2925,7 +2925,7 @@
         </m:r>
       </m:oMath>
       <w:r>
-        <w:t xml:space="preserve">),</w:t>
+        <w:t xml:space="preserve">,</w:t>
       </w:r>
       <w:r>
         <w:t xml:space="preserve"> </w:t>
@@ -2953,10 +2953,7 @@
         </m:r>
       </m:oMath>
       <w:r>
-        <w:t xml:space="preserve"> </w:t>
-      </w:r>
-      <w:r>
-        <w:t xml:space="preserve">(95% CI</w:t>
+        <w:t xml:space="preserve">, 95% CI</w:t>
       </w:r>
       <w:r>
         <w:t xml:space="preserve"> </w:t>
@@ -2975,7 +2972,7 @@
         </m:r>
       </m:oMath>
       <w:r>
-        <w:t xml:space="preserve">),</w:t>
+        <w:t xml:space="preserve">,</w:t>
       </w:r>
       <w:r>
         <w:t xml:space="preserve"> </w:t>
@@ -2995,7 +2992,7 @@
         </m:r>
       </m:oMath>
       <w:r>
-        <w:t xml:space="preserve">) and more variable (Fig. [fig:val]a).</w:t>
+        <w:t xml:space="preserve">) and more variable (Fig. [fig:val]a). None of the three standard NMF factors at the same rank was associated with survival in the combined analysis (HRs 0.94–1.00; Fig. [fig:val]a, right).</w:t>
       </w:r>
     </w:p>
     <w:p>
@@ -3003,24 +3000,7 @@
         <w:pStyle w:val="BodyText"/>
       </w:pPr>
       <w:r>
-        <w:t xml:space="preserve">The frozen multivariable DeSurv linear predictor, the weighted sum of the three program scores (oriented so that higher values indicate higher risk), was associated with overall survival in a cohort-stratified analysis (pooled HR per SD</w:t>
-      </w:r>
-      <w:r>
-        <w:t xml:space="preserve"> </w:t>
-      </w:r>
-      <m:oMath>
-        <m:r>
-          <m:rPr>
-            <m:sty m:val="p"/>
-          </m:rPr>
-          <m:t>=</m:t>
-        </m:r>
-        <m:r>
-          <m:t>1.42</m:t>
-        </m:r>
-      </m:oMath>
-      <w:r>
-        <w:t xml:space="preserve">, 95% CI</w:t>
+        <w:t xml:space="preserve">The frozen multivariable DeSurv linear predictor, the weighted sum of the three program scores (oriented so that higher values indicate higher risk), was associated with overall survival in a cohort-stratified analysis (pooled HR per SD 1.42, 95% CI</w:t>
       </w:r>
       <w:r>
         <w:t xml:space="preserve"> </w:t>
@@ -3083,7 +3063,7 @@
         </m:sSup>
       </m:oMath>
       <w:r>
-        <w:t xml:space="preserve">; Table [tab:hr-adjusted]). Scaled Schoenfeld residuals showed the association attenuating over follow-up (</w:t>
+        <w:t xml:space="preserve">; Table [tab:hr-adjusted]). The elastic-net penalty set the trained coefficient for D2 to exactly zero, so D2 did not contribute to the trained linear predictor, which therefore combines only the D1 and D3 scores. Scaled Schoenfeld residuals showed the association attenuating over follow-up (</w:t>
       </w:r>
       <m:oMath>
         <m:sSup>
@@ -3153,7 +3133,7 @@
         </m:sSup>
       </m:oMath>
       <w:r>
-        <w:t xml:space="preserve">; Supplementary Information, Proportional-hazards diagnostic), so the pooled hazard ratio is a time-averaged summary rather than a constant multiplicative effect. The estimate did not depend on any single dataset (Fig. [fig:val]a).</w:t>
+        <w:t xml:space="preserve">; Supplementary Information, Proportional-hazards diagnostic), so the pooled hazard ratio is a time-averaged summary rather than a constant multiplicative effect. The estimate was not driven by any single dataset (leave-one-dataset-out HRs 1.34–1.45; Fig. [fig:val]a).</w:t>
       </w:r>
     </w:p>
     <w:p>
@@ -3521,7 +3501,7 @@
           <w:iCs/>
           <w:i/>
         </w:rPr>
-        <w:t xml:space="preserve">unique patients, 388 deaths, with PACA-AU patients profiled on both platforms represented once via RNA-seq). (a) Forest plot of per-dataset univariate hazard ratios (95% CIs) for each factor; the platform-specific PACA-AU array and RNA-seq estimates are shown separately, and the black diamonds denote the combined estimate over unique patients (per-factor cohort-stratified Cox on the de-duplicated patient-level data; PACA-AU array duplicates excluded). Puleo is the largest contributor, supplying</w:t>
+        <w:t xml:space="preserve">unique patients, 388 deaths, with PACA-AU patients profiled on both platforms represented once via RNA-seq). (a) Forest plot of per-dataset univariate hazard ratios (95% CIs) for each DeSurv program (left) and standard NMF factor (right); the platform-specific PACA-AU array and RNA-seq estimates are shown separately, and the black diamonds denote the combined estimate over unique patients (per-factor cohort-stratified Cox on the de-duplicated patient-level data; PACA-AU array duplicates excluded). Puleo is the largest contributor, supplying</w:t>
       </w:r>
       <w:r>
         <w:rPr>
@@ -3633,7 +3613,7 @@
           <w:iCs/>
           <w:i/>
         </w:rPr>
-        <w:t xml:space="preserve">Spearman</w:t>
+        <w:t xml:space="preserve">Pearson</w:t>
       </w:r>
       <w:r>
         <w:rPr>
@@ -4178,18 +4158,18 @@
           <w:iCs/>
           <w:i/>
         </w:rPr>
-        <w:t xml:space="preserve">unique patients, 388 deaths). Adjusted models include the PurIST tumor-intrinsic and DeCAF stromal molecular classifiers as covariates, with stratification by dataset, and are restricted to the</w:t>
-      </w:r>
-      <w:r>
-        <w:rPr>
-          <w:iCs/>
-          <w:i/>
-        </w:rPr>
-        <w:t xml:space="preserve"> </w:t>
-      </w:r>
-      <m:oMath>
-        <m:r>
-          <m:t>n</m:t>
+        <w:t xml:space="preserve">unique patients, 388 deaths). Adjusted models include the PurIST tumor-intrinsic and DeCAF stromal molecular classifiers as covariates, with stratification by dataset; all 570 patients had both classifier calls, so the adjusted and unadjusted populations are identical. DeSurv and the rank-optimized control retain significant prognostic value after adjustment. Both unsupervised controls are the unsupervised limit of the same optimizer, run at</w:t>
+      </w:r>
+      <w:r>
+        <w:rPr>
+          <w:iCs/>
+          <w:i/>
+        </w:rPr>
+        <w:t xml:space="preserve"> </w:t>
+      </w:r>
+      <m:oMath>
+        <m:r>
+          <m:t>α</m:t>
         </m:r>
         <m:r>
           <m:rPr>
@@ -4198,41 +4178,6 @@
           <m:t>=</m:t>
         </m:r>
         <m:r>
-          <m:t>570</m:t>
-        </m:r>
-      </m:oMath>
-      <w:r>
-        <w:rPr>
-          <w:iCs/>
-          <w:i/>
-        </w:rPr>
-        <w:t xml:space="preserve"> </w:t>
-      </w:r>
-      <w:r>
-        <w:rPr>
-          <w:iCs/>
-          <w:i/>
-        </w:rPr>
-        <w:t xml:space="preserve">patients (388 deaths) with both classifier calls available. DeSurv and the rank-optimized control retain significant prognostic value after adjustment. Both unsupervised controls are the unsupervised limit of the same optimizer, run at</w:t>
-      </w:r>
-      <w:r>
-        <w:rPr>
-          <w:iCs/>
-          <w:i/>
-        </w:rPr>
-        <w:t xml:space="preserve"> </w:t>
-      </w:r>
-      <m:oMath>
-        <m:r>
-          <m:t>α</m:t>
-        </m:r>
-        <m:r>
-          <m:rPr>
-            <m:sty m:val="p"/>
-          </m:rPr>
-          <m:t>=</m:t>
-        </m:r>
-        <m:r>
           <m:t>0</m:t>
         </m:r>
       </m:oMath>
@@ -4248,7 +4193,7 @@
           <w:iCs/>
           <w:i/>
         </w:rPr>
-        <w:t xml:space="preserve">with the same consensus-initialization procedure and Bayesian-optimization budget given to the supervised model: the rank-optimized control at its own BO-selected rank and the matched-budget control held at DeSurv’s rank, the latter serving as the tuning-budget control for the representational comparison in Fig. [fig:pdac]. The matched-rank comparator used for the factor-structure panels of Fig. [fig:pdac] is standard NMF (Lee multiplicative NMF, the field-standard implementation) (Supplementary Table [tab:tab-cindex-comparison]).</w:t>
+        <w:t xml:space="preserve">with the same consensus-initialization procedure and Bayesian-optimization budget given to the supervised model. The rank-optimized control runs at its own Bayesian-optimization-selected rank; the matched-budget control is held at DeSurv’s rank and serves as the tuning-budget control for the representational comparison in Fig. [fig:pdac]. The matched-rank comparator used for the factor-structure panels of Fig. [fig:pdac] is standard NMF (Lee multiplicative NMF; Supplementary Table [tab:tab-cindex-comparison]).</w:t>
       </w:r>
     </w:p>
     <w:p>
@@ -4365,7 +4310,7 @@
           <w:iCs/>
           <w:i/>
         </w:rPr>
-        <w:t xml:space="preserve">Transportability of the frozen DeSurv programs into independently treated PDAC cohorts. (a) Prognostic transportability of D1 in treated metastatic PDAC. Forest plot of hazard ratios per SD of the frozen D1 score within each O’Kane/COMPASS treatment arm (FOLFIRINOX, gemcitabine/nab-paclitaxel [GA], and GA/experimental); the diamond is the common association estimated across arms from a stratified Cox model with treatment-arm-specific baseline hazards, HR</w:t>
+        <w:t xml:space="preserve">Transportability of the frozen DeSurv programs into independent treated PDAC cohorts. (a) Prognostic transportability of D1 in treated metastatic PDAC. Forest plot of hazard ratios per SD of the frozen D1 score within each O’Kane/COMPASS treatment arm (FOLFIRINOX, gemcitabine/nab-paclitaxel [GA], and GA/experimental); the diamond is the common association estimated across arms from a stratified Cox model with treatment-arm-specific baseline hazards, HR</w:t>
       </w:r>
       <w:r>
         <w:rPr>
@@ -4478,7 +4423,7 @@
           <w:iCs/>
           <w:i/>
         </w:rPr>
-        <w:t xml:space="preserve">), though the individual arms are underpowered for detecting heterogeneity. (b) The proCAF program D2 before and after treatment in paired Linehan biopsies (</w:t>
+        <w:t xml:space="preserve">), though the individual arms are underpowered for detecting heterogeneity. Error bars denote 95% confidence intervals. (b) The proCAF program D2 before and after treatment in paired Linehan biopsies (</w:t>
       </w:r>
       <m:oMath>
         <m:r>
@@ -4552,7 +4497,7 @@
           <w:iCs/>
           <w:i/>
         </w:rPr>
-        <w:t xml:space="preserve">SD). Error bars denote 95% confidence intervals. Because treatment, stage and cohort were not independently varied, these analyses establish prognostic and biological transportability rather than treatment-predictive effects.</w:t>
+        <w:t xml:space="preserve">SD). Because treatment, stage and cohort were not independently varied, these analyses support prognostic and biological transportability rather than treatment-predictive effects.</w:t>
       </w:r>
     </w:p>
     <w:bookmarkEnd w:id="34"/>
@@ -4587,24 +4532,7 @@
         </m:r>
       </m:oMath>
       <w:r>
-        <w:t xml:space="preserve">, 388 events), binary PurIST and DeCAF classifications together explained 34% of the variance in the continuous D1 score, indicating substantial alignment with known tumor-intrinsic and stromal subtypes but incomplete overlap. D1 remained associated with survival after simultaneous adjustment for both classifiers (HR per SD</w:t>
-      </w:r>
-      <w:r>
-        <w:t xml:space="preserve"> </w:t>
-      </w:r>
-      <m:oMath>
-        <m:r>
-          <m:rPr>
-            <m:sty m:val="p"/>
-          </m:rPr>
-          <m:t>=</m:t>
-        </m:r>
-        <m:r>
-          <m:t>0.82</m:t>
-        </m:r>
-      </m:oMath>
-      <w:r>
-        <w:t xml:space="preserve">, 95% CI</w:t>
+        <w:t xml:space="preserve">, 388 events), binary PurIST and DeCAF classifications together explained 34% of the variance in the continuous D1 score, indicating substantial alignment with known tumor-intrinsic and stromal subtypes but incomplete overlap. D1 remained associated with survival after simultaneous adjustment for both classifiers (HR per SD 0.82, 95% CI</w:t>
       </w:r>
       <w:r>
         <w:t xml:space="preserve"> </w:t>
@@ -4672,10 +4600,7 @@
         </m:r>
       </m:oMath>
       <w:r>
-        <w:t xml:space="preserve"> </w:t>
-      </w:r>
-      <w:r>
-        <w:t xml:space="preserve">on 1 df,</w:t>
+        <w:t xml:space="preserve">, 1 df,</w:t>
       </w:r>
       <w:r>
         <w:t xml:space="preserve"> </w:t>
@@ -4695,12 +4620,42 @@
         </m:r>
       </m:oMath>
       <w:r>
-        <w:t xml:space="preserve">) and concordance from 0.592 to 0.622. In Puleo, the largest validation cohort, the DeSurv linear predictor remained prognostic after adjustment for standard clinical covariates (HR per SD</w:t>
-      </w:r>
-      <w:r>
-        <w:t xml:space="preserve"> </w:t>
-      </w:r>
-      <m:oMath>
+        <w:t xml:space="preserve">) and concordance from 0.592 to 0.622. In Puleo, the largest validation cohort, the DeSurv linear predictor remained prognostic after adjustment for standard clinical covariates (HR per SD 1.33, 95% CI</w:t>
+      </w:r>
+      <w:r>
+        <w:t xml:space="preserve"> </w:t>
+      </w:r>
+      <m:oMath>
+        <m:r>
+          <m:t>1.14</m:t>
+        </m:r>
+      </m:oMath>
+      <w:r>
+        <w:t xml:space="preserve">–</w:t>
+      </w:r>
+      <m:oMath>
+        <m:r>
+          <m:t>1.55</m:t>
+        </m:r>
+      </m:oMath>
+      <w:r>
+        <w:t xml:space="preserve">; Supplementary Table [tab:clinical-adjustment]).</w:t>
+      </w:r>
+    </w:p>
+    <w:p>
+      <w:pPr>
+        <w:pStyle w:val="BodyText"/>
+      </w:pPr>
+      <w:r>
+        <w:t xml:space="preserve">Because D1 spans tumor and stromal programs, we asked whether it tracks tumor purity. In the two datasets with purity estimates for all patients, D1 correlated only weakly with purity (Spearman</w:t>
+      </w:r>
+      <w:r>
+        <w:t xml:space="preserve"> </w:t>
+      </w:r>
+      <m:oMath>
+        <m:r>
+          <m:t>ρ</m:t>
+        </m:r>
         <m:r>
           <m:rPr>
             <m:sty m:val="p"/>
@@ -4708,38 +4663,31 @@
           <m:t>=</m:t>
         </m:r>
         <m:r>
-          <m:t>1.33</m:t>
-        </m:r>
-      </m:oMath>
-      <w:r>
-        <w:t xml:space="preserve">, 95% CI</w:t>
-      </w:r>
-      <w:r>
-        <w:t xml:space="preserve"> </w:t>
-      </w:r>
-      <m:oMath>
-        <m:r>
-          <m:t>1.14</m:t>
-        </m:r>
-      </m:oMath>
-      <w:r>
-        <w:t xml:space="preserve">–</w:t>
-      </w:r>
-      <m:oMath>
-        <m:r>
-          <m:t>1.55</m:t>
-        </m:r>
-      </m:oMath>
-      <w:r>
-        <w:t xml:space="preserve">; Supplementary Table [tab:clinical-adjustment]).</w:t>
-      </w:r>
-    </w:p>
-    <w:p>
-      <w:pPr>
-        <w:pStyle w:val="BodyText"/>
-      </w:pPr>
-      <w:r>
-        <w:t xml:space="preserve">Because D1 spans tumor and stromal programs, we asked whether it tracks tumor purity. Where purity was measured on a full cohort the association was essentially unchanged (PACA-AU array, 1.44 unadjusted versus 1.45 adjusted; RNA-seq, 1.66 versus 1.65), providing no evidence that the association was explained by measured tumor purity (Supplementary Table [tab:clinical-adjustment]).</w:t>
+          <m:t>0.06</m:t>
+        </m:r>
+      </m:oMath>
+      <w:r>
+        <w:t xml:space="preserve"> </w:t>
+      </w:r>
+      <w:r>
+        <w:t xml:space="preserve">and</w:t>
+      </w:r>
+      <w:r>
+        <w:t xml:space="preserve"> </w:t>
+      </w:r>
+      <m:oMath>
+        <m:r>
+          <m:rPr>
+            <m:sty m:val="p"/>
+          </m:rPr>
+          <m:t>−</m:t>
+        </m:r>
+        <m:r>
+          <m:t>0.05</m:t>
+        </m:r>
+      </m:oMath>
+      <w:r>
+        <w:t xml:space="preserve">), and the linear predictor’s association with survival was essentially unchanged by purity adjustment (HR per SD: PACA-AU array, 1.44 unadjusted versus 1.45 adjusted; RNA-seq, 1.66 versus 1.65), providing no evidence that the association was explained by measured tumor purity (Supplementary Table [tab:clinical-adjustment]).</w:t>
       </w:r>
     </w:p>
     <w:p>
@@ -4856,7 +4804,10 @@
         </m:r>
       </m:oMath>
       <w:r>
-        <w:t xml:space="preserve">,</w:t>
+        <w:t xml:space="preserve"> </w:t>
+      </w:r>
+      <w:r>
+        <w:t xml:space="preserve">and</w:t>
       </w:r>
       <w:r>
         <w:t xml:space="preserve"> </w:t>
@@ -4870,7 +4821,7 @@
         <w:t xml:space="preserve"> </w:t>
       </w:r>
       <w:r>
-        <w:t xml:space="preserve">and</w:t>
+        <w:t xml:space="preserve">versus</w:t>
       </w:r>
       <w:r>
         <w:t xml:space="preserve"> </w:t>
@@ -4881,7 +4832,10 @@
         </m:r>
       </m:oMath>
       <w:r>
-        <w:t xml:space="preserve">, respectively) and captured the dominant D1-associated prognostic direction. Their selected genes, however, were consistently enriched for basal-like tumor programs but not proCAF, restCAF, immune or exocrine programs. Their risk scores were weakly correlated with the separately resolved proCAF-like D2 program (penalized Cox,</w:t>
+        <w:t xml:space="preserve"> </w:t>
+      </w:r>
+      <w:r>
+        <w:t xml:space="preserve">for DeSurv) and captured the dominant D1-associated prognostic direction. Their selected genes, however, were consistently enriched for basal-like tumor programs but not proCAF, restCAF, immune or exocrine programs. Their risk scores were weakly correlated with the separately resolved proCAF-like D2 program (penalized Cox,</w:t>
       </w:r>
       <w:r>
         <w:t xml:space="preserve"> </w:t>
@@ -5048,7 +5002,7 @@
         </m:r>
       </m:oMath>
       <w:r>
-        <w:t xml:space="preserve">, the unsupervised limit of the same pipeline) were tuned using the same cross-validation procedure, isolating the effect of survival supervision during factorization.</w:t>
+        <w:t xml:space="preserve">) were tuned using the same cross-validation procedure, isolating the effect of survival supervision during factorization.</w:t>
       </w:r>
     </w:p>
     <w:p>
@@ -5056,7 +5010,7 @@
         <w:pStyle w:val="BodyText"/>
       </w:pPr>
       <w:r>
-        <w:t xml:space="preserve">Under this setting, DeSurv more accurately recovered the genes defining the true prognostic program, whereas unsupervised NMF largely followed variance-dominant structure (Fig. [fig:sim]a–b). Across 100 replicates, median test-set C-index was</w:t>
+        <w:t xml:space="preserve">Under this setting, DeSurv more accurately recovered the genes defining the true prognostic program, whereas unsupervised NMF largely followed variance-dominant structure (Fig. [fig:sim]a,b). Across 100 replicates, median test-set C-index was</w:t>
       </w:r>
       <w:r>
         <w:t xml:space="preserve"> </w:t>
@@ -5386,7 +5340,7 @@
           <w:iCs/>
           <w:i/>
         </w:rPr>
-        <w:t xml:space="preserve">IQR; points are individual replicates. (c) Distribution of selected ranks across replicates for DeSurv versus unsupervised NMF. (d) The same matched-factor precision metric as in (b), computed for two signal regimes: a prognostic program whose genes carry low transcriptomic variance relative to the shared outcome-neutral background (separated from the dominant variance) versus one that partially overlaps the dominant variance. DeSurv recovers the prognostic program more accurately in both regimes, whereas the unsupervised solution is more strongly influenced by the dominant expression structure; the null scenario (no prognostic program) is shown in the Supplementary Information. These scenarios are constructed to isolate the regime in which the prognostic program carries low transcriptomic variance relative to the shared outcome-neutral background, and therefore quantify recovery under that construction; the concordance gap in (a) is not an expected discrimination gain in real data, where the two approaches perform comparably (Table [tab:hr-adjusted]).</w:t>
+        <w:t xml:space="preserve">IQR; points are individual replicates. (c) Distribution of selected ranks across replicates for DeSurv versus unsupervised NMF. (d) The same matched-factor precision metric as in (b), computed for two signal regimes: a prognostic program whose genes carry low transcriptomic variance relative to the shared outcome-neutral background (separated from the dominant variance) versus one that partially overlaps the dominant variance. DeSurv recovers the prognostic program more accurately in both regimes, whereas the unsupervised solution is more strongly influenced by the dominant expression structure; the null scenario (no prognostic program) is shown in the Supplementary Information. The concordance gap in (a) is not an expected discrimination gain in real data, where the two approaches perform comparably (Table [tab:hr-adjusted]).</w:t>
       </w:r>
     </w:p>
     <w:bookmarkEnd w:id="39"/>
@@ -5405,7 +5359,7 @@
         <w:pStyle w:val="FirstParagraph"/>
       </w:pPr>
       <w:r>
-        <w:t xml:space="preserve">DeSurv integrates survival into gene-program estimation while preserving a fixed basis that can be scored unchanged in new cohorts. In PDAC, this identified a dominant survival-aligned program, D1, characterized by covariation of classical tumor and restCAF-like stromal programs, alongside separately resolved proCAF-like stromal and basal-like tumor programs. D1 was recovered de novo without subtype labels and remained prognostic after adjustment for the established PurIST and DeCAF classifications, so it is not reducible to them. Its classical tumor identity was supported by GATA6 RNA in situ hybridization. The trained programs then transferred without refitting across five external validation datasets spanning four independent patient cohorts. DeSurv’s contribution was to place this replicable prognostic direction within a tumor–stroma architecture whose components can be examined separately. The advance is in how clinically relevant programs are discovered, not in how well they predict.</w:t>
+        <w:t xml:space="preserve">DeSurv integrates survival into gene-program estimation while preserving a fixed basis that can be scored unchanged in new cohorts. In PDAC, this identified a dominant survival-aligned program, D1, characterized by covariation of classical tumor and restCAF-like stromal programs, alongside separately resolved proCAF-like stromal and basal-like tumor programs. D1 was recovered de novo without subtype labels and remained prognostic after adjustment for the established PurIST and DeCAF classifications, so it is not reducible to them. Its classical tumor identity was supported by GATA6 RNA in situ hybridization. The trained programs then transferred without refitting across four independent external patient cohorts. DeSurv’s contribution was to place this replicable prognostic direction within a tumor–stroma architecture whose components can be examined separately. The advance is in how clinically relevant programs are discovered, not in how well they predict.</w:t>
       </w:r>
     </w:p>
     <w:p>
@@ -5413,7 +5367,7 @@
         <w:pStyle w:val="BodyText"/>
       </w:pPr>
       <w:r>
-        <w:t xml:space="preserve">The representational difference persisted at matched rank and tuning effort: the matched-budget unsupervised control, given DeSurv’s rank, optimizer, tuning budget and consensus initialization, did not recover D1, whereas the rank-optimized unsupervised control and conventional supervised predictors recovered comparable prognostic information in different representations. The former spanned a broader set of established programs across seven factors; the latter resolved a tumor-intrinsic axis without separately resolving the stromal programs. In simulations, where the latent programs are known, DeSurv more accurately recovered the genes defining the true prognostic program.</w:t>
+        <w:t xml:space="preserve">The representational difference persisted at matched rank and tuning effort: the matched-budget unsupervised control, given DeSurv’s rank, optimizer, tuning budget and consensus initialization, did not recover D1, whereas the rank-optimized unsupervised control and conventional supervised predictors recovered comparable prognostic information in different representations. The former spanned a broader set of established programs across seven factors; the latter recovered a tumor-intrinsic axis without separately resolving the stromal programs. In simulations, where the latent programs are known, DeSurv more accurately recovered the genes defining the true prognostic program.</w:t>
       </w:r>
     </w:p>
     <w:p>
@@ -5465,7 +5419,7 @@
         <w:t xml:space="preserve"> </w:t>
       </w:r>
       <w:r>
-        <w:t xml:space="preserve">also integrate outcome information into factorization but place the survival term on the sample-side latent representation. Scoring a new cohort therefore requires sample-side loadings: SurvNMF re-estimates them by constrained least squares, whereas CoxNMF does not describe a scoring procedure (Supplementary Table [tab:architecture]). Deep latent-variable survival models</w:t>
+        <w:t xml:space="preserve">place the survival term on the sample-side latent representation, so scoring a new cohort requires sample-side loadings (Methods; Supplementary Table [tab:architecture]), and deep latent-variable survival models</w:t>
       </w:r>
       <w:hyperlink w:anchor="ref-zaccaria2023surviae">
         <w:r>
@@ -5580,7 +5534,7 @@
         </w:r>
       </w:hyperlink>
       <w:r>
-        <w:t xml:space="preserve">. Survival supervision does not remove that non-uniqueness, and single DeSurv runs from different random starts recover appreciably different gene sets. What makes the reported decomposition a stable object is the consensus step, and independently seeded applications of the full procedure closely reproduce the reported decomposition (Supplementary Information, Stability of the recovered gene programs). Survival supervision instead provides an outcome-informed criterion for selecting among representations that may be similarly adequate under reconstruction alone.</w:t>
+        <w:t xml:space="preserve">. Survival supervision does not remove that non-uniqueness, and single DeSurv runs from different random starts recover appreciably different gene sets. What makes the reported decomposition reproducible is the consensus step, and independently seeded applications of the full procedure closely reproduce the reported decomposition (Supplementary Information, Stability of the recovered gene programs). Survival supervision instead provides an outcome-informed criterion for selecting among representations that may be similarly adequate under reconstruction alone.</w:t>
       </w:r>
     </w:p>
     <w:p>
@@ -5631,7 +5585,7 @@
         <w:pStyle w:val="BodyText"/>
       </w:pPr>
       <w:r>
-        <w:t xml:space="preserve">Several limitations define the scope of these findings. DeSurv currently uses a proportional-hazards survival objective and was evaluated here only in PDAC. The survival objective could be extended to accommodate non-proportional hazards or nonlinear survival relationships. More importantly, the DeSurv formulation is not PDAC-specific, but whether its representational advantage generalizes across cancer types remains unknown. Testing it will require multi-cancer benchmarking against unsupervised decompositions and against strong penalized-regression baselines, which remain difficult to outperform consistently for out-of-sample prognosis</w:t>
+        <w:t xml:space="preserve">Several limitations define the scope of these findings. DeSurv uses a proportional-hazards survival objective, and the validation cohorts showed a departure from proportional hazards (Results); the objective could be extended to accommodate non-proportional hazards or nonlinear survival relationships. The DeSurv formulation is not PDAC-specific, but it was evaluated only in PDAC, and whether its representational advantage generalizes across cancer types remains unknown. Testing it will require multi-cancer benchmarking against unsupervised decompositions and against strong penalized-regression baselines, which remain difficult to outperform consistently for out-of-sample prognosis</w:t>
       </w:r>
       <w:hyperlink w:anchor="ref-smith2020standard">
         <w:r>
@@ -5671,7 +5625,7 @@
       </w:r>
     </w:p>
     <w:bookmarkEnd w:id="41"/>
-    <w:bookmarkStart w:id="50" w:name="methods"/>
+    <w:bookmarkStart w:id="51" w:name="methods"/>
     <w:p>
       <w:pPr>
         <w:pStyle w:val="Heading1"/>
@@ -6406,7 +6360,7 @@
         <w:pStyle w:val="Heading2"/>
       </w:pPr>
       <w:r>
-        <w:t xml:space="preserve">The DeSurv Model</w:t>
+        <w:t xml:space="preserve">The DeSurv model</w:t>
       </w:r>
     </w:p>
     <w:p>
@@ -6940,7 +6894,7 @@
         </m:r>
       </m:oMath>
       <w:r>
-        <w:t xml:space="preserve">, and the</w:t>
+        <w:t xml:space="preserve">. The</w:t>
       </w:r>
       <w:r>
         <w:t xml:space="preserve"> </w:t>
@@ -6954,7 +6908,7 @@
         <w:t xml:space="preserve"> </w:t>
       </w:r>
       <w:r>
-        <w:t xml:space="preserve">update balances the magnitudes of the two gradients before</w:t>
+        <w:t xml:space="preserve">update then balances the magnitudes of the two gradients before</w:t>
       </w:r>
       <w:r>
         <w:t xml:space="preserve"> </w:t>
@@ -7150,7 +7104,7 @@
         </m:r>
       </m:oMath>
       <w:r>
-        <w:t xml:space="preserve">, DeSurv reduces to its unsupervised limit.</w:t>
+        <w:t xml:space="preserve">, DeSurv reduces to its unsupervised limit. The Cox coefficients</w:t>
       </w:r>
       <w:r>
         <w:t xml:space="preserve"> </w:t>
@@ -7164,7 +7118,7 @@
         <w:t xml:space="preserve"> </w:t>
       </w:r>
       <w:r>
-        <w:t xml:space="preserve">is then fit post hoc by penalized Coxnet on the projected scores</w:t>
+        <w:t xml:space="preserve">are then fit post hoc by penalized Coxnet on the projected scores</w:t>
       </w:r>
       <w:r>
         <w:t xml:space="preserve"> </w:t>
@@ -7202,7 +7156,7 @@
         <w:t xml:space="preserve"> </w:t>
       </w:r>
       <w:r>
-        <w:t xml:space="preserve">and is used only for scoring and cross-validation; it does not affect the factorization. Across the pipeline, the survival-tuned</w:t>
+        <w:t xml:space="preserve">and are used only for scoring and cross-validation; they do not affect the factorization. Note that the survival-tuned</w:t>
       </w:r>
       <w:r>
         <w:t xml:space="preserve"> </w:t>
@@ -7543,7 +7497,15 @@
         <w:t xml:space="preserve"> </w:t>
       </w:r>
       <w:r>
-        <w:t xml:space="preserve">was chosen by a one-standard-error rule: for each rank, the Bayesian-optimization configuration with the highest observed mean cross-validated C-index was retained, the threshold was set one fold-level standard error below the overall best configuration’s mean, and the smallest rank whose retained configuration met the threshold was selected; the remaining hyperparameters were those of the overall best configuration (Supplementary Information, Bayesian Optimization). All model selection was performed entirely within the training data using cross-validation; no validation cohort data were used during any stage of tuning, and out-of-sample generalization was assessed only on the external validation cohorts. Each fold was trained using multiple random initializations, and fold-level performance was defined as the average C-index across initializations; the consensus initialization described next was used only for the final model and is not reproduced within each fold. For stability, we used a consensus-based initialization for the final model, aggregating multiple DeSurv runs into a gene-gene co-occurrence matrix and constructing an initialization</w:t>
+        <w:t xml:space="preserve">was chosen by a one-standard-error rule: for each rank, the Bayesian-optimization configuration with the highest observed mean cross-validated C-index was retained, the threshold was set one fold-level standard error below the overall best configuration’s mean, and the smallest rank whose retained configuration met the threshold was selected; the remaining hyperparameters were those of the overall best configuration (Supplementary Information, Bayesian Optimization). All model selection was performed entirely within the training data using cross-validation; no validation cohort data were used during any stage of tuning, and out-of-sample generalization was assessed only on the external validation cohorts. Each fold was trained using multiple random initializations, and fold-level performance was defined as the average C-index across initializations; the consensus initialization described next was used only for the final model and is not reproduced within each fold.</w:t>
+      </w:r>
+    </w:p>
+    <w:p>
+      <w:pPr>
+        <w:pStyle w:val="BodyText"/>
+      </w:pPr>
+      <w:r>
+        <w:t xml:space="preserve">The consensus initialization aggregates multiple DeSurv runs into a gene-gene co-occurrence matrix and constructs an initialization</w:t>
       </w:r>
       <w:r>
         <w:t xml:space="preserve"> </w:t>
@@ -7566,7 +7528,15 @@
         <w:t xml:space="preserve"> </w:t>
       </w:r>
       <w:r>
-        <w:t xml:space="preserve">from the resulting clusters (Supplementary Information, Consensus initialization for the final model). Before projection, the gene support was restricted to the union across factors of each program’s BO-selected top genes, ranked by factor specificity (Supplementary Information, Section 8), giving the truncated matrix</w:t>
+        <w:t xml:space="preserve">from the resulting clusters (Supplementary Information, Consensus initialization for the final model).</w:t>
+      </w:r>
+    </w:p>
+    <w:p>
+      <w:pPr>
+        <w:pStyle w:val="BodyText"/>
+      </w:pPr>
+      <w:r>
+        <w:t xml:space="preserve">Before projection, the gene support was restricted to the union of each program’s BO-selected top genes, ranked by factor specificity (Supplementary Information, Section 8), giving the truncated matrix</w:t>
       </w:r>
       <w:r>
         <w:t xml:space="preserve"> </w:t>
@@ -7587,7 +7557,15 @@
         <w:t xml:space="preserve"> </w:t>
       </w:r>
       <w:r>
-        <w:t xml:space="preserve">that was held fixed for all validation cohorts. Two scoring conventions follow from this support and are used for different quantities. Factor-level scores retain all</w:t>
+        <w:t xml:space="preserve">that was held fixed for all validation cohorts.</w:t>
+      </w:r>
+    </w:p>
+    <w:p>
+      <w:pPr>
+        <w:pStyle w:val="BodyText"/>
+      </w:pPr>
+      <w:r>
+        <w:t xml:space="preserve">Two scoring conventions follow from this support and are used for different quantities. Factor-level scores retain all</w:t>
       </w:r>
       <w:r>
         <w:t xml:space="preserve"> </w:t>
@@ -7740,7 +7718,15 @@
         </m:r>
       </m:oMath>
       <w:r>
-        <w:t xml:space="preserve">. In PDAC, BO selected</w:t>
+        <w:t xml:space="preserve">.</w:t>
+      </w:r>
+    </w:p>
+    <w:p>
+      <w:pPr>
+        <w:pStyle w:val="BodyText"/>
+      </w:pPr>
+      <w:r>
+        <w:t xml:space="preserve">In PDAC, BO selected</w:t>
       </w:r>
       <w:r>
         <w:t xml:space="preserve"> </w:t>
@@ -7776,7 +7762,7 @@
         <w:t xml:space="preserve"> </w:t>
       </w:r>
       <w:r>
-        <w:t xml:space="preserve">top genes per factor. The ridge penalty on the loadings (</w:t>
+        <w:t xml:space="preserve">genes per factor. The ridge penalty on the loadings (</w:t>
       </w:r>
       <m:oMath>
         <m:r>
@@ -8013,7 +7999,7 @@
         </m:sSub>
       </m:oMath>
       <w:r>
-        <w:t xml:space="preserve">, and survival associations were evaluated using Harrell’s C-index, hazard ratios and log-rank statistics. Harrell’s C-index is rank-based and assesses discrimination only, not calibration or time-dependent prediction error, so we additionally report a proper score as a sensitivity check. This is the integrated Brier score and its index of prediction accuracy relative to a Kaplan–Meier reference (Supplementary Information, Proper-scoring sensitivity of the external validation).</w:t>
+        <w:t xml:space="preserve">, and survival associations were evaluated using Harrell’s C-index and hazard ratios. Harrell’s C-index is rank-based and assesses discrimination only, not calibration or time-dependent prediction error, so we additionally report a proper score as a sensitivity check. This is the integrated Brier score and its index of prediction accuracy relative to a Kaplan–Meier reference (Supplementary Information, Proper-scoring sensitivity of the external validation).</w:t>
       </w:r>
     </w:p>
     <w:p>
@@ -8086,7 +8072,7 @@
         </w:r>
       </w:hyperlink>
       <w:r>
-        <w:t xml:space="preserve">. Because the risk score under either formulation is a function of the sample loadings rather than of the gene-program basis, scoring an external cohort requires re-estimating those loadings; SurvNMF obtains them for held-out samples by a constrained least-squares fit (Supplementary Table [tab:architecture]). Validation survival outcomes were therefore used only for downstream performance evaluation, so reported external hazard ratios and log-rank statistics reflect purely out-of-sample generalization. Further training and validation details appear in Supplementary Information, Part I.</w:t>
+        <w:t xml:space="preserve">. Because the risk score under either formulation is a function of the sample loadings rather than of the gene-program basis, scoring an external cohort requires re-estimating those loadings; SurvNMF obtains them for held-out samples by a constrained least-squares fit (Supplementary Table [tab:architecture]). Validation survival outcomes were therefore used only for downstream performance evaluation, so reported external hazard ratios reflect purely out-of-sample generalization. Further training and validation details appear in Supplementary Information, Part I.</w:t>
       </w:r>
     </w:p>
     <w:p>
@@ -8094,7 +8080,7 @@
         <w:pStyle w:val="BodyText"/>
       </w:pPr>
       <w:r>
-        <w:t xml:space="preserve">To characterize the biological identity of the learned factors, we quantified how strongly each factor’s gene loadings aligned with independently defined PDAC tumor and microenvironmental gene programs. For each factor, we correlated its gene loadings with binary membership indicators for each reference program (Spearman correlation computed over the union of the top 50 genes of all factors of that method, intersected with the reference-program gene universe; this differs from the factor-to-factor loading correlations, which use all analysed genes), annotating Benjamini–Hochberg-adjusted</w:t>
+        <w:t xml:space="preserve">To characterize the biological identity of the learned factors, we quantified how strongly each factor’s gene loadings aligned with independently defined PDAC tumor and microenvironmental gene programs. For each factor, we correlated its gene loadings with binary membership indicators for each reference program (Spearman correlation computed over the union of the top 50 genes of all factors of that method, intersected with the reference-program gene universe; this differs from the factor-to-factor loading correlations, which use all analyzed genes), annotating Benjamini–Hochberg-adjusted</w:t>
       </w:r>
       <w:r>
         <w:t xml:space="preserve"> </w:t>
@@ -8125,7 +8111,7 @@
         <w:t xml:space="preserve">NMF::nmf</w:t>
       </w:r>
       <w:r>
-        <w:t xml:space="preserve">), the field-standard implementation, which does not receive DeSurv’s consensus initialization or hyperparameter tuning. We therefore also fit a matched-budget unsupervised control, which removes supervision and holds every other component of the DeSurv procedure fixed. Bayesian optimization was run with</w:t>
+        <w:t xml:space="preserve">), which does not receive DeSurv’s consensus initialization or hyperparameter tuning. We therefore also fit a matched-budget unsupervised control, which removes supervision and holds every other component of the DeSurv procedure fixed. Bayesian optimization was run with</w:t>
       </w:r>
       <w:r>
         <w:t xml:space="preserve"> </w:t>
@@ -8150,7 +8136,7 @@
         </m:r>
       </m:oMath>
       <w:r>
-        <w:t xml:space="preserve">, using the same optimizer, search budget, gene filter and cross-validation folds. The selected model was then fit by the same 100-restart consensus procedure. This control isolates the contribution of survival supervision while holding rank, optimization procedure, tuning budget, gene filtering and cross-validation folds fixed. A further sensitivity analysis instead held DeSurv’s own</w:t>
+        <w:t xml:space="preserve">, using the same optimizer, search budget, gene filter and cross-validation folds. The selected model was then fit by the same 100-restart consensus procedure. This control isolates the contribution of survival supervision. A further sensitivity analysis instead held DeSurv’s own</w:t>
       </w:r>
       <w:r>
         <w:t xml:space="preserve"> </w:t>
@@ -8348,7 +8334,7 @@
         <w:t xml:space="preserve"> </w:t>
       </w:r>
       <w:r>
-        <w:t xml:space="preserve">with</w:t>
+        <w:t xml:space="preserve">with mixing parameter 1, distinct from DeSurv’s supervision parameter</w:t>
       </w:r>
       <w:r>
         <w:t xml:space="preserve"> </w:t>
@@ -8357,6 +8343,14 @@
         <m:r>
           <m:t>α</m:t>
         </m:r>
+      </m:oMath>
+      <w:r>
+        <w:t xml:space="preserve">), whereas supervised principal components applies no penalty at all, instead screening genes by a cross-validated feature-score threshold and extracting a cross-validated number of components. DeSurv’s internal Cox step uses an elastic net whose Bayesian-optimization-selected mixing parameter (</w:t>
+      </w:r>
+      <m:oMath>
+        <m:r>
+          <m:t>ξ</m:t>
+        </m:r>
         <m:r>
           <m:rPr>
             <m:sty m:val="p"/>
@@ -8364,23 +8358,6 @@
           <m:t>=</m:t>
         </m:r>
         <m:r>
-          <m:t>1</m:t>
-        </m:r>
-      </m:oMath>
-      <w:r>
-        <w:t xml:space="preserve">), whereas supervised principal components applies no penalty at all, instead screening genes by a cross-validated feature-score threshold and extracting a cross-validated number of components. DeSurv’s internal Cox step uses an elastic net whose Bayesian-optimization-selected mixing parameter (</w:t>
-      </w:r>
-      <m:oMath>
-        <m:r>
-          <m:t>ξ</m:t>
-        </m:r>
-        <m:r>
-          <m:rPr>
-            <m:sty m:val="p"/>
-          </m:rPr>
-          <m:t>=</m:t>
-        </m:r>
-        <m:r>
           <m:t>0.056</m:t>
         </m:r>
       </m:oMath>
@@ -8393,7 +8370,7 @@
         <w:pStyle w:val="BodyText"/>
       </w:pPr>
       <w:r>
-        <w:t xml:space="preserve">No matched-budget control was run for these supervised comparators, as it was for the unsupervised arm, so the comparison with them concerns what each representation resolves, not tuned predictive performance. Correspondence between each supervised risk score and the DeSurv programs D1–D3 was quantified in the training cohort using absolute Spearman correlation. Additional analyses of selected-gene enrichment and compartment attribution are described in the Supplementary Information.</w:t>
+        <w:t xml:space="preserve">No matched-budget control was run for these supervised comparators, as was done for the unsupervised arm. Correspondence between each supervised risk score and the DeSurv programs D1–D3 was quantified in the training cohort using absolute Pearson correlation. Additional analyses of selected-gene enrichment and compartment attribution are described in the Supplementary Information.</w:t>
       </w:r>
     </w:p>
     <w:bookmarkEnd w:id="45"/>
@@ -8411,7 +8388,7 @@
         <w:pStyle w:val="FirstParagraph"/>
       </w:pPr>
       <w:r>
-        <w:t xml:space="preserve">Simulation studies were conducted to assess recovery of prognostic latent structure and survival prediction under controlled conditions. Gene expression data were generated from a nonnegative factor model</w:t>
+        <w:t xml:space="preserve">Simulation studies were conducted to assess recovery of prognostic latent structure and survival prediction under controlled conditions in three scenarios: a prognostic scenario in which the factor-specific survival signal contributes little transcriptomic variation relative to the shared outcome-neutral background, a null scenario with no survival signal, and a mixed scenario where prognostic and variance-dominant signals partially overlap. Gene expression data were generated from a nonnegative factor model</w:t>
       </w:r>
       <w:r>
         <w:t xml:space="preserve"> </w:t>
@@ -8686,7 +8663,7 @@
       </w:r>
       <m:oMath>
         <m:r>
-          <m:t>G</m:t>
+          <m:t>p</m:t>
         </m:r>
         <m:r>
           <m:rPr>
@@ -8718,7 +8695,7 @@
       </w:r>
       <m:oMath>
         <m:r>
-          <m:t>N</m:t>
+          <m:t>n</m:t>
         </m:r>
         <m:r>
           <m:rPr>
@@ -8741,7 +8718,7 @@
       </w:r>
       <m:oMath>
         <m:r>
-          <m:t>K</m:t>
+          <m:t>k</m:t>
         </m:r>
         <m:r>
           <m:rPr>
@@ -8820,7 +8797,7 @@
         <w:t xml:space="preserve"> </w:t>
       </w:r>
       <w:r>
-        <w:t xml:space="preserve">in the prognostic scenario,</w:t>
+        <w:t xml:space="preserve">in the prognostic and mixed scenarios and</w:t>
       </w:r>
       <w:r>
         <w:t xml:space="preserve"> </w:t>
@@ -8843,70 +8820,7 @@
         <w:t xml:space="preserve"> </w:t>
       </w:r>
       <w:r>
-        <w:t xml:space="preserve">in the null scenario, and</w:t>
-      </w:r>
-      <w:r>
-        <w:t xml:space="preserve"> </w:t>
-      </w:r>
-      <m:oMath>
-        <m:r>
-          <m:t>β</m:t>
-        </m:r>
-        <m:r>
-          <m:rPr>
-            <m:sty m:val="p"/>
-          </m:rPr>
-          <m:t>=</m:t>
-        </m:r>
-        <m:sSup>
-          <m:e>
-            <m:d>
-              <m:dPr>
-                <m:begChr m:val="("/>
-                <m:endChr m:val=")"/>
-                <m:sepChr m:val=""/>
-                <m:grow/>
-              </m:dPr>
-              <m:e>
-                <m:r>
-                  <m:t>2</m:t>
-                </m:r>
-                <m:r>
-                  <m:rPr>
-                    <m:sty m:val="p"/>
-                  </m:rPr>
-                  <m:t>,</m:t>
-                </m:r>
-                <m:r>
-                  <m:t>0</m:t>
-                </m:r>
-                <m:r>
-                  <m:rPr>
-                    <m:sty m:val="p"/>
-                  </m:rPr>
-                  <m:t>,</m:t>
-                </m:r>
-                <m:r>
-                  <m:t>0</m:t>
-                </m:r>
-              </m:e>
-            </m:d>
-          </m:e>
-          <m:sup>
-            <m:r>
-              <m:rPr>
-                <m:sty m:val="p"/>
-              </m:rPr>
-              <m:t>⊤</m:t>
-            </m:r>
-          </m:sup>
-        </m:sSup>
-      </m:oMath>
-      <w:r>
-        <w:t xml:space="preserve"> </w:t>
-      </w:r>
-      <w:r>
-        <w:t xml:space="preserve">in the mixed scenario where survival risk was driven by 300 genes comprising the 150 factor-1 markers and 150 randomly sampled background genes, creating partial overlap between the prognostic signal and variance-dominant outcome-neutral programs.</w:t>
+        <w:t xml:space="preserve">in the null scenario; the mixed scenario differs from the prognostic scenario only in its survival gene set, 300 genes comprising the 150 factor-1 markers and 150 randomly sampled background genes, which creates partial overlap between the prognostic signal and the variance-dominant outcome-neutral background.</w:t>
       </w:r>
     </w:p>
     <w:p>
@@ -8942,22 +8856,7 @@
           </m:rPr>
           <m:t>=</m:t>
         </m:r>
-        <m:sSup>
-          <m:e>
-            <m:r>
-              <m:t>X</m:t>
-            </m:r>
-          </m:e>
-          <m:sup>
-            <m:r>
-              <m:rPr>
-                <m:sty m:val="p"/>
-              </m:rPr>
-              <m:t>⊤</m:t>
-            </m:r>
-          </m:sup>
-        </m:sSup>
-        <m:sSub>
+        <m:sSubSup>
           <m:e>
             <m:r>
               <m:t>W</m:t>
@@ -8972,7 +8871,18 @@
               <m:t>true</m:t>
             </m:r>
           </m:sub>
-        </m:sSub>
+          <m:sup>
+            <m:r>
+              <m:rPr>
+                <m:sty m:val="p"/>
+              </m:rPr>
+              <m:t>⊤</m:t>
+            </m:r>
+          </m:sup>
+        </m:sSubSup>
+        <m:r>
+          <m:t>X</m:t>
+        </m:r>
       </m:oMath>
       <w:r>
         <w:t xml:space="preserve">, where</w:t>
@@ -9173,7 +9083,7 @@
         </m:r>
       </m:oMath>
       <w:r>
-        <w:t xml:space="preserve">, the unsupervised limit of the same pipeline) followed by Cox regression on inferred factors, both tuned using cross-validated concordance index via Bayesian optimization. Performance was summarized across repeated simulation replicates using test-set concordance and matched-factor precision of prognostic-gene recovery.</w:t>
+        <w:t xml:space="preserve">, the unsupervised limit of the same pipeline) followed by Cox regression on inferred factors, both tuned using cross-validated concordance index via Bayesian optimization. Performance was summarized across replicates using test-set concordance and matched-factor precision of prognostic-gene recovery.</w:t>
       </w:r>
     </w:p>
     <w:p>
@@ -9232,7 +9142,7 @@
         <w:t xml:space="preserve"> </w:t>
       </w:r>
       <w:r>
-        <w:t xml:space="preserve">set to the Bayesian-optimization-selected signature size. We report the average across survival-driving factors. We also report global marker recall, the fraction of the true survival-gene set recovered anywhere in the union of all learned factors’ top-</w:t>
+        <w:t xml:space="preserve">set to the Bayesian-optimization-selected signature size. Because the matching selects the factor by the precision that is then reported, matched-factor precision is optimistic by construction. We also report global marker recall, the fraction of the true survival-gene set recovered anywhere in the union of all learned factors’ top-</w:t>
       </w:r>
       <m:oMath>
         <m:sSub>
@@ -9331,14 +9241,6 @@
         <w:t xml:space="preserve">); in the mixed scenario, marker-only and full survival-gene definitions of the target were evaluated separately.</w:t>
       </w:r>
     </w:p>
-    <w:p>
-      <w:pPr>
-        <w:pStyle w:val="BodyText"/>
-      </w:pPr>
-      <w:r>
-        <w:t xml:space="preserve">We considered three simulation scenarios: a prognostic scenario in which the factor-specific survival signal contributes little transcriptomic variation relative to the shared outcome-neutral background, a null scenario with no survival signal, and a mixed scenario where prognostic and variance-dominant signals partially overlap.</w:t>
-      </w:r>
-    </w:p>
     <w:bookmarkEnd w:id="46"/>
     <w:bookmarkStart w:id="47" w:name="real-world-datasets"/>
     <w:p>
@@ -9363,7 +9265,7 @@
         <w:t xml:space="preserve">2</w:t>
       </w:r>
       <w:r>
-        <w:t xml:space="preserve">(TPM + 1); microarray cohorts in platform-normalized log-scale intensities. Within each training cohort, genes were ranked separately by mean expression and variance, and the 3,000 genes with the smallest sum of the mean-expression and variance ranks were retained, selecting genes that are both highly expressed and highly variable. The intersection across training cohorts yielded 1,970 genes used for all analyses. Validation datasets were restricted to this same gene set. Survival times and censoring indicators were taken from the associated clinical annotations. No missing-data imputation was performed: all analyses used complete cases, and analyses adjusted for the PurIST and DeCAF classifiers were restricted to samples with available classifier calls. Of the seven PDAC expression datasets we considered, two were used for training (TCGA and CPTAC) and five for external validation (Dijk, Moffitt, PACA-AU array, PACA-AU RNA-seq, and Puleo); because the two PACA-AU platforms profile one patient cohort, these five validation datasets span four independent patient cohorts. To harmonize differences in scale across cohorts, filtered gene expression data were within-sample rank transformed before model training (ranks are inherently nonnegative, preserving NMF compatibility). Within-sample ranking reduces platform- and library-size differences in expression scale that would otherwise dominate cross-cohort projection. More details about the datasets can be found in Supplementary Information, Section 6.</w:t>
+        <w:t xml:space="preserve">(TPM + 1); microarray cohorts in platform-normalized log-scale intensities. Within each training cohort, genes were ranked separately in descending order of mean expression and of variance, and the 3,000 genes with the smallest sum of the two ranks were retained, selecting genes that are both highly expressed and highly variable. The intersection across training cohorts yielded 1,970 genes used for all analyses. Validation datasets were restricted to this same gene set. Survival times and censoring indicators were taken from the associated clinical annotations. No missing-data imputation was performed: all analyses used complete cases, and analyses adjusted for the PurIST and DeCAF classifiers were restricted to samples with available classifier calls. Of the seven PDAC expression datasets we considered, two were used for training (TCGA and CPTAC) and five for external validation (Dijk, Moffitt, PACA-AU array, PACA-AU RNA-seq, and Puleo); because the two PACA-AU platforms profile one patient cohort, these five validation datasets span four independent patient cohorts. To harmonize differences in scale across cohorts, filtered gene expression data were within-sample rank transformed before model training (ranks are inherently nonnegative, preserving NMF compatibility). Within-sample ranking reduces platform- and library-size differences in expression scale that would otherwise dominate cross-cohort projection. More details about the datasets can be found in Supplementary Information, Section 6.</w:t>
       </w:r>
     </w:p>
     <w:p>
@@ -9411,7 +9313,7 @@
         </m:r>
       </m:oMath>
       <w:r>
-        <w:t xml:space="preserve">), 48 were excluded for missing survival time, missing event indicator, missing tumor grade (a data-loading filter applied to the analytic training cohort; grade is not used by the model), or quality-control failure, yielding 273 analytic training samples (TCGA-PAAD 144, CPTAC-3 129; 139 events). Of 979 pooled validation-cohort samples, 363 were excluded for non-PDAC histology, non-tumor tissue, or missing survival annotation, yielding 616 analytic validation profiles across five platform datasets: Dijk (</w:t>
+        <w:t xml:space="preserve">), 48 were excluded for missing survival time, missing event indicator, missing tumor grade (an inclusion criterion of the curated training set, not a model input), or quality-control failure, yielding 273 analytic training samples (TCGA-PAAD 144, CPTAC-3 129; 139 events). Of 979 pooled validation-cohort samples, 363 were excluded for non-PDAC histology, non-tumor tissue, or missing survival annotation, yielding 616 analytic validation profiles across five platform datasets: Dijk (</w:t>
       </w:r>
       <m:oMath>
         <m:r>
@@ -9520,12 +9422,30 @@
       </w:r>
     </w:p>
     <w:bookmarkEnd w:id="47"/>
-    <w:bookmarkStart w:id="48" w:name="treated-cohort-analyses"/>
+    <w:bookmarkStart w:id="48" w:name="ethics-sex-and-gender-and-ancestry"/>
     <w:p>
       <w:pPr>
         <w:pStyle w:val="Heading2"/>
       </w:pPr>
       <w:r>
+        <w:t xml:space="preserve">Ethics, sex and gender, and ancestry</w:t>
+      </w:r>
+    </w:p>
+    <w:p>
+      <w:pPr>
+        <w:pStyle w:val="FirstParagraph"/>
+      </w:pPr>
+      <w:r>
+        <w:t xml:space="preserve">Each dataset was collected under the ethical approvals and consent procedures of the original study. This secondary analysis used only de-identified, previously collected data and was not submitted for separate Institutional Review Board (IRB) review at the University of North Carolina at Chapel Hill. The patient cohorts analyzed in this study were curated by the original investigators or consortia (TCGA, CPTAC, ICGC, and the original Moffitt, Dijk, and Puleo studies) and our access was limited to the de-identified expression and survival data they provide. Sex was recorded in every cohort and was included as a covariate in the clinical-adjustment analyses (Supplementary Table [tab:clinical-adjustment]), where the prognostic association of the DeSurv linear predictor was unchanged. We did not conduct sex-stratified analyses, because the study was not powered for subgroup comparisons within individual cohorts, and we did not stratify by race or ethnicity because those annotations were not consistently available across cohorts. Whether the prognostic relevance of these gene programs differs by sex, race, or ethnicity remains an important question for adequately powered, more comprehensively annotated cohorts.</w:t>
+      </w:r>
+    </w:p>
+    <w:bookmarkEnd w:id="48"/>
+    <w:bookmarkStart w:id="49" w:name="treated-cohort-analyses"/>
+    <w:p>
+      <w:pPr>
+        <w:pStyle w:val="Heading2"/>
+      </w:pPr>
+      <w:r>
         <w:t xml:space="preserve">Treated-cohort analyses</w:t>
       </w:r>
     </w:p>
@@ -9554,11 +9474,11 @@
         <w:t xml:space="preserve"> </w:t>
       </w:r>
       <w:r>
-        <w:t xml:space="preserve">patients, 123 deaths; laser-capture microdissected, epithelial-enriched expression), the projected D1 score was reported both as arm-specific estimates and as a common slope from a Cox model stratified by treatment arm, which allows arm-specific baseline hazards, with a treatment-by-D1 interaction test reported descriptively; no estimate is pooled across cohorts. In the Linehan cohort of borderline-resectable or locally advanced disease, 29 patients with paired pre- and post-treatment biopsies were compared on the projected D2 score by a paired Wilcoxon signed-rank test; this analysis concerns program level, not survival. Both analyses were exploratory and not preregistered.</w:t>
-      </w:r>
-    </w:p>
-    <w:bookmarkEnd w:id="48"/>
-    <w:bookmarkStart w:id="49" w:name="use-of-large-language-models"/>
+        <w:t xml:space="preserve">patients, 123 deaths; laser-capture microdissected, epithelial-enriched expression), the association of the projected D1 score with survival was reported both as arm-specific estimates and as a common slope from a Cox model stratified by treatment arm, which allows arm-specific baseline hazards, with a treatment-by-D1 interaction test reported descriptively; no estimate is pooled across cohorts. In the Linehan cohort of borderline-resectable or locally advanced disease, 29 patients with paired pre- and post-treatment biopsies were compared on the projected D2 score by a paired Wilcoxon signed-rank test; this analysis concerns program level, not survival. Both analyses were exploratory and not preregistered.</w:t>
+      </w:r>
+    </w:p>
+    <w:bookmarkEnd w:id="49"/>
+    <w:bookmarkStart w:id="50" w:name="use-of-large-language-models"/>
     <w:p>
       <w:pPr>
         <w:pStyle w:val="Heading2"/>
@@ -9575,9 +9495,9 @@
         <w:t xml:space="preserve">During preparation of this manuscript, the authors used large language models (Claude, Anthropic; ChatGPT, OpenAI) for language editing, for assistance with code used to generate and format the display items, for verification of the written algorithm description against the released code, and for critical review of the manuscript’s presentation and evidentiary framing. All model output was directed, reviewed, and verified by the authors, who take full responsibility for the work. The models were not used to design the study or to develop the DeSurv methodology, and they do not meet the criteria for authorship.</w:t>
       </w:r>
     </w:p>
-    <w:bookmarkEnd w:id="49"/>
     <w:bookmarkEnd w:id="50"/>
-    <w:bookmarkStart w:id="51" w:name="data-availability"/>
+    <w:bookmarkEnd w:id="51"/>
+    <w:bookmarkStart w:id="52" w:name="data-availability"/>
     <w:p>
       <w:pPr>
         <w:pStyle w:val="Heading1"/>
@@ -9591,7 +9511,7 @@
         <w:pStyle w:val="FirstParagraph"/>
       </w:pPr>
       <w:r>
-        <w:t xml:space="preserve">The training and validation datasets used in this study are publicly available or accessible through controlled-access repositories, and are de-identified; no Institutional Review Board (IRB) approval was required for their analysis. Training data were obtained from the Genomic Data Commons: TCGA-PAAD</w:t>
+        <w:t xml:space="preserve">The training and validation datasets used in this study are publicly available or accessible through controlled-access repositories. Training data were obtained from the Genomic Data Commons: TCGA-PAAD</w:t>
       </w:r>
       <w:hyperlink w:anchor="ref-data_tcga_paad">
         <w:r>
@@ -9704,8 +9624,8 @@
         <w:t xml:space="preserve">), so that every treated-cohort value can be inspected and verified. Code used to generate the COMPASS D1–GATA6 comparison (main-text Fig. [fig:pdac]e) is also provided in the reproducibility repository; reproduction of the patient-level analysis requires authorized access to the COMPASS data.</w:t>
       </w:r>
     </w:p>
-    <w:bookmarkEnd w:id="51"/>
-    <w:bookmarkStart w:id="54" w:name="code-availability"/>
+    <w:bookmarkEnd w:id="52"/>
+    <w:bookmarkStart w:id="55" w:name="code-availability"/>
     <w:p>
       <w:pPr>
         <w:pStyle w:val="Heading1"/>
@@ -9730,6 +9650,12 @@
         </w:rPr>
         <w:t xml:space="preserve">NMF</w:t>
       </w:r>
+      <w:r>
+        <w:t xml:space="preserve"> </w:t>
+      </w:r>
+      <w:r>
+        <w:t xml:space="preserve">(v0.28)</w:t>
+      </w:r>
       <w:hyperlink w:anchor="ref-gaujoux2010flexible">
         <w:r>
           <w:rPr>
@@ -9751,6 +9677,12 @@
         </w:rPr>
         <w:t xml:space="preserve">glmnet</w:t>
       </w:r>
+      <w:r>
+        <w:t xml:space="preserve"> </w:t>
+      </w:r>
+      <w:r>
+        <w:t xml:space="preserve">(v5.0)</w:t>
+      </w:r>
       <w:hyperlink w:anchor="ref-simon2011regularization">
         <w:r>
           <w:rPr>
@@ -9773,7 +9705,10 @@
         <w:t xml:space="preserve">survival</w:t>
       </w:r>
       <w:r>
-        <w:t xml:space="preserve">,</w:t>
+        <w:t xml:space="preserve"> </w:t>
+      </w:r>
+      <w:r>
+        <w:t xml:space="preserve">(v3.8.6),</w:t>
       </w:r>
       <w:r>
         <w:t xml:space="preserve"> </w:t>
@@ -9785,7 +9720,10 @@
         <w:t xml:space="preserve">ggplot2</w:t>
       </w:r>
       <w:r>
-        <w:t xml:space="preserve">, and</w:t>
+        <w:t xml:space="preserve"> </w:t>
+      </w:r>
+      <w:r>
+        <w:t xml:space="preserve">(v4.0.3) and</w:t>
       </w:r>
       <w:r>
         <w:t xml:space="preserve"> </w:t>
@@ -9797,12 +9735,15 @@
         <w:t xml:space="preserve">cowplot</w:t>
       </w:r>
       <w:r>
-        <w:t xml:space="preserve">; Bayesian optimization for hyperparameter selection was implemented within DeSurv. The DeSurv R package is available at</w:t>
-      </w:r>
-      <w:r>
-        <w:t xml:space="preserve"> </w:t>
-      </w:r>
-      <w:hyperlink r:id="rId52">
+        <w:t xml:space="preserve"> </w:t>
+      </w:r>
+      <w:r>
+        <w:t xml:space="preserve">(v1.2.0); Bayesian optimization for hyperparameter selection was implemented within DeSurv. The DeSurv R package is available at</w:t>
+      </w:r>
+      <w:r>
+        <w:t xml:space="preserve"> </w:t>
+      </w:r>
+      <w:hyperlink r:id="rId53">
         <w:r>
           <w:rPr>
             <w:rStyle w:val="Hyperlink"/>
@@ -9831,7 +9772,7 @@
       <w:r>
         <w:t xml:space="preserve"> </w:t>
       </w:r>
-      <w:hyperlink r:id="rId53">
+      <w:hyperlink r:id="rId54">
         <w:r>
           <w:rPr>
             <w:rStyle w:val="Hyperlink"/>
@@ -9870,8 +9811,8 @@
         <w:t xml:space="preserve">, which generates the treated-cohort summary statistics above.</w:t>
       </w:r>
     </w:p>
-    <w:bookmarkEnd w:id="54"/>
-    <w:bookmarkStart w:id="55" w:name="acknowledgements"/>
+    <w:bookmarkEnd w:id="55"/>
+    <w:bookmarkStart w:id="56" w:name="acknowledgements"/>
     <w:p>
       <w:pPr>
         <w:pStyle w:val="Heading1"/>
@@ -9888,78 +9829,116 @@
         <w:t xml:space="preserve">This work was supported by the National Cancer Institute grants U01 CA274298, P50 CA257911, T32 CA106209, and R01 CA288145, and by the Department of Defense Peer Reviewed Cancer Research Program (HT9425241103100121). We thank the patients and research teams who contributed samples and clinical data to the public cohorts used here (TCGA, CPTAC, Dijk, Moffitt, Puleo, PACA-AU).</w:t>
       </w:r>
     </w:p>
-    <w:p>
-      <w:pPr>
-        <w:pStyle w:val="BodyText"/>
-      </w:pPr>
+    <w:bookmarkEnd w:id="56"/>
+    <w:bookmarkStart w:id="57" w:name="author-contributions"/>
+    <w:p>
+      <w:pPr>
+        <w:pStyle w:val="Heading1"/>
+      </w:pPr>
+      <w:r>
+        <w:t xml:space="preserve">Author Contributions</w:t>
+      </w:r>
+    </w:p>
+    <w:p>
+      <w:pPr>
+        <w:pStyle w:val="FirstParagraph"/>
+      </w:pPr>
+      <w:r>
+        <w:t xml:space="preserve">Conceptualization: A.M.Y., N.U.R. Methodology: A.M.Y., A.Y., D.L., N.U.R. Software: A.M.Y. Formal analysis: A.M.Y. Investigation: A.M.Y. Data curation: A.M.Y., X.L.P. Visualization: A.M.Y. Writing – original draft: A.M.Y., N.U.R. Writing – review and editing: A.M.Y., A.Y., X.L.P., J.J.Y., D.L., N.U.R. Resources (PDAC domain expertise and biological interpretation): X.L.P., J.J.Y. Supervision: N.U.R. Funding acquisition: A.M.Y., N.U.R. All authors reviewed and approved the final manuscript.</w:t>
+      </w:r>
+    </w:p>
+    <w:bookmarkEnd w:id="57"/>
+    <w:bookmarkStart w:id="58" w:name="competing-interests"/>
+    <w:p>
+      <w:pPr>
+        <w:pStyle w:val="Heading1"/>
+      </w:pPr>
+      <w:r>
+        <w:t xml:space="preserve">Competing Interests</w:t>
+      </w:r>
+    </w:p>
+    <w:p>
+      <w:pPr>
+        <w:pStyle w:val="FirstParagraph"/>
+      </w:pPr>
+      <w:r>
+        <w:t xml:space="preserve">N.U.R. and J.J.Y. are named as inventors on US patents US20220127676A1 and US20250066856A1, which relate to pancreatic cancer subtype classification. The PurIST and DeCAF classifiers were used only as published, independently derived comparators: their subtype calls were obtained with the released classifiers and enter only as fixed covariates in the adjustment analyses, not as components of DeSurv. The other authors declare no competing interests.</w:t>
+      </w:r>
+    </w:p>
+    <w:bookmarkEnd w:id="58"/>
+    <w:bookmarkStart w:id="151" w:name="references"/>
+    <w:p>
+      <w:pPr>
+        <w:pStyle w:val="Heading1"/>
+      </w:pPr>
+      <w:r>
+        <w:t xml:space="preserve">References</w:t>
+      </w:r>
+    </w:p>
+    <w:bookmarkStart w:id="150" w:name="refs"/>
+    <w:bookmarkStart w:id="60" w:name="ref-siegel2026cancer"/>
+    <w:p>
+      <w:pPr>
+        <w:pStyle w:val="Bibliography"/>
+      </w:pPr>
+      <w:r>
+        <w:t xml:space="preserve">1.</w:t>
+      </w:r>
+      <w:r>
+        <w:t xml:space="preserve"> </w:t>
+      </w:r>
+      <w:r>
+        <w:t xml:space="preserve">	</w:t>
+      </w:r>
+      <w:r>
+        <w:t xml:space="preserve">Siegel, R. L., Kratzer, T. B., Wagle, N. S., Sung, H. &amp; Jemal, A.</w:t>
+      </w:r>
+      <w:r>
+        <w:t xml:space="preserve"> </w:t>
+      </w:r>
+      <w:hyperlink r:id="rId59">
+        <w:r>
+          <w:rPr>
+            <w:rStyle w:val="Hyperlink"/>
+          </w:rPr>
+          <w:t xml:space="preserve">Cancer statistics, 2026</w:t>
+        </w:r>
+      </w:hyperlink>
+      <w:r>
+        <w:t xml:space="preserve">.</w:t>
+      </w:r>
+      <w:r>
+        <w:t xml:space="preserve"> </w:t>
+      </w:r>
+      <w:r>
+        <w:rPr>
+          <w:iCs/>
+          <w:i/>
+        </w:rPr>
+        <w:t xml:space="preserve">CA: A Cancer Journal for Clinicians</w:t>
+      </w:r>
+      <w:r>
+        <w:t xml:space="preserve"> </w:t>
+      </w:r>
       <w:r>
         <w:rPr>
           <w:bCs/>
           <w:b/>
         </w:rPr>
-        <w:t xml:space="preserve">Inclusion and Diversity.</w:t>
-      </w:r>
-      <w:r>
-        <w:t xml:space="preserve"> </w:t>
-      </w:r>
-      <w:r>
-        <w:t xml:space="preserve">The patient cohorts analyzed in this study were curated by the original investigators or consortia (TCGA, CPTAC, ICGC, and the original Moffitt, Dijk, and Puleo studies) and our access was limited to the de-identified expression and survival data they provide. Sex was recorded in every cohort and was included as a covariate in the clinical-adjustment analyses (Supplementary Table [tab:clinical-adjustment]), where the prognostic association of the DeSurv linear predictor was unchanged. We did not conduct sex-stratified analyses, because the study was not powered for subgroup comparisons within individual cohorts, and we did not stratify by race or ethnicity because those annotations were not consistently available across cohorts. Whether the prognostic relevance of these gene programs differs by sex, race, or ethnicity remains an important question for adequately powered, more comprehensively annotated cohorts.</w:t>
-      </w:r>
-    </w:p>
-    <w:bookmarkEnd w:id="55"/>
-    <w:bookmarkStart w:id="56" w:name="author-contributions"/>
-    <w:p>
-      <w:pPr>
-        <w:pStyle w:val="Heading1"/>
-      </w:pPr>
-      <w:r>
-        <w:t xml:space="preserve">Author Contributions</w:t>
-      </w:r>
-    </w:p>
-    <w:p>
-      <w:pPr>
-        <w:pStyle w:val="FirstParagraph"/>
-      </w:pPr>
-      <w:r>
-        <w:t xml:space="preserve">Conceptualization: A.M.Y., N.U.R. Methodology: A.M.Y., A.Y., D.L., N.U.R. Software: A.M.Y. Formal analysis: A.M.Y. Investigation: A.M.Y. Data curation: A.M.Y., X.L.P. Visualization: A.M.Y. Writing – original draft: A.M.Y., N.U.R. Writing – review and editing: A.M.Y., A.Y., X.L.P., J.J.Y., D.L., N.U.R. Resources (PDAC domain expertise and biological interpretation): X.L.P., J.J.Y. Supervision: N.U.R. Funding acquisition: A.M.Y., N.U.R. All authors reviewed and approved the final manuscript.</w:t>
-      </w:r>
-    </w:p>
-    <w:bookmarkEnd w:id="56"/>
-    <w:bookmarkStart w:id="57" w:name="competing-interests"/>
-    <w:p>
-      <w:pPr>
-        <w:pStyle w:val="Heading1"/>
-      </w:pPr>
-      <w:r>
-        <w:t xml:space="preserve">Competing Interests</w:t>
-      </w:r>
-    </w:p>
-    <w:p>
-      <w:pPr>
-        <w:pStyle w:val="FirstParagraph"/>
-      </w:pPr>
-      <w:r>
-        <w:t xml:space="preserve">N.U.R. and J.J.Y. are named as inventors on US patents US20220127676A1 and US20250066856A1, which relate to pancreatic cancer subtype classification. The PurIST and DeCAF classifiers were used only as published, independently derived comparators: their subtype calls were obtained with the released classifiers and included as fixed covariate annotations, and the adjustment analyses using these calls are objective and reproducible from the deposited code. They are not components of DeSurv. The other authors declare no competing interests.</w:t>
-      </w:r>
-    </w:p>
-    <w:bookmarkEnd w:id="57"/>
-    <w:bookmarkStart w:id="150" w:name="references"/>
-    <w:p>
-      <w:pPr>
-        <w:pStyle w:val="Heading1"/>
-      </w:pPr>
-      <w:r>
-        <w:t xml:space="preserve">References</w:t>
-      </w:r>
-    </w:p>
-    <w:bookmarkStart w:id="149" w:name="refs"/>
-    <w:bookmarkStart w:id="59" w:name="ref-siegel2026cancer"/>
+        <w:t xml:space="preserve">76</w:t>
+      </w:r>
+      <w:r>
+        <w:t xml:space="preserve">, e70043 (2026).</w:t>
+      </w:r>
+    </w:p>
+    <w:bookmarkEnd w:id="60"/>
+    <w:bookmarkStart w:id="62" w:name="ref-collisson2011subtypes"/>
     <w:p>
       <w:pPr>
         <w:pStyle w:val="Bibliography"/>
       </w:pPr>
       <w:r>
-        <w:t xml:space="preserve">1.</w:t>
+        <w:t xml:space="preserve">2.</w:t>
       </w:r>
       <w:r>
         <w:t xml:space="preserve"> </w:t>
@@ -9968,63 +9947,6 @@
         <w:t xml:space="preserve">	</w:t>
       </w:r>
       <w:r>
-        <w:t xml:space="preserve">Siegel, R. L., Kratzer, T. B., Wagle, N. S., Sung, H. &amp; Jemal, A. Cancer statistics, 2026.</w:t>
-      </w:r>
-      <w:r>
-        <w:t xml:space="preserve"> </w:t>
-      </w:r>
-      <w:r>
-        <w:rPr>
-          <w:iCs/>
-          <w:i/>
-        </w:rPr>
-        <w:t xml:space="preserve">CA: A Cancer Journal for Clinicians</w:t>
-      </w:r>
-      <w:r>
-        <w:t xml:space="preserve"> </w:t>
-      </w:r>
-      <w:hyperlink r:id="rId58">
-        <w:r>
-          <w:rPr>
-            <w:rStyle w:val="Hyperlink"/>
-          </w:rPr>
-          <w:t xml:space="preserve">https://doi.org/10.3322/caac.70043</w:t>
-        </w:r>
-      </w:hyperlink>
-      <w:r>
-        <w:t xml:space="preserve"> </w:t>
-      </w:r>
-      <w:r>
-        <w:t xml:space="preserve">(2026) doi:</w:t>
-      </w:r>
-      <w:hyperlink r:id="rId58">
-        <w:r>
-          <w:rPr>
-            <w:rStyle w:val="Hyperlink"/>
-          </w:rPr>
-          <w:t xml:space="preserve">10.3322/caac.70043</w:t>
-        </w:r>
-      </w:hyperlink>
-      <w:r>
-        <w:t xml:space="preserve">.</w:t>
-      </w:r>
-    </w:p>
-    <w:bookmarkEnd w:id="59"/>
-    <w:bookmarkStart w:id="61" w:name="ref-collisson2011subtypes"/>
-    <w:p>
-      <w:pPr>
-        <w:pStyle w:val="Bibliography"/>
-      </w:pPr>
-      <w:r>
-        <w:t xml:space="preserve">2.</w:t>
-      </w:r>
-      <w:r>
-        <w:t xml:space="preserve"> </w:t>
-      </w:r>
-      <w:r>
-        <w:t xml:space="preserve">	</w:t>
-      </w:r>
-      <w:r>
         <w:t xml:space="preserve">Collisson, E. A.</w:t>
       </w:r>
       <w:r>
@@ -10040,7 +9962,7 @@
       <w:r>
         <w:t xml:space="preserve"> </w:t>
       </w:r>
-      <w:hyperlink r:id="rId60">
+      <w:hyperlink r:id="rId61">
         <w:r>
           <w:rPr>
             <w:rStyle w:val="Hyperlink"/>
@@ -10075,8 +9997,8 @@
         <w:t xml:space="preserve">, 500–503 (2011).</w:t>
       </w:r>
     </w:p>
-    <w:bookmarkEnd w:id="61"/>
-    <w:bookmarkStart w:id="63" w:name="ref-moffitt2015virtual"/>
+    <w:bookmarkEnd w:id="62"/>
+    <w:bookmarkStart w:id="64" w:name="ref-moffitt2015virtual"/>
     <w:p>
       <w:pPr>
         <w:pStyle w:val="Bibliography"/>
@@ -10106,7 +10028,7 @@
       <w:r>
         <w:t xml:space="preserve"> </w:t>
       </w:r>
-      <w:hyperlink r:id="rId62">
+      <w:hyperlink r:id="rId63">
         <w:r>
           <w:rPr>
             <w:rStyle w:val="Hyperlink"/>
@@ -10141,8 +10063,8 @@
         <w:t xml:space="preserve">, 1168–1178 (2015).</w:t>
       </w:r>
     </w:p>
-    <w:bookmarkEnd w:id="63"/>
-    <w:bookmarkStart w:id="65" w:name="ref-rashid2020purity"/>
+    <w:bookmarkEnd w:id="64"/>
+    <w:bookmarkStart w:id="66" w:name="ref-rashid2020purity"/>
     <w:p>
       <w:pPr>
         <w:pStyle w:val="Bibliography"/>
@@ -10172,7 +10094,7 @@
       <w:r>
         <w:t xml:space="preserve"> </w:t>
       </w:r>
-      <w:hyperlink r:id="rId64">
+      <w:hyperlink r:id="rId65">
         <w:r>
           <w:rPr>
             <w:rStyle w:val="Hyperlink"/>
@@ -10207,8 +10129,8 @@
         <w:t xml:space="preserve">, 82–92 (2020).</w:t>
       </w:r>
     </w:p>
-    <w:bookmarkEnd w:id="65"/>
-    <w:bookmarkStart w:id="67" w:name="ref-peng2024determination"/>
+    <w:bookmarkEnd w:id="66"/>
+    <w:bookmarkStart w:id="68" w:name="ref-peng2024determination"/>
     <w:p>
       <w:pPr>
         <w:pStyle w:val="Bibliography"/>
@@ -10238,7 +10160,7 @@
       <w:r>
         <w:t xml:space="preserve"> </w:t>
       </w:r>
-      <w:hyperlink r:id="rId66">
+      <w:hyperlink r:id="rId67">
         <w:r>
           <w:rPr>
             <w:rStyle w:val="Hyperlink"/>
@@ -10273,8 +10195,8 @@
         <w:t xml:space="preserve">, 102611 (2026).</w:t>
       </w:r>
     </w:p>
-    <w:bookmarkEnd w:id="67"/>
-    <w:bookmarkStart w:id="69" w:name="ref-moncada2020spatial"/>
+    <w:bookmarkEnd w:id="68"/>
+    <w:bookmarkStart w:id="70" w:name="ref-moncada2020spatial"/>
     <w:p>
       <w:pPr>
         <w:pStyle w:val="Bibliography"/>
@@ -10304,7 +10226,7 @@
       <w:r>
         <w:t xml:space="preserve"> </w:t>
       </w:r>
-      <w:hyperlink r:id="rId68">
+      <w:hyperlink r:id="rId69">
         <w:r>
           <w:rPr>
             <w:rStyle w:val="Hyperlink"/>
@@ -10357,8 +10279,8 @@
         <w:t xml:space="preserve">, 333–342 (2020).</w:t>
       </w:r>
     </w:p>
-    <w:bookmarkEnd w:id="69"/>
-    <w:bookmarkStart w:id="71" w:name="ref-hwang2022single"/>
+    <w:bookmarkEnd w:id="70"/>
+    <w:bookmarkStart w:id="72" w:name="ref-hwang2022single"/>
     <w:p>
       <w:pPr>
         <w:pStyle w:val="Bibliography"/>
@@ -10388,7 +10310,7 @@
       <w:r>
         <w:t xml:space="preserve"> </w:t>
       </w:r>
-      <w:hyperlink r:id="rId70">
+      <w:hyperlink r:id="rId71">
         <w:r>
           <w:rPr>
             <w:rStyle w:val="Hyperlink"/>
@@ -10423,8 +10345,8 @@
         <w:t xml:space="preserve">, 1178–1191 (2022).</w:t>
       </w:r>
     </w:p>
-    <w:bookmarkEnd w:id="71"/>
-    <w:bookmarkStart w:id="73" w:name="ref-werba2023single"/>
+    <w:bookmarkEnd w:id="72"/>
+    <w:bookmarkStart w:id="74" w:name="ref-werba2023single"/>
     <w:p>
       <w:pPr>
         <w:pStyle w:val="Bibliography"/>
@@ -10454,7 +10376,7 @@
       <w:r>
         <w:t xml:space="preserve"> </w:t>
       </w:r>
-      <w:hyperlink r:id="rId72">
+      <w:hyperlink r:id="rId73">
         <w:r>
           <w:rPr>
             <w:rStyle w:val="Hyperlink"/>
@@ -10489,8 +10411,8 @@
         <w:t xml:space="preserve">, 797 (2023).</w:t>
       </w:r>
     </w:p>
-    <w:bookmarkEnd w:id="73"/>
-    <w:bookmarkStart w:id="75" w:name="ref-Bailey2016"/>
+    <w:bookmarkEnd w:id="74"/>
+    <w:bookmarkStart w:id="76" w:name="ref-Bailey2016"/>
     <w:p>
       <w:pPr>
         <w:pStyle w:val="Bibliography"/>
@@ -10520,7 +10442,7 @@
       <w:r>
         <w:t xml:space="preserve"> </w:t>
       </w:r>
-      <w:hyperlink r:id="rId74">
+      <w:hyperlink r:id="rId75">
         <w:r>
           <w:rPr>
             <w:rStyle w:val="Hyperlink"/>
@@ -10555,8 +10477,8 @@
         <w:t xml:space="preserve">, 47–52 (2016).</w:t>
       </w:r>
     </w:p>
-    <w:bookmarkEnd w:id="75"/>
-    <w:bookmarkStart w:id="77" w:name="ref-aung2018compass"/>
+    <w:bookmarkEnd w:id="76"/>
+    <w:bookmarkStart w:id="78" w:name="ref-aung2018compass"/>
     <w:p>
       <w:pPr>
         <w:pStyle w:val="Bibliography"/>
@@ -10586,7 +10508,7 @@
       <w:r>
         <w:t xml:space="preserve"> </w:t>
       </w:r>
-      <w:hyperlink r:id="rId76">
+      <w:hyperlink r:id="rId77">
         <w:r>
           <w:rPr>
             <w:rStyle w:val="Hyperlink"/>
@@ -10621,8 +10543,8 @@
         <w:t xml:space="preserve">, 1344–1354 (2018).</w:t>
       </w:r>
     </w:p>
-    <w:bookmarkEnd w:id="77"/>
-    <w:bookmarkStart w:id="79" w:name="ref-nguyen2024fourteen"/>
+    <w:bookmarkEnd w:id="78"/>
+    <w:bookmarkStart w:id="80" w:name="ref-nguyen2024fourteen"/>
     <w:p>
       <w:pPr>
         <w:pStyle w:val="Bibliography"/>
@@ -10642,7 +10564,7 @@
       <w:r>
         <w:t xml:space="preserve"> </w:t>
       </w:r>
-      <w:hyperlink r:id="rId78">
+      <w:hyperlink r:id="rId79">
         <w:r>
           <w:rPr>
             <w:rStyle w:val="Hyperlink"/>
@@ -10677,8 +10599,8 @@
         <w:t xml:space="preserve">, 4761–4783 (2024).</w:t>
       </w:r>
     </w:p>
-    <w:bookmarkEnd w:id="79"/>
-    <w:bookmarkStart w:id="81" w:name="ref-lee1999learning"/>
+    <w:bookmarkEnd w:id="80"/>
+    <w:bookmarkStart w:id="82" w:name="ref-lee1999learning"/>
     <w:p>
       <w:pPr>
         <w:pStyle w:val="Bibliography"/>
@@ -10698,7 +10620,7 @@
       <w:r>
         <w:t xml:space="preserve"> </w:t>
       </w:r>
-      <w:hyperlink r:id="rId80">
+      <w:hyperlink r:id="rId81">
         <w:r>
           <w:rPr>
             <w:rStyle w:val="Hyperlink"/>
@@ -10733,8 +10655,8 @@
         <w:t xml:space="preserve">, 788–791 (1999).</w:t>
       </w:r>
     </w:p>
-    <w:bookmarkEnd w:id="81"/>
-    <w:bookmarkStart w:id="83" w:name="ref-brunet2004metagenes"/>
+    <w:bookmarkEnd w:id="82"/>
+    <w:bookmarkStart w:id="84" w:name="ref-brunet2004metagenes"/>
     <w:p>
       <w:pPr>
         <w:pStyle w:val="Bibliography"/>
@@ -10754,7 +10676,7 @@
       <w:r>
         <w:t xml:space="preserve"> </w:t>
       </w:r>
-      <w:hyperlink r:id="rId82">
+      <w:hyperlink r:id="rId83">
         <w:r>
           <w:rPr>
             <w:rStyle w:val="Hyperlink"/>
@@ -10789,8 +10711,8 @@
         <w:t xml:space="preserve">, 4164–4169 (2004).</w:t>
       </w:r>
     </w:p>
-    <w:bookmarkEnd w:id="83"/>
-    <w:bookmarkStart w:id="85" w:name="ref-peng2019novo"/>
+    <w:bookmarkEnd w:id="84"/>
+    <w:bookmarkStart w:id="86" w:name="ref-peng2019novo"/>
     <w:p>
       <w:pPr>
         <w:pStyle w:val="Bibliography"/>
@@ -10810,7 +10732,7 @@
       <w:r>
         <w:t xml:space="preserve"> </w:t>
       </w:r>
-      <w:hyperlink r:id="rId84">
+      <w:hyperlink r:id="rId85">
         <w:r>
           <w:rPr>
             <w:rStyle w:val="Hyperlink"/>
@@ -10845,8 +10767,8 @@
         <w:t xml:space="preserve">, 4729 (2019).</w:t>
       </w:r>
     </w:p>
-    <w:bookmarkEnd w:id="85"/>
-    <w:bookmarkStart w:id="87" w:name="ref-bair2004semi"/>
+    <w:bookmarkEnd w:id="86"/>
+    <w:bookmarkStart w:id="88" w:name="ref-bair2004semi"/>
     <w:p>
       <w:pPr>
         <w:pStyle w:val="Bibliography"/>
@@ -10866,7 +10788,7 @@
       <w:r>
         <w:t xml:space="preserve"> </w:t>
       </w:r>
-      <w:hyperlink r:id="rId86">
+      <w:hyperlink r:id="rId87">
         <w:r>
           <w:rPr>
             <w:rStyle w:val="Hyperlink"/>
@@ -10901,8 +10823,8 @@
         <w:t xml:space="preserve">, e108 (2004).</w:t>
       </w:r>
     </w:p>
-    <w:bookmarkEnd w:id="87"/>
-    <w:bookmarkStart w:id="89" w:name="ref-cook2007fisher"/>
+    <w:bookmarkEnd w:id="88"/>
+    <w:bookmarkStart w:id="90" w:name="ref-cook2007fisher"/>
     <w:p>
       <w:pPr>
         <w:pStyle w:val="Bibliography"/>
@@ -10922,7 +10844,7 @@
       <w:r>
         <w:t xml:space="preserve"> </w:t>
       </w:r>
-      <w:hyperlink r:id="rId88">
+      <w:hyperlink r:id="rId89">
         <w:r>
           <w:rPr>
             <w:rStyle w:val="Hyperlink"/>
@@ -10957,8 +10879,8 @@
         <w:t xml:space="preserve">, 1–26 (2007).</w:t>
       </w:r>
     </w:p>
-    <w:bookmarkEnd w:id="89"/>
-    <w:bookmarkStart w:id="91" w:name="ref-torrehealy2023pdacr"/>
+    <w:bookmarkEnd w:id="90"/>
+    <w:bookmarkStart w:id="92" w:name="ref-torrehealy2023pdacr"/>
     <w:p>
       <w:pPr>
         <w:pStyle w:val="Bibliography"/>
@@ -10988,7 +10910,7 @@
       <w:r>
         <w:t xml:space="preserve"> </w:t>
       </w:r>
-      <w:hyperlink r:id="rId90">
+      <w:hyperlink r:id="rId91">
         <w:r>
           <w:rPr>
             <w:rStyle w:val="Hyperlink"/>
@@ -11023,8 +10945,8 @@
         <w:t xml:space="preserve">, 163 (2023).</w:t>
       </w:r>
     </w:p>
-    <w:bookmarkEnd w:id="91"/>
-    <w:bookmarkStart w:id="93" w:name="ref-aran2015systematic"/>
+    <w:bookmarkEnd w:id="92"/>
+    <w:bookmarkStart w:id="94" w:name="ref-aran2015systematic"/>
     <w:p>
       <w:pPr>
         <w:pStyle w:val="Bibliography"/>
@@ -11044,7 +10966,7 @@
       <w:r>
         <w:t xml:space="preserve"> </w:t>
       </w:r>
-      <w:hyperlink r:id="rId92">
+      <w:hyperlink r:id="rId93">
         <w:r>
           <w:rPr>
             <w:rStyle w:val="Hyperlink"/>
@@ -11079,8 +11001,8 @@
         <w:t xml:space="preserve">, 9971 (2015).</w:t>
       </w:r>
     </w:p>
-    <w:bookmarkEnd w:id="93"/>
-    <w:bookmarkStart w:id="94" w:name="ref-donoho2004nmf"/>
+    <w:bookmarkEnd w:id="94"/>
+    <w:bookmarkStart w:id="95" w:name="ref-donoho2004nmf"/>
     <w:p>
       <w:pPr>
         <w:pStyle w:val="Bibliography"/>
@@ -11114,8 +11036,8 @@
         <w:t xml:space="preserve">(eds. Thrun, S., Saul, L. K. &amp; Schölkopf, B.) 1141–1148 (MIT Press, 2004).</w:t>
       </w:r>
     </w:p>
-    <w:bookmarkEnd w:id="94"/>
-    <w:bookmarkStart w:id="96" w:name="ref-laurberg2008uniqueness"/>
+    <w:bookmarkEnd w:id="95"/>
+    <w:bookmarkStart w:id="97" w:name="ref-laurberg2008uniqueness"/>
     <w:p>
       <w:pPr>
         <w:pStyle w:val="Bibliography"/>
@@ -11135,7 +11057,7 @@
       <w:r>
         <w:t xml:space="preserve"> </w:t>
       </w:r>
-      <w:hyperlink r:id="rId95">
+      <w:hyperlink r:id="rId96">
         <w:r>
           <w:rPr>
             <w:rStyle w:val="Hyperlink"/>
@@ -11170,8 +11092,8 @@
         <w:t xml:space="preserve">, 764206 (2008).</w:t>
       </w:r>
     </w:p>
-    <w:bookmarkEnd w:id="96"/>
-    <w:bookmarkStart w:id="97" w:name="ref-gillis2014nmf"/>
+    <w:bookmarkEnd w:id="97"/>
+    <w:bookmarkStart w:id="98" w:name="ref-gillis2014nmf"/>
     <w:p>
       <w:pPr>
         <w:pStyle w:val="Bibliography"/>
@@ -11205,8 +11127,8 @@
         <w:t xml:space="preserve">(eds. Suykens, J. A. K., Signoretto, M. &amp; Argyriou, A.) 257–291 (Chapman; Hall/CRC, 2014).</w:t>
       </w:r>
     </w:p>
-    <w:bookmarkEnd w:id="97"/>
-    <w:bookmarkStart w:id="99" w:name="ref-lautizi2022pancreatic"/>
+    <w:bookmarkEnd w:id="98"/>
+    <w:bookmarkStart w:id="100" w:name="ref-lautizi2022pancreatic"/>
     <w:p>
       <w:pPr>
         <w:pStyle w:val="Bibliography"/>
@@ -11226,7 +11148,7 @@
       <w:r>
         <w:t xml:space="preserve"> </w:t>
       </w:r>
-      <w:hyperlink r:id="rId98">
+      <w:hyperlink r:id="rId99">
         <w:r>
           <w:rPr>
             <w:rStyle w:val="Hyperlink"/>
@@ -11261,8 +11183,8 @@
         <w:t xml:space="preserve">, zcac030 (2022).</w:t>
       </w:r>
     </w:p>
-    <w:bookmarkEnd w:id="99"/>
-    <w:bookmarkStart w:id="101" w:name="ref-simon2011regularization"/>
+    <w:bookmarkEnd w:id="100"/>
+    <w:bookmarkStart w:id="102" w:name="ref-simon2011regularization"/>
     <w:p>
       <w:pPr>
         <w:pStyle w:val="Bibliography"/>
@@ -11282,12 +11204,36 @@
       <w:r>
         <w:t xml:space="preserve"> </w:t>
       </w:r>
-      <w:hyperlink r:id="rId100">
-        <w:r>
-          <w:rPr>
-            <w:rStyle w:val="Hyperlink"/>
-          </w:rPr>
-          <w:t xml:space="preserve">Regularization paths for cox’s proportional hazards model via coordinate descent</w:t>
+      <w:hyperlink r:id="rId101">
+        <w:r>
+          <w:rPr>
+            <w:rStyle w:val="Hyperlink"/>
+          </w:rPr>
+          <w:t xml:space="preserve">Regularization paths for</w:t>
+        </w:r>
+        <w:r>
+          <w:rPr>
+            <w:rStyle w:val="Hyperlink"/>
+          </w:rPr>
+          <w:t xml:space="preserve"> </w:t>
+        </w:r>
+        <w:r>
+          <w:rPr>
+            <w:rStyle w:val="Hyperlink"/>
+          </w:rPr>
+          <w:t xml:space="preserve">Cox’s</w:t>
+        </w:r>
+        <w:r>
+          <w:rPr>
+            <w:rStyle w:val="Hyperlink"/>
+          </w:rPr>
+          <w:t xml:space="preserve"> </w:t>
+        </w:r>
+        <w:r>
+          <w:rPr>
+            <w:rStyle w:val="Hyperlink"/>
+          </w:rPr>
+          <w:t xml:space="preserve">proportional hazards model via coordinate descent</w:t>
         </w:r>
       </w:hyperlink>
       <w:r>
@@ -11317,8 +11263,8 @@
         <w:t xml:space="preserve">, 1–13 (2011).</w:t>
       </w:r>
     </w:p>
-    <w:bookmarkEnd w:id="101"/>
-    <w:bookmarkStart w:id="103" w:name="ref-raphael2017integrated"/>
+    <w:bookmarkEnd w:id="102"/>
+    <w:bookmarkStart w:id="104" w:name="ref-raphael2017integrated"/>
     <w:p>
       <w:pPr>
         <w:pStyle w:val="Bibliography"/>
@@ -11348,7 +11294,7 @@
       <w:r>
         <w:t xml:space="preserve"> </w:t>
       </w:r>
-      <w:hyperlink r:id="rId102">
+      <w:hyperlink r:id="rId103">
         <w:r>
           <w:rPr>
             <w:rStyle w:val="Hyperlink"/>
@@ -11383,8 +11329,8 @@
         <w:t xml:space="preserve">, 185–203 (2017).</w:t>
       </w:r>
     </w:p>
-    <w:bookmarkEnd w:id="103"/>
-    <w:bookmarkStart w:id="105" w:name="ref-cao2021proteogenomic"/>
+    <w:bookmarkEnd w:id="104"/>
+    <w:bookmarkStart w:id="106" w:name="ref-cao2021proteogenomic"/>
     <w:p>
       <w:pPr>
         <w:pStyle w:val="Bibliography"/>
@@ -11414,7 +11360,7 @@
       <w:r>
         <w:t xml:space="preserve"> </w:t>
       </w:r>
-      <w:hyperlink r:id="rId104">
+      <w:hyperlink r:id="rId105">
         <w:r>
           <w:rPr>
             <w:rStyle w:val="Hyperlink"/>
@@ -11449,8 +11395,8 @@
         <w:t xml:space="preserve">, 5031–5052 (2021).</w:t>
       </w:r>
     </w:p>
-    <w:bookmarkEnd w:id="105"/>
-    <w:bookmarkStart w:id="107" w:name="ref-snoek2012practical"/>
+    <w:bookmarkEnd w:id="106"/>
+    <w:bookmarkStart w:id="108" w:name="ref-snoek2012practical"/>
     <w:p>
       <w:pPr>
         <w:pStyle w:val="Bibliography"/>
@@ -11470,7 +11416,7 @@
       <w:r>
         <w:t xml:space="preserve"> </w:t>
       </w:r>
-      <w:hyperlink r:id="rId106">
+      <w:hyperlink r:id="rId107">
         <w:r>
           <w:rPr>
             <w:rStyle w:val="Hyperlink"/>
@@ -11516,8 +11462,8 @@
         <w:t xml:space="preserve">(2012).</w:t>
       </w:r>
     </w:p>
-    <w:bookmarkEnd w:id="107"/>
-    <w:bookmarkStart w:id="109" w:name="ref-shahriari2016taking"/>
+    <w:bookmarkEnd w:id="108"/>
+    <w:bookmarkStart w:id="110" w:name="ref-shahriari2016taking"/>
     <w:p>
       <w:pPr>
         <w:pStyle w:val="Bibliography"/>
@@ -11537,7 +11483,7 @@
       <w:r>
         <w:t xml:space="preserve"> </w:t>
       </w:r>
-      <w:hyperlink r:id="rId108">
+      <w:hyperlink r:id="rId109">
         <w:r>
           <w:rPr>
             <w:rStyle w:val="Hyperlink"/>
@@ -11590,8 +11536,8 @@
         <w:t xml:space="preserve">, 148–175 (2016).</w:t>
       </w:r>
     </w:p>
-    <w:bookmarkEnd w:id="109"/>
-    <w:bookmarkStart w:id="111" w:name="ref-frigyesi2008nmf"/>
+    <w:bookmarkEnd w:id="110"/>
+    <w:bookmarkStart w:id="112" w:name="ref-frigyesi2008nmf"/>
     <w:p>
       <w:pPr>
         <w:pStyle w:val="Bibliography"/>
@@ -11611,7 +11557,7 @@
       <w:r>
         <w:t xml:space="preserve"> </w:t>
       </w:r>
-      <w:hyperlink r:id="rId110">
+      <w:hyperlink r:id="rId111">
         <w:r>
           <w:rPr>
             <w:rStyle w:val="Hyperlink"/>
@@ -11646,8 +11592,8 @@
         <w:t xml:space="preserve">, 275–292 (2008).</w:t>
       </w:r>
     </w:p>
-    <w:bookmarkEnd w:id="111"/>
-    <w:bookmarkStart w:id="113" w:name="ref-leary2023s"/>
+    <w:bookmarkEnd w:id="112"/>
+    <w:bookmarkStart w:id="114" w:name="ref-leary2023s"/>
     <w:p>
       <w:pPr>
         <w:pStyle w:val="Bibliography"/>
@@ -11677,7 +11623,7 @@
       <w:r>
         <w:t xml:space="preserve"> </w:t>
       </w:r>
-      <w:hyperlink r:id="rId112">
+      <w:hyperlink r:id="rId113">
         <w:r>
           <w:rPr>
             <w:rStyle w:val="Hyperlink"/>
@@ -11742,8 +11688,8 @@
         <w:t xml:space="preserve">, btad449 (2023).</w:t>
       </w:r>
     </w:p>
-    <w:bookmarkEnd w:id="113"/>
-    <w:bookmarkStart w:id="115" w:name="ref-Maurer2019"/>
+    <w:bookmarkEnd w:id="114"/>
+    <w:bookmarkStart w:id="116" w:name="ref-Maurer2019"/>
     <w:p>
       <w:pPr>
         <w:pStyle w:val="Bibliography"/>
@@ -11773,7 +11719,7 @@
       <w:r>
         <w:t xml:space="preserve"> </w:t>
       </w:r>
-      <w:hyperlink r:id="rId114">
+      <w:hyperlink r:id="rId115">
         <w:r>
           <w:rPr>
             <w:rStyle w:val="Hyperlink"/>
@@ -11808,8 +11754,8 @@
         <w:t xml:space="preserve">, 1034–1043 (2019).</w:t>
       </w:r>
     </w:p>
-    <w:bookmarkEnd w:id="115"/>
-    <w:bookmarkStart w:id="116" w:name="ref-shapley1953value"/>
+    <w:bookmarkEnd w:id="116"/>
+    <w:bookmarkStart w:id="117" w:name="ref-shapley1953value"/>
     <w:p>
       <w:pPr>
         <w:pStyle w:val="Bibliography"/>
@@ -11843,8 +11789,8 @@
         <w:t xml:space="preserve">(eds. Kuhn, H. W. &amp; Tucker, A. W.) 307–317 (Princeton University Press, 1953).</w:t>
       </w:r>
     </w:p>
-    <w:bookmarkEnd w:id="116"/>
-    <w:bookmarkStart w:id="117" w:name="ref-huang2020low"/>
+    <w:bookmarkEnd w:id="117"/>
+    <w:bookmarkStart w:id="118" w:name="ref-huang2020low"/>
     <w:p>
       <w:pPr>
         <w:pStyle w:val="Bibliography"/>
@@ -11878,8 +11824,8 @@
         <w:t xml:space="preserve">(2020).</w:t>
       </w:r>
     </w:p>
-    <w:bookmarkEnd w:id="117"/>
-    <w:bookmarkStart w:id="118" w:name="ref-le2025survnmf"/>
+    <w:bookmarkEnd w:id="118"/>
+    <w:bookmarkStart w:id="119" w:name="ref-le2025survnmf"/>
     <w:p>
       <w:pPr>
         <w:pStyle w:val="Bibliography"/>
@@ -11926,8 +11872,8 @@
         <w:t xml:space="preserve">(2025).</w:t>
       </w:r>
     </w:p>
-    <w:bookmarkEnd w:id="118"/>
-    <w:bookmarkStart w:id="120" w:name="ref-zaccaria2023surviae"/>
+    <w:bookmarkEnd w:id="119"/>
+    <w:bookmarkStart w:id="121" w:name="ref-zaccaria2023surviae"/>
     <w:p>
       <w:pPr>
         <w:pStyle w:val="Bibliography"/>
@@ -11942,7 +11888,7 @@
         <w:t xml:space="preserve">	</w:t>
       </w:r>
       <w:r>
-        <w:t xml:space="preserve">Zaccaria, G. M., Altini, N., Mezzolla, G.,</w:t>
+        <w:t xml:space="preserve">Zaccaria, G. M.</w:t>
       </w:r>
       <w:r>
         <w:t xml:space="preserve"> </w:t>
@@ -11957,7 +11903,7 @@
       <w:r>
         <w:t xml:space="preserve"> </w:t>
       </w:r>
-      <w:hyperlink r:id="rId119">
+      <w:hyperlink r:id="rId120">
         <w:r>
           <w:rPr>
             <w:rStyle w:val="Hyperlink"/>
@@ -12016,8 +11962,8 @@
         <w:t xml:space="preserve">, 107966 (2024).</w:t>
       </w:r>
     </w:p>
-    <w:bookmarkEnd w:id="120"/>
-    <w:bookmarkStart w:id="122" w:name="ref-meng2022savae"/>
+    <w:bookmarkEnd w:id="121"/>
+    <w:bookmarkStart w:id="123" w:name="ref-meng2022savae"/>
     <w:p>
       <w:pPr>
         <w:pStyle w:val="Bibliography"/>
@@ -12032,7 +11978,7 @@
         <w:t xml:space="preserve">	</w:t>
       </w:r>
       <w:r>
-        <w:t xml:space="preserve">Meng, X., Wang, X., Zhang, X.,</w:t>
+        <w:t xml:space="preserve">Meng, X.</w:t>
       </w:r>
       <w:r>
         <w:t xml:space="preserve"> </w:t>
@@ -12047,7 +11993,7 @@
       <w:r>
         <w:t xml:space="preserve"> </w:t>
       </w:r>
-      <w:hyperlink r:id="rId121">
+      <w:hyperlink r:id="rId122">
         <w:r>
           <w:rPr>
             <w:rStyle w:val="Hyperlink"/>
@@ -12106,8 +12052,8 @@
         <w:t xml:space="preserve">, 1421 (2022).</w:t>
       </w:r>
     </w:p>
-    <w:bookmarkEnd w:id="122"/>
-    <w:bookmarkStart w:id="124" w:name="ref-ogawa2020stroma"/>
+    <w:bookmarkEnd w:id="123"/>
+    <w:bookmarkStart w:id="125" w:name="ref-ogawa2020stroma"/>
     <w:p>
       <w:pPr>
         <w:pStyle w:val="Bibliography"/>
@@ -12122,7 +12068,7 @@
         <w:t xml:space="preserve">	</w:t>
       </w:r>
       <w:r>
-        <w:t xml:space="preserve">Ogawa, Y., Masugi, Y., Abe, T.,</w:t>
+        <w:t xml:space="preserve">Ogawa, Y.</w:t>
       </w:r>
       <w:r>
         <w:t xml:space="preserve"> </w:t>
@@ -12137,7 +12083,7 @@
       <w:r>
         <w:t xml:space="preserve"> </w:t>
       </w:r>
-      <w:hyperlink r:id="rId123">
+      <w:hyperlink r:id="rId124">
         <w:r>
           <w:rPr>
             <w:rStyle w:val="Hyperlink"/>
@@ -12172,8 +12118,8 @@
         <w:t xml:space="preserve">, 107–119 (2021).</w:t>
       </w:r>
     </w:p>
-    <w:bookmarkEnd w:id="124"/>
-    <w:bookmarkStart w:id="126" w:name="ref-neuzillet2022periostin"/>
+    <w:bookmarkEnd w:id="125"/>
+    <w:bookmarkStart w:id="127" w:name="ref-neuzillet2022periostin"/>
     <w:p>
       <w:pPr>
         <w:pStyle w:val="Bibliography"/>
@@ -12188,7 +12134,7 @@
         <w:t xml:space="preserve">	</w:t>
       </w:r>
       <w:r>
-        <w:t xml:space="preserve">Neuzillet, C., Nicolle, R., Raffenne, J.,</w:t>
+        <w:t xml:space="preserve">Neuzillet, C.</w:t>
       </w:r>
       <w:r>
         <w:t xml:space="preserve"> </w:t>
@@ -12203,7 +12149,7 @@
       <w:r>
         <w:t xml:space="preserve"> </w:t>
       </w:r>
-      <w:hyperlink r:id="rId125">
+      <w:hyperlink r:id="rId126">
         <w:r>
           <w:rPr>
             <w:rStyle w:val="Hyperlink"/>
@@ -12238,8 +12184,8 @@
         <w:t xml:space="preserve">, 408–425 (2022).</w:t>
       </w:r>
     </w:p>
-    <w:bookmarkEnd w:id="126"/>
-    <w:bookmarkStart w:id="128" w:name="ref-lee2024tumorcaf"/>
+    <w:bookmarkEnd w:id="127"/>
+    <w:bookmarkStart w:id="129" w:name="ref-lee2024tumorcaf"/>
     <w:p>
       <w:pPr>
         <w:pStyle w:val="Bibliography"/>
@@ -12254,7 +12200,7 @@
         <w:t xml:space="preserve">	</w:t>
       </w:r>
       <w:r>
-        <w:t xml:space="preserve">Lee, J. J., Kearney, J. F., Trembath, H. E.,</w:t>
+        <w:t xml:space="preserve">Lee, J. J.</w:t>
       </w:r>
       <w:r>
         <w:t xml:space="preserve"> </w:t>
@@ -12269,7 +12215,7 @@
       <w:r>
         <w:t xml:space="preserve"> </w:t>
       </w:r>
-      <w:hyperlink r:id="rId127">
+      <w:hyperlink r:id="rId128">
         <w:r>
           <w:rPr>
             <w:rStyle w:val="Hyperlink"/>
@@ -12304,8 +12250,8 @@
         <w:t xml:space="preserve">, 659–666 (2024).</w:t>
       </w:r>
     </w:p>
-    <w:bookmarkEnd w:id="128"/>
-    <w:bookmarkStart w:id="130" w:name="ref-newman2019cibersortx"/>
+    <w:bookmarkEnd w:id="129"/>
+    <w:bookmarkStart w:id="131" w:name="ref-newman2019cibersortx"/>
     <w:p>
       <w:pPr>
         <w:pStyle w:val="Bibliography"/>
@@ -12320,7 +12266,7 @@
         <w:t xml:space="preserve">	</w:t>
       </w:r>
       <w:r>
-        <w:t xml:space="preserve">Newman, A. M., Steen, C. B., Liu, C. L., Gentles, A. J.,</w:t>
+        <w:t xml:space="preserve">Newman, A. M.</w:t>
       </w:r>
       <w:r>
         <w:t xml:space="preserve"> </w:t>
@@ -12335,7 +12281,7 @@
       <w:r>
         <w:t xml:space="preserve"> </w:t>
       </w:r>
-      <w:hyperlink r:id="rId129">
+      <w:hyperlink r:id="rId130">
         <w:r>
           <w:rPr>
             <w:rStyle w:val="Hyperlink"/>
@@ -12370,8 +12316,8 @@
         <w:t xml:space="preserve">, 773–782 (2019).</w:t>
       </w:r>
     </w:p>
-    <w:bookmarkEnd w:id="130"/>
-    <w:bookmarkStart w:id="132" w:name="ref-chu2022bayesprism"/>
+    <w:bookmarkEnd w:id="131"/>
+    <w:bookmarkStart w:id="133" w:name="ref-chu2022bayesprism"/>
     <w:p>
       <w:pPr>
         <w:pStyle w:val="Bibliography"/>
@@ -12391,7 +12337,7 @@
       <w:r>
         <w:t xml:space="preserve"> </w:t>
       </w:r>
-      <w:hyperlink r:id="rId131">
+      <w:hyperlink r:id="rId132">
         <w:r>
           <w:rPr>
             <w:rStyle w:val="Hyperlink"/>
@@ -12498,8 +12444,8 @@
         <w:t xml:space="preserve">, 505–517 (2022).</w:t>
       </w:r>
     </w:p>
-    <w:bookmarkEnd w:id="132"/>
-    <w:bookmarkStart w:id="134" w:name="ref-smith2020standard"/>
+    <w:bookmarkEnd w:id="133"/>
+    <w:bookmarkStart w:id="135" w:name="ref-smith2020standard"/>
     <w:p>
       <w:pPr>
         <w:pStyle w:val="Bibliography"/>
@@ -12514,7 +12460,7 @@
         <w:t xml:space="preserve">	</w:t>
       </w:r>
       <w:r>
-        <w:t xml:space="preserve">Smith, A. M., Walsh, J. R., Long, J.,</w:t>
+        <w:t xml:space="preserve">Smith, A. M.</w:t>
       </w:r>
       <w:r>
         <w:t xml:space="preserve"> </w:t>
@@ -12529,7 +12475,7 @@
       <w:r>
         <w:t xml:space="preserve"> </w:t>
       </w:r>
-      <w:hyperlink r:id="rId133">
+      <w:hyperlink r:id="rId134">
         <w:r>
           <w:rPr>
             <w:rStyle w:val="Hyperlink"/>
@@ -12564,8 +12510,8 @@
         <w:t xml:space="preserve">, 119 (2020).</w:t>
       </w:r>
     </w:p>
-    <w:bookmarkEnd w:id="134"/>
-    <w:bookmarkStart w:id="136" w:name="ref-gaujoux2010flexible"/>
+    <w:bookmarkEnd w:id="135"/>
+    <w:bookmarkStart w:id="137" w:name="ref-gaujoux2010flexible"/>
     <w:p>
       <w:pPr>
         <w:pStyle w:val="Bibliography"/>
@@ -12585,12 +12531,36 @@
       <w:r>
         <w:t xml:space="preserve"> </w:t>
       </w:r>
-      <w:hyperlink r:id="rId135">
-        <w:r>
-          <w:rPr>
-            <w:rStyle w:val="Hyperlink"/>
-          </w:rPr>
-          <w:t xml:space="preserve">A flexible r package for nonnegative matrix factorization</w:t>
+      <w:hyperlink r:id="rId136">
+        <w:r>
+          <w:rPr>
+            <w:rStyle w:val="Hyperlink"/>
+          </w:rPr>
+          <w:t xml:space="preserve">A flexible</w:t>
+        </w:r>
+        <w:r>
+          <w:rPr>
+            <w:rStyle w:val="Hyperlink"/>
+          </w:rPr>
+          <w:t xml:space="preserve"> </w:t>
+        </w:r>
+        <w:r>
+          <w:rPr>
+            <w:rStyle w:val="Hyperlink"/>
+          </w:rPr>
+          <w:t xml:space="preserve">R</w:t>
+        </w:r>
+        <w:r>
+          <w:rPr>
+            <w:rStyle w:val="Hyperlink"/>
+          </w:rPr>
+          <w:t xml:space="preserve"> </w:t>
+        </w:r>
+        <w:r>
+          <w:rPr>
+            <w:rStyle w:val="Hyperlink"/>
+          </w:rPr>
+          <w:t xml:space="preserve">package for nonnegative matrix factorization</w:t>
         </w:r>
       </w:hyperlink>
       <w:r>
@@ -12620,8 +12590,8 @@
         <w:t xml:space="preserve">, 367 (2010).</w:t>
       </w:r>
     </w:p>
-    <w:bookmarkEnd w:id="136"/>
-    <w:bookmarkStart w:id="138" w:name="ref-data_tcga_paad"/>
+    <w:bookmarkEnd w:id="137"/>
+    <w:bookmarkStart w:id="139" w:name="ref-data_tcga_paad"/>
     <w:p>
       <w:pPr>
         <w:pStyle w:val="Bibliography"/>
@@ -12641,7 +12611,7 @@
       <w:r>
         <w:t xml:space="preserve"> </w:t>
       </w:r>
-      <w:hyperlink r:id="rId137">
+      <w:hyperlink r:id="rId138">
         <w:r>
           <w:rPr>
             <w:rStyle w:val="Hyperlink"/>
@@ -12677,8 +12647,8 @@
         <w:t xml:space="preserve">. (2017).</w:t>
       </w:r>
     </w:p>
-    <w:bookmarkEnd w:id="138"/>
-    <w:bookmarkStart w:id="140" w:name="ref-data_cptac3"/>
+    <w:bookmarkEnd w:id="139"/>
+    <w:bookmarkStart w:id="141" w:name="ref-data_cptac3"/>
     <w:p>
       <w:pPr>
         <w:pStyle w:val="Bibliography"/>
@@ -12698,7 +12668,7 @@
       <w:r>
         <w:t xml:space="preserve"> </w:t>
       </w:r>
-      <w:hyperlink r:id="rId139">
+      <w:hyperlink r:id="rId140">
         <w:r>
           <w:rPr>
             <w:rStyle w:val="Hyperlink"/>
@@ -12710,8 +12680,8 @@
         <w:t xml:space="preserve">. (2019).</w:t>
       </w:r>
     </w:p>
-    <w:bookmarkEnd w:id="140"/>
-    <w:bookmarkStart w:id="142" w:name="ref-data_dijk_emtab6830"/>
+    <w:bookmarkEnd w:id="141"/>
+    <w:bookmarkStart w:id="143" w:name="ref-data_dijk_emtab6830"/>
     <w:p>
       <w:pPr>
         <w:pStyle w:val="Bibliography"/>
@@ -12741,7 +12711,7 @@
       <w:r>
         <w:t xml:space="preserve"> </w:t>
       </w:r>
-      <w:hyperlink r:id="rId141">
+      <w:hyperlink r:id="rId142">
         <w:r>
           <w:rPr>
             <w:rStyle w:val="Hyperlink"/>
@@ -12765,8 +12735,8 @@
         <w:t xml:space="preserve">. (2020).</w:t>
       </w:r>
     </w:p>
-    <w:bookmarkEnd w:id="142"/>
-    <w:bookmarkStart w:id="144" w:name="ref-data_puleo_emtab6134"/>
+    <w:bookmarkEnd w:id="143"/>
+    <w:bookmarkStart w:id="145" w:name="ref-data_puleo_emtab6134"/>
     <w:p>
       <w:pPr>
         <w:pStyle w:val="Bibliography"/>
@@ -12796,7 +12766,7 @@
       <w:r>
         <w:t xml:space="preserve"> </w:t>
       </w:r>
-      <w:hyperlink r:id="rId143">
+      <w:hyperlink r:id="rId144">
         <w:r>
           <w:rPr>
             <w:rStyle w:val="Hyperlink"/>
@@ -12820,8 +12790,8 @@
         <w:t xml:space="preserve">. (2018).</w:t>
       </w:r>
     </w:p>
-    <w:bookmarkEnd w:id="144"/>
-    <w:bookmarkStart w:id="146" w:name="ref-data_moffitt_gse71729"/>
+    <w:bookmarkEnd w:id="145"/>
+    <w:bookmarkStart w:id="147" w:name="ref-data_moffitt_gse71729"/>
     <w:p>
       <w:pPr>
         <w:pStyle w:val="Bibliography"/>
@@ -12851,7 +12821,7 @@
       <w:r>
         <w:t xml:space="preserve"> </w:t>
       </w:r>
-      <w:hyperlink r:id="rId145">
+      <w:hyperlink r:id="rId146">
         <w:r>
           <w:rPr>
             <w:rStyle w:val="Hyperlink"/>
@@ -12875,8 +12845,8 @@
         <w:t xml:space="preserve">. (2015).</w:t>
       </w:r>
     </w:p>
-    <w:bookmarkEnd w:id="146"/>
-    <w:bookmarkStart w:id="148" w:name="ref-data_paca_au_egas"/>
+    <w:bookmarkEnd w:id="147"/>
+    <w:bookmarkStart w:id="149" w:name="ref-data_paca_au_egas"/>
     <w:p>
       <w:pPr>
         <w:pStyle w:val="Bibliography"/>
@@ -12896,7 +12866,7 @@
       <w:r>
         <w:t xml:space="preserve"> </w:t>
       </w:r>
-      <w:hyperlink r:id="rId147">
+      <w:hyperlink r:id="rId148">
         <w:r>
           <w:rPr>
             <w:rStyle w:val="Hyperlink"/>
@@ -12908,9 +12878,9 @@
         <w:t xml:space="preserve">. (2016).</w:t>
       </w:r>
     </w:p>
-    <w:bookmarkEnd w:id="148"/>
     <w:bookmarkEnd w:id="149"/>
     <w:bookmarkEnd w:id="150"/>
+    <w:bookmarkEnd w:id="151"/>
     <w:sectPr/>
   </w:body>
 </w:document>

</xml_diff>